<commit_message>
chore(cv): refresh AI/M/B CVs to post-defense V2
Replace Apr 5 "Ph.D. Candidate" CVs (docx+pdf) with May 11-12 V2
versions reflecting defended Ph.D. status. Closes the credibility
gap flagged in the 2026-04-27 audit.

Co-Authored-By: Claude Opus 4.7 (1M context) <noreply@anthropic.com>
</commit_message>
<xml_diff>
--- a/public/cv/Alban_CV_M.docx
+++ b/public/cv/Alban_CV_M.docx
@@ -5,54 +5,113 @@
     <w:p>
       <w:pPr>
         <w:widowControl w:val="0"/>
-        <w:spacing w:line="240" w:lineRule="auto"/>
+        <w:spacing w:after="40" w:line="240" w:lineRule="auto"/>
         <w:jc w:val="center"/>
         <w:rPr>
           <w:rFonts w:ascii="Calibri" w:eastAsia="DengXian" w:hAnsi="Calibri" w:cs="Calibri"/>
           <w:b/>
-          <w:kern w:val="2"/>
-          <w:sz w:val="28"/>
-          <w:szCs w:val="28"/>
-        </w:rPr>
-      </w:pPr>
-      <w:r>
-        <w:rPr>
-          <w:rFonts w:ascii="Calibri" w:eastAsia="DengXian" w:hAnsi="Calibri" w:cs="Calibri"/>
-          <w:b/>
-          <w:kern w:val="2"/>
-          <w:sz w:val="28"/>
-          <w:szCs w:val="28"/>
-        </w:rPr>
-        <w:t>Zeyu (Alban) LI</w:t>
+          <w:color w:val="1A3A5C"/>
+          <w:kern w:val="2"/>
+          <w:sz w:val="38"/>
+          <w:szCs w:val="38"/>
+        </w:rPr>
+      </w:pPr>
+      <w:r>
+        <w:rPr>
+          <w:rFonts w:ascii="Calibri" w:eastAsia="DengXian" w:hAnsi="Calibri" w:cs="Calibri"/>
+          <w:b/>
+          <w:color w:val="1A3A5C"/>
+          <w:kern w:val="2"/>
+          <w:sz w:val="38"/>
+          <w:szCs w:val="38"/>
+        </w:rPr>
+        <w:t>ZEYU (ALBAN) LI, Ph.D.</w:t>
       </w:r>
     </w:p>
     <w:p>
       <w:pPr>
         <w:spacing w:after="0"/>
         <w:jc w:val="center"/>
-      </w:pPr>
-      <w:r>
-        <w:rPr>
-          <w:rFonts w:ascii="Calibri" w:eastAsia="DengXian" w:hAnsi="Calibri" w:cs="Calibri"/>
-          <w:kern w:val="2"/>
-          <w:sz w:val="20"/>
-          <w:szCs w:val="20"/>
-        </w:rPr>
-        <w:t>Materials Scientist  |  Polymers &amp; Hydrogels  |  626-826-5327  |  zl788@cornell.edu  |  zeyuli.net  |  Available May 2026</w:t>
-      </w:r>
+        <w:rPr>
+          <w:rFonts w:ascii="Calibri" w:hAnsi="Calibri" w:cs="Calibri"/>
+        </w:rPr>
+      </w:pPr>
+      <w:r>
+        <w:rPr>
+          <w:rFonts w:ascii="Calibri" w:hAnsi="Calibri" w:cs="Calibri"/>
+          <w:spacing w:val="-10"/>
+          <w:sz w:val="20"/>
+          <w:szCs w:val="20"/>
+        </w:rPr>
+        <w:t xml:space="preserve">Materials Scientist | Polymers &amp; Hydrogels | Ithaca, NY | 626-826-5327 | </w:t>
+      </w:r>
+      <w:hyperlink r:id="rId8" w:history="1">
+        <w:r>
+          <w:rPr>
+            <w:rStyle w:val="Hyperlink"/>
+            <w:rFonts w:ascii="Calibri" w:hAnsi="Calibri" w:cs="Calibri"/>
+            <w:spacing w:val="-10"/>
+            <w:sz w:val="20"/>
+            <w:szCs w:val="20"/>
+          </w:rPr>
+          <w:t>zl788@cornell.edu</w:t>
+        </w:r>
+      </w:hyperlink>
+      <w:r>
+        <w:rPr>
+          <w:rFonts w:ascii="Calibri" w:hAnsi="Calibri" w:cs="Calibri"/>
+          <w:spacing w:val="-10"/>
+          <w:sz w:val="20"/>
+          <w:szCs w:val="20"/>
+        </w:rPr>
+        <w:t xml:space="preserve"> | </w:t>
+      </w:r>
+      <w:hyperlink r:id="rId9" w:history="1">
+        <w:r>
+          <w:rPr>
+            <w:rStyle w:val="Hyperlink"/>
+            <w:rFonts w:ascii="Calibri" w:hAnsi="Calibri" w:cs="Calibri"/>
+            <w:spacing w:val="-10"/>
+            <w:sz w:val="20"/>
+            <w:szCs w:val="20"/>
+          </w:rPr>
+          <w:t>zeyuli.net</w:t>
+        </w:r>
+      </w:hyperlink>
+      <w:r>
+        <w:rPr>
+          <w:rFonts w:ascii="Calibri" w:hAnsi="Calibri" w:cs="Calibri"/>
+          <w:spacing w:val="-10"/>
+          <w:sz w:val="20"/>
+          <w:szCs w:val="20"/>
+        </w:rPr>
+        <w:t xml:space="preserve"> | </w:t>
+      </w:r>
+      <w:hyperlink r:id="rId10" w:history="1">
+        <w:r>
+          <w:rPr>
+            <w:rStyle w:val="Hyperlink"/>
+            <w:rFonts w:ascii="Calibri" w:hAnsi="Calibri" w:cs="Calibri"/>
+            <w:spacing w:val="-10"/>
+            <w:sz w:val="20"/>
+            <w:szCs w:val="20"/>
+          </w:rPr>
+          <w:t>linkedin.com/in/albanli</w:t>
+        </w:r>
+      </w:hyperlink>
     </w:p>
     <w:p>
       <w:pPr>
         <w:widowControl w:val="0"/>
-        <w:spacing w:before="240" w:after="80" w:line="300" w:lineRule="auto"/>
-        <w:jc w:val="both"/>
-        <w:rPr>
-          <w:rFonts w:ascii="Calibri" w:eastAsia="DengXian" w:hAnsi="Calibri" w:cs="Calibri"/>
-          <w:kern w:val="2"/>
-          <w:sz w:val="21"/>
-          <w:szCs w:val="21"/>
-        </w:rPr>
-      </w:pPr>
+        <w:spacing w:before="120" w:after="40" w:line="276" w:lineRule="auto"/>
+        <w:rPr>
+          <w:rFonts w:ascii="Calibri" w:eastAsia="DengXian" w:hAnsi="Calibri" w:cs="Calibri"/>
+          <w:kern w:val="2"/>
+          <w:sz w:val="21"/>
+          <w:szCs w:val="21"/>
+        </w:rPr>
+      </w:pPr>
+      <w:bookmarkStart w:id="0" w:name="OLE_LINK46"/>
       <w:r>
         <w:rPr>
           <w:rFonts w:ascii="Calibri" w:eastAsia="DengXian" w:hAnsi="Calibri" w:cs="Calibri"/>
@@ -71,490 +130,978 @@
           <w:sz w:val="21"/>
           <w:szCs w:val="21"/>
         </w:rPr>
-        <w:t xml:space="preserve"> specializing in polymer and biopolymer systems--hydrogel formulation, microparticle encapsulation, and functional surface engineering. Expertise in processing-structure-property relationships across diverse crosslinking chemistries, with full-cycle R&amp;D from formulation and fabrication through characterization (rheometry, SEM, tensile testing) to field-scale validation. Developed a PEG hydrogel composite with 100-day stability (Nature under review), PLGA microparticle tracers deployed across 11 km2 for DoD (first-author, ES&amp;T), and durable perfluoropolymer superhydrophobic surfaces (The Innovation IF 33.2). Co-authored four publications and co-invented two patents.</w:t>
+        <w:t xml:space="preserve"> with full-cycle R&amp;D experience in polymer formulation, hydrogel crosslinking, microparticle fabrication, and functional surface engineering. Research spans biodegradable polymeric microparticles, hydrogel composites for continuous biomanufacturing, tunable biopolymer hydrogel networks, and ultradurable superhydrophobic surfaces.</w:t>
+      </w:r>
+      <w:r>
+        <w:t xml:space="preserve"> </w:t>
+      </w:r>
+      <w:r>
+        <w:rPr>
+          <w:rFonts w:ascii="Calibri" w:eastAsia="DengXian" w:hAnsi="Calibri" w:cs="Calibri"/>
+          <w:kern w:val="2"/>
+          <w:sz w:val="21"/>
+          <w:szCs w:val="21"/>
+        </w:rPr>
+        <w:t>Integrates computational and AI-assisted workflows into materials research.</w:t>
+      </w:r>
+      <w:r>
+        <w:rPr>
+          <w:rFonts w:ascii="Calibri" w:eastAsia="DengXian" w:hAnsi="Calibri" w:cs="Calibri"/>
+          <w:kern w:val="2"/>
+          <w:sz w:val="21"/>
+          <w:szCs w:val="21"/>
+        </w:rPr>
+        <w:t xml:space="preserve"> </w:t>
+      </w:r>
+      <w:r>
+        <w:rPr>
+          <w:rFonts w:ascii="Calibri" w:eastAsia="DengXian" w:hAnsi="Calibri" w:cs="Calibri"/>
+          <w:kern w:val="2"/>
+          <w:sz w:val="21"/>
+          <w:szCs w:val="21"/>
+        </w:rPr>
+        <w:t>Six peer-reviewed publications, two patents.</w:t>
+      </w:r>
+    </w:p>
+    <w:bookmarkEnd w:id="0"/>
+    <w:p>
+      <w:pPr>
+        <w:widowControl w:val="0"/>
+        <w:pBdr>
+          <w:bottom w:val="single" w:sz="6" w:space="2" w:color="1A3A5C"/>
+        </w:pBdr>
+        <w:spacing w:before="120" w:after="40" w:line="240" w:lineRule="auto"/>
+        <w:rPr>
+          <w:rFonts w:ascii="Calibri" w:eastAsia="Calibri" w:hAnsi="Calibri" w:cs="Calibri"/>
+          <w:b/>
+          <w:bCs/>
+          <w:color w:val="1A3A5C"/>
+          <w:sz w:val="22"/>
+          <w:szCs w:val="22"/>
+        </w:rPr>
+      </w:pPr>
+      <w:r>
+        <w:rPr>
+          <w:rFonts w:ascii="Calibri" w:eastAsia="Calibri" w:hAnsi="Calibri" w:cs="Calibri"/>
+          <w:b/>
+          <w:bCs/>
+          <w:color w:val="1A3A5C"/>
+          <w:sz w:val="22"/>
+          <w:szCs w:val="22"/>
+        </w:rPr>
+        <w:t>SKILLS</w:t>
       </w:r>
     </w:p>
     <w:p>
       <w:pPr>
+        <w:spacing w:after="60" w:line="240" w:lineRule="auto"/>
+        <w:rPr>
+          <w:rFonts w:ascii="Calibri" w:eastAsia="DengXian" w:hAnsi="Calibri" w:cs="Calibri"/>
+          <w:iCs/>
+          <w:kern w:val="2"/>
+          <w:sz w:val="21"/>
+          <w:szCs w:val="21"/>
+        </w:rPr>
+      </w:pPr>
+      <w:bookmarkStart w:id="1" w:name="OLE_LINK36"/>
+      <w:r>
+        <w:rPr>
+          <w:rFonts w:ascii="Calibri" w:eastAsia="DengXian" w:hAnsi="Calibri" w:cs="Calibri"/>
+          <w:b/>
+          <w:bCs/>
+          <w:iCs/>
+          <w:kern w:val="2"/>
+          <w:sz w:val="21"/>
+          <w:szCs w:val="21"/>
+        </w:rPr>
+        <w:t xml:space="preserve">Materials </w:t>
+      </w:r>
+      <w:r>
+        <w:rPr>
+          <w:rFonts w:ascii="Calibri" w:eastAsia="DengXian" w:hAnsi="Calibri" w:cs="Calibri"/>
+          <w:b/>
+          <w:bCs/>
+          <w:iCs/>
+          <w:kern w:val="2"/>
+          <w:sz w:val="21"/>
+          <w:szCs w:val="21"/>
+        </w:rPr>
+        <w:t>Fabrication &amp; Processing:</w:t>
+      </w:r>
+      <w:r>
+        <w:rPr>
+          <w:rFonts w:ascii="Calibri" w:eastAsia="DengXian" w:hAnsi="Calibri" w:cs="Calibri"/>
+          <w:iCs/>
+          <w:kern w:val="2"/>
+          <w:sz w:val="21"/>
+          <w:szCs w:val="21"/>
+        </w:rPr>
+        <w:t xml:space="preserve"> 3D printing (DIW, SLA, FDM); </w:t>
+      </w:r>
+      <w:r>
+        <w:rPr>
+          <w:rFonts w:ascii="Calibri" w:eastAsia="DengXian" w:hAnsi="Calibri" w:cs="Calibri"/>
+          <w:iCs/>
+          <w:kern w:val="2"/>
+          <w:sz w:val="21"/>
+          <w:szCs w:val="21"/>
+        </w:rPr>
+        <w:t xml:space="preserve">Electrospinning; </w:t>
+      </w:r>
+      <w:r>
+        <w:rPr>
+          <w:rFonts w:ascii="Calibri" w:eastAsia="DengXian" w:hAnsi="Calibri" w:cs="Calibri"/>
+          <w:iCs/>
+          <w:kern w:val="2"/>
+          <w:sz w:val="21"/>
+          <w:szCs w:val="21"/>
+        </w:rPr>
+        <w:t>Thermal imprinting; Double-emulsion microencapsulation; Hydrogel formulation; UV photocrosslinking; Spin coating; Mold casting; Photolithography; Two-photon lithography; Etching; Nanopatterning; Freeze-drying; Roll-to-roll processing</w:t>
+      </w:r>
+      <w:r>
+        <w:rPr>
+          <w:rFonts w:ascii="Calibri" w:eastAsia="DengXian" w:hAnsi="Calibri" w:cs="Calibri"/>
+          <w:iCs/>
+          <w:kern w:val="2"/>
+          <w:sz w:val="21"/>
+          <w:szCs w:val="21"/>
+        </w:rPr>
+        <w:t>;</w:t>
+      </w:r>
+      <w:r>
+        <w:t xml:space="preserve"> </w:t>
+      </w:r>
+      <w:r>
+        <w:rPr>
+          <w:rFonts w:ascii="Calibri" w:eastAsia="DengXian" w:hAnsi="Calibri" w:cs="Calibri"/>
+          <w:iCs/>
+          <w:kern w:val="2"/>
+          <w:sz w:val="21"/>
+          <w:szCs w:val="21"/>
+        </w:rPr>
+        <w:t>Surface functionalization</w:t>
+      </w:r>
+      <w:r>
+        <w:rPr>
+          <w:rFonts w:ascii="Calibri" w:eastAsia="DengXian" w:hAnsi="Calibri" w:cs="Calibri"/>
+          <w:iCs/>
+          <w:kern w:val="2"/>
+          <w:sz w:val="21"/>
+          <w:szCs w:val="21"/>
+        </w:rPr>
+        <w:t>.</w:t>
+      </w:r>
+    </w:p>
+    <w:p>
+      <w:pPr>
+        <w:spacing w:after="60" w:line="240" w:lineRule="auto"/>
+        <w:rPr>
+          <w:rFonts w:ascii="Calibri" w:eastAsia="DengXian" w:hAnsi="Calibri" w:cs="Calibri"/>
+          <w:iCs/>
+          <w:kern w:val="2"/>
+          <w:sz w:val="21"/>
+          <w:szCs w:val="21"/>
+        </w:rPr>
+      </w:pPr>
+      <w:r>
+        <w:rPr>
+          <w:rFonts w:ascii="Calibri" w:eastAsia="DengXian" w:hAnsi="Calibri" w:cs="Calibri"/>
+          <w:b/>
+          <w:bCs/>
+          <w:iCs/>
+          <w:kern w:val="2"/>
+          <w:sz w:val="21"/>
+          <w:szCs w:val="21"/>
+        </w:rPr>
+        <w:t>Materials Characterization:</w:t>
+      </w:r>
+      <w:r>
+        <w:rPr>
+          <w:rFonts w:ascii="Calibri" w:eastAsia="DengXian" w:hAnsi="Calibri" w:cs="Calibri"/>
+          <w:iCs/>
+          <w:kern w:val="2"/>
+          <w:sz w:val="21"/>
+          <w:szCs w:val="21"/>
+        </w:rPr>
+        <w:t xml:space="preserve"> </w:t>
+      </w:r>
+      <w:r>
+        <w:rPr>
+          <w:rFonts w:ascii="Calibri" w:eastAsia="DengXian" w:hAnsi="Calibri" w:cs="Calibri"/>
+          <w:iCs/>
+          <w:kern w:val="2"/>
+          <w:sz w:val="21"/>
+          <w:szCs w:val="21"/>
+        </w:rPr>
+        <w:t xml:space="preserve">SEM; DLS; EDS; </w:t>
+      </w:r>
+      <w:r>
+        <w:rPr>
+          <w:rFonts w:ascii="Calibri" w:eastAsia="DengXian" w:hAnsi="Calibri" w:cs="Calibri"/>
+          <w:iCs/>
+          <w:kern w:val="2"/>
+          <w:sz w:val="21"/>
+          <w:szCs w:val="21"/>
+        </w:rPr>
+        <w:t>TGA</w:t>
+      </w:r>
+      <w:r>
+        <w:rPr>
+          <w:rFonts w:ascii="Calibri" w:eastAsia="DengXian" w:hAnsi="Calibri" w:cs="Calibri"/>
+          <w:iCs/>
+          <w:kern w:val="2"/>
+          <w:sz w:val="21"/>
+          <w:szCs w:val="21"/>
+        </w:rPr>
+        <w:t xml:space="preserve">; </w:t>
+      </w:r>
+      <w:r>
+        <w:rPr>
+          <w:rFonts w:ascii="Calibri" w:eastAsia="DengXian" w:hAnsi="Calibri" w:cs="Calibri"/>
+          <w:iCs/>
+          <w:kern w:val="2"/>
+          <w:sz w:val="21"/>
+          <w:szCs w:val="21"/>
+        </w:rPr>
+        <w:t>DMA</w:t>
+      </w:r>
+      <w:r>
+        <w:rPr>
+          <w:rFonts w:ascii="Calibri" w:eastAsia="DengXian" w:hAnsi="Calibri" w:cs="Calibri"/>
+          <w:iCs/>
+          <w:kern w:val="2"/>
+          <w:sz w:val="21"/>
+          <w:szCs w:val="21"/>
+        </w:rPr>
+        <w:t xml:space="preserve">; Optical </w:t>
+      </w:r>
+      <w:r>
+        <w:rPr>
+          <w:rFonts w:ascii="Calibri" w:eastAsia="DengXian" w:hAnsi="Calibri" w:cs="Calibri"/>
+          <w:iCs/>
+          <w:kern w:val="2"/>
+          <w:sz w:val="21"/>
+          <w:szCs w:val="21"/>
+        </w:rPr>
+        <w:t>m</w:t>
+      </w:r>
+      <w:r>
+        <w:rPr>
+          <w:rFonts w:ascii="Calibri" w:eastAsia="DengXian" w:hAnsi="Calibri" w:cs="Calibri"/>
+          <w:iCs/>
+          <w:kern w:val="2"/>
+          <w:sz w:val="21"/>
+          <w:szCs w:val="21"/>
+        </w:rPr>
+        <w:t xml:space="preserve">icroscopy; UV-Vis spectroscopy; Fluorescence </w:t>
+      </w:r>
+      <w:r>
+        <w:rPr>
+          <w:rFonts w:ascii="Calibri" w:eastAsia="DengXian" w:hAnsi="Calibri" w:cs="Calibri"/>
+          <w:iCs/>
+          <w:kern w:val="2"/>
+          <w:sz w:val="21"/>
+          <w:szCs w:val="21"/>
+        </w:rPr>
+        <w:t>spectroscopy</w:t>
+      </w:r>
+      <w:r>
+        <w:rPr>
+          <w:rFonts w:ascii="Calibri" w:eastAsia="DengXian" w:hAnsi="Calibri" w:cs="Calibri"/>
+          <w:iCs/>
+          <w:kern w:val="2"/>
+          <w:sz w:val="21"/>
+          <w:szCs w:val="21"/>
+        </w:rPr>
+        <w:t>;</w:t>
+      </w:r>
+      <w:r>
+        <w:rPr>
+          <w:rFonts w:ascii="Calibri" w:eastAsia="DengXian" w:hAnsi="Calibri" w:cs="Calibri"/>
+          <w:iCs/>
+          <w:kern w:val="2"/>
+          <w:sz w:val="21"/>
+          <w:szCs w:val="21"/>
+        </w:rPr>
+        <w:t xml:space="preserve"> </w:t>
+      </w:r>
+      <w:r>
+        <w:rPr>
+          <w:rFonts w:ascii="Calibri" w:eastAsia="DengXian" w:hAnsi="Calibri" w:cs="Calibri"/>
+          <w:iCs/>
+          <w:kern w:val="2"/>
+          <w:sz w:val="21"/>
+          <w:szCs w:val="21"/>
+        </w:rPr>
+        <w:t xml:space="preserve">Fluorescence </w:t>
+      </w:r>
+      <w:r>
+        <w:rPr>
+          <w:rFonts w:ascii="Calibri" w:eastAsia="DengXian" w:hAnsi="Calibri" w:cs="Calibri"/>
+          <w:iCs/>
+          <w:kern w:val="2"/>
+          <w:sz w:val="21"/>
+          <w:szCs w:val="21"/>
+        </w:rPr>
+        <w:t>microscopy; Rheometry; Tensile testing; Contact-angle measurement.</w:t>
+      </w:r>
+    </w:p>
+    <w:bookmarkEnd w:id="1"/>
+    <w:p>
+      <w:pPr>
+        <w:spacing w:after="60" w:line="240" w:lineRule="auto"/>
+        <w:rPr>
+          <w:rFonts w:ascii="Calibri" w:eastAsia="DengXian" w:hAnsi="Calibri" w:cs="Calibri"/>
+          <w:iCs/>
+          <w:kern w:val="2"/>
+          <w:sz w:val="21"/>
+          <w:szCs w:val="21"/>
+        </w:rPr>
+      </w:pPr>
+      <w:r>
+        <w:rPr>
+          <w:rFonts w:ascii="Calibri" w:eastAsia="DengXian" w:hAnsi="Calibri" w:cs="Calibri"/>
+          <w:b/>
+          <w:bCs/>
+          <w:iCs/>
+          <w:kern w:val="2"/>
+          <w:sz w:val="21"/>
+          <w:szCs w:val="21"/>
+        </w:rPr>
+        <w:t>Programming &amp; Data/Modeling:</w:t>
+      </w:r>
+      <w:r>
+        <w:rPr>
+          <w:rFonts w:ascii="Calibri" w:eastAsia="DengXian" w:hAnsi="Calibri" w:cs="Calibri"/>
+          <w:iCs/>
+          <w:kern w:val="2"/>
+          <w:sz w:val="21"/>
+          <w:szCs w:val="21"/>
+        </w:rPr>
+        <w:t xml:space="preserve"> Python; Data analysis &amp; visualization (pandas, NumPy, seaborn); </w:t>
+      </w:r>
+      <w:r>
+        <w:rPr>
+          <w:rFonts w:ascii="Calibri" w:eastAsia="DengXian" w:hAnsi="Calibri" w:cs="Calibri"/>
+          <w:iCs/>
+          <w:kern w:val="2"/>
+          <w:sz w:val="21"/>
+          <w:szCs w:val="21"/>
+        </w:rPr>
+        <w:t>statistical DOE</w:t>
+      </w:r>
+      <w:r>
+        <w:rPr>
+          <w:rFonts w:ascii="Calibri" w:eastAsia="DengXian" w:hAnsi="Calibri" w:cs="Calibri"/>
+          <w:iCs/>
+          <w:kern w:val="2"/>
+          <w:sz w:val="21"/>
+          <w:szCs w:val="21"/>
+        </w:rPr>
+        <w:t xml:space="preserve">, </w:t>
+      </w:r>
+      <w:r>
+        <w:rPr>
+          <w:rFonts w:ascii="Calibri" w:eastAsia="DengXian" w:hAnsi="Calibri" w:cs="Calibri"/>
+          <w:iCs/>
+          <w:kern w:val="2"/>
+          <w:sz w:val="21"/>
+          <w:szCs w:val="21"/>
+        </w:rPr>
+        <w:t>Machine learning (TensorFlow, PyTorch); Java</w:t>
+      </w:r>
+      <w:r>
+        <w:rPr>
+          <w:rFonts w:ascii="Calibri" w:eastAsia="DengXian" w:hAnsi="Calibri" w:cs="Calibri"/>
+          <w:iCs/>
+          <w:kern w:val="2"/>
+          <w:sz w:val="21"/>
+          <w:szCs w:val="21"/>
+        </w:rPr>
+        <w:t xml:space="preserve">, </w:t>
+      </w:r>
+      <w:r>
+        <w:rPr>
+          <w:rFonts w:ascii="Calibri" w:eastAsia="DengXian" w:hAnsi="Calibri" w:cs="Calibri"/>
+          <w:iCs/>
+          <w:kern w:val="2"/>
+          <w:sz w:val="21"/>
+          <w:szCs w:val="21"/>
+        </w:rPr>
+        <w:t>ImageJ</w:t>
+      </w:r>
+      <w:r>
+        <w:rPr>
+          <w:rFonts w:ascii="Calibri" w:eastAsia="DengXian" w:hAnsi="Calibri" w:cs="Calibri"/>
+          <w:iCs/>
+          <w:kern w:val="2"/>
+          <w:sz w:val="21"/>
+          <w:szCs w:val="21"/>
+        </w:rPr>
+        <w:t xml:space="preserve">; </w:t>
+      </w:r>
+      <w:r>
+        <w:rPr>
+          <w:rFonts w:ascii="Calibri" w:eastAsia="DengXian" w:hAnsi="Calibri" w:cs="Calibri"/>
+          <w:iCs/>
+          <w:kern w:val="2"/>
+          <w:sz w:val="21"/>
+          <w:szCs w:val="21"/>
+        </w:rPr>
+        <w:t>Git/GitHub</w:t>
+      </w:r>
+      <w:r>
+        <w:rPr>
+          <w:rFonts w:ascii="Calibri" w:eastAsia="DengXian" w:hAnsi="Calibri" w:cs="Calibri"/>
+          <w:iCs/>
+          <w:kern w:val="2"/>
+          <w:sz w:val="21"/>
+          <w:szCs w:val="21"/>
+        </w:rPr>
+        <w:t>;</w:t>
+      </w:r>
+      <w:r>
+        <w:rPr>
+          <w:rFonts w:ascii="Calibri" w:eastAsia="DengXian" w:hAnsi="Calibri" w:cs="Calibri"/>
+          <w:iCs/>
+          <w:kern w:val="2"/>
+          <w:sz w:val="21"/>
+          <w:szCs w:val="21"/>
+        </w:rPr>
+        <w:t xml:space="preserve"> AI tools (computational workflows, LLM-assisted data analysis</w:t>
+      </w:r>
+      <w:r>
+        <w:rPr>
+          <w:rFonts w:ascii="Calibri" w:eastAsia="DengXian" w:hAnsi="Calibri" w:cs="Calibri"/>
+          <w:iCs/>
+          <w:kern w:val="2"/>
+          <w:sz w:val="21"/>
+          <w:szCs w:val="21"/>
+        </w:rPr>
+        <w:t xml:space="preserve">, </w:t>
+      </w:r>
+      <w:r>
+        <w:rPr>
+          <w:rFonts w:ascii="Calibri" w:eastAsia="DengXian" w:hAnsi="Calibri" w:cs="Calibri"/>
+          <w:iCs/>
+          <w:kern w:val="2"/>
+          <w:sz w:val="21"/>
+          <w:szCs w:val="21"/>
+        </w:rPr>
+        <w:t>LLM-assisted research workflows</w:t>
+      </w:r>
+      <w:r>
+        <w:rPr>
+          <w:rFonts w:ascii="Calibri" w:eastAsia="DengXian" w:hAnsi="Calibri" w:cs="Calibri"/>
+          <w:iCs/>
+          <w:kern w:val="2"/>
+          <w:sz w:val="21"/>
+          <w:szCs w:val="21"/>
+        </w:rPr>
+        <w:t xml:space="preserve">, </w:t>
+      </w:r>
+      <w:r>
+        <w:rPr>
+          <w:rFonts w:ascii="Calibri" w:eastAsia="DengXian" w:hAnsi="Calibri" w:cs="Calibri"/>
+          <w:iCs/>
+          <w:kern w:val="2"/>
+          <w:sz w:val="21"/>
+          <w:szCs w:val="21"/>
+        </w:rPr>
+        <w:t>AI agent development</w:t>
+      </w:r>
+      <w:r>
+        <w:rPr>
+          <w:rFonts w:ascii="Calibri" w:eastAsia="DengXian" w:hAnsi="Calibri" w:cs="Calibri"/>
+          <w:iCs/>
+          <w:kern w:val="2"/>
+          <w:sz w:val="21"/>
+          <w:szCs w:val="21"/>
+        </w:rPr>
+        <w:t>)</w:t>
+      </w:r>
+      <w:r>
+        <w:rPr>
+          <w:rFonts w:ascii="Calibri" w:eastAsia="DengXian" w:hAnsi="Calibri" w:cs="Calibri"/>
+          <w:iCs/>
+          <w:kern w:val="2"/>
+          <w:sz w:val="21"/>
+          <w:szCs w:val="21"/>
+        </w:rPr>
+        <w:t>.</w:t>
+      </w:r>
+    </w:p>
+    <w:p>
+      <w:pPr>
+        <w:spacing w:after="60" w:line="240" w:lineRule="auto"/>
+        <w:rPr>
+          <w:rFonts w:ascii="Calibri" w:eastAsia="DengXian" w:hAnsi="Calibri" w:cs="Calibri"/>
+          <w:iCs/>
+          <w:kern w:val="2"/>
+          <w:sz w:val="21"/>
+          <w:szCs w:val="21"/>
+        </w:rPr>
+      </w:pPr>
+      <w:r>
+        <w:rPr>
+          <w:rFonts w:ascii="Calibri" w:eastAsia="DengXian" w:hAnsi="Calibri" w:cs="Calibri"/>
+          <w:b/>
+          <w:bCs/>
+          <w:iCs/>
+          <w:kern w:val="2"/>
+          <w:sz w:val="21"/>
+          <w:szCs w:val="21"/>
+        </w:rPr>
+        <w:t>2D/3D Design &amp; Visualization:</w:t>
+      </w:r>
+      <w:r>
+        <w:rPr>
+          <w:rFonts w:ascii="Calibri" w:eastAsia="DengXian" w:hAnsi="Calibri" w:cs="Calibri"/>
+          <w:iCs/>
+          <w:kern w:val="2"/>
+          <w:sz w:val="21"/>
+          <w:szCs w:val="21"/>
+        </w:rPr>
+        <w:t xml:space="preserve"> CAD; SketchUp; Autodesk 3ds Max; Blender; KeyShot; Adobe Illustrator, Photoshop, InDesign; Bootstrap Studio; Scientific figure production; Video/audio editing.</w:t>
+      </w:r>
+    </w:p>
+    <w:p>
+      <w:pPr>
+        <w:spacing w:after="60" w:line="240" w:lineRule="auto"/>
+        <w:rPr>
+          <w:rFonts w:ascii="Calibri" w:eastAsia="DengXian" w:hAnsi="Calibri" w:cs="Calibri"/>
+          <w:iCs/>
+          <w:kern w:val="2"/>
+          <w:sz w:val="21"/>
+          <w:szCs w:val="21"/>
+        </w:rPr>
+      </w:pPr>
+      <w:r>
+        <w:rPr>
+          <w:rFonts w:ascii="Calibri" w:eastAsia="DengXian" w:hAnsi="Calibri" w:cs="Calibri"/>
+          <w:b/>
+          <w:bCs/>
+          <w:iCs/>
+          <w:kern w:val="2"/>
+          <w:sz w:val="21"/>
+          <w:szCs w:val="21"/>
+        </w:rPr>
+        <w:t>Molecular &amp; Bioengineering:</w:t>
+      </w:r>
+      <w:r>
+        <w:rPr>
+          <w:rFonts w:ascii="Calibri" w:eastAsia="DengXian" w:hAnsi="Calibri" w:cs="Calibri"/>
+          <w:iCs/>
+          <w:kern w:val="2"/>
+          <w:sz w:val="21"/>
+          <w:szCs w:val="21"/>
+        </w:rPr>
+        <w:t xml:space="preserve"> PCR; qPCR; IVT; Electrophoresis (PAGE, agarose); DNA/RNA extraction &amp; purification; Cleanroom protocols; Chromatography; Enzymatic assays and workflows.</w:t>
+      </w:r>
+    </w:p>
+    <w:p>
+      <w:pPr>
         <w:widowControl w:val="0"/>
         <w:pBdr>
-          <w:bottom w:val="single" w:sz="4" w:space="1" w:color="auto"/>
+          <w:bottom w:val="single" w:sz="6" w:space="2" w:color="1A3A5C"/>
         </w:pBdr>
-        <w:spacing w:before="240" w:after="0" w:line="240" w:lineRule="auto"/>
-        <w:jc w:val="both"/>
-        <w:rPr>
-          <w:rFonts w:ascii="Calibri" w:eastAsia="DengXian" w:hAnsi="Calibri" w:cs="Calibri"/>
-          <w:b/>
-          <w:kern w:val="2"/>
-        </w:rPr>
-      </w:pPr>
-      <w:r>
-        <w:rPr>
-          <w:rFonts w:ascii="Calibri" w:eastAsia="DengXian" w:hAnsi="Calibri" w:cs="Calibri"/>
-          <w:b/>
-          <w:kern w:val="2"/>
-        </w:rPr>
-        <w:t>SKILLS</w:t>
+        <w:spacing w:before="120" w:after="40" w:line="240" w:lineRule="auto"/>
+        <w:rPr>
+          <w:rFonts w:ascii="Calibri" w:eastAsia="Calibri" w:hAnsi="Calibri" w:cs="Calibri"/>
+          <w:b/>
+          <w:bCs/>
+          <w:color w:val="1A3A5C"/>
+          <w:sz w:val="22"/>
+          <w:szCs w:val="22"/>
+        </w:rPr>
+      </w:pPr>
+      <w:r>
+        <w:rPr>
+          <w:rFonts w:ascii="Calibri" w:eastAsia="Calibri" w:hAnsi="Calibri" w:cs="Calibri"/>
+          <w:b/>
+          <w:bCs/>
+          <w:color w:val="1A3A5C"/>
+          <w:sz w:val="22"/>
+          <w:szCs w:val="22"/>
+        </w:rPr>
+        <w:t>EDUCATION</w:t>
       </w:r>
     </w:p>
     <w:p>
       <w:pPr>
-        <w:spacing w:after="120" w:line="240" w:lineRule="auto"/>
-        <w:rPr>
-          <w:rFonts w:ascii="Calibri" w:eastAsia="DengXian" w:hAnsi="Calibri" w:cs="Calibri"/>
-          <w:iCs/>
-          <w:kern w:val="2"/>
-          <w:sz w:val="21"/>
-          <w:szCs w:val="21"/>
-        </w:rPr>
-      </w:pPr>
-      <w:r>
-        <w:rPr>
-          <w:rFonts w:ascii="Calibri" w:eastAsia="DengXian" w:hAnsi="Calibri" w:cs="Calibri"/>
-          <w:b/>
-          <w:bCs/>
-          <w:iCs/>
-          <w:kern w:val="2"/>
-          <w:sz w:val="21"/>
-          <w:szCs w:val="21"/>
-        </w:rPr>
-        <w:t>Materials Characterization:</w:t>
-      </w:r>
-      <w:r>
-        <w:rPr>
-          <w:rFonts w:ascii="Calibri" w:eastAsia="DengXian" w:hAnsi="Calibri" w:cs="Calibri"/>
-          <w:iCs/>
-          <w:kern w:val="2"/>
-          <w:sz w:val="21"/>
-          <w:szCs w:val="21"/>
-        </w:rPr>
-        <w:t xml:space="preserve"> SEM; DLS; EDS; Optical microscopy; UV-Vis spectroscopy; Fluorescence microscopy; Oscillatory rheometry; Tensile testing (Instron); Contact-angle measurement.</w:t>
+        <w:tabs>
+          <w:tab w:val="right" w:pos="10224"/>
+        </w:tabs>
+        <w:spacing w:before="40" w:after="0"/>
+      </w:pPr>
+      <w:r>
+        <w:rPr>
+          <w:rFonts w:ascii="Calibri" w:eastAsia="DengXian" w:hAnsi="Calibri" w:cs="Calibri"/>
+          <w:b/>
+          <w:bCs/>
+          <w:kern w:val="2"/>
+          <w:sz w:val="21"/>
+          <w:szCs w:val="21"/>
+        </w:rPr>
+        <w:t>Cornell University</w:t>
+      </w:r>
+      <w:r>
+        <w:rPr>
+          <w:rFonts w:ascii="Calibri" w:eastAsia="DengXian" w:hAnsi="Calibri" w:cs="Calibri"/>
+          <w:kern w:val="2"/>
+        </w:rPr>
+        <w:tab/>
+      </w:r>
+      <w:r>
+        <w:rPr>
+          <w:rFonts w:ascii="Calibri" w:eastAsia="DengXian" w:hAnsi="Calibri" w:cs="Calibri"/>
+          <w:i/>
+          <w:iCs/>
+          <w:color w:val="555555"/>
+          <w:kern w:val="2"/>
+          <w:sz w:val="18"/>
+          <w:szCs w:val="18"/>
+        </w:rPr>
+        <w:t>Ithaca, NY</w:t>
       </w:r>
     </w:p>
     <w:p>
       <w:pPr>
-        <w:spacing w:after="120" w:line="240" w:lineRule="auto"/>
-        <w:rPr>
-          <w:rFonts w:ascii="Calibri" w:eastAsia="DengXian" w:hAnsi="Calibri" w:cs="Calibri"/>
-          <w:iCs/>
-          <w:kern w:val="2"/>
-          <w:sz w:val="21"/>
-          <w:szCs w:val="21"/>
-        </w:rPr>
-      </w:pPr>
-      <w:r>
-        <w:rPr>
-          <w:rFonts w:ascii="Calibri" w:eastAsia="DengXian" w:hAnsi="Calibri" w:cs="Calibri"/>
-          <w:b/>
-          <w:bCs/>
-          <w:iCs/>
-          <w:kern w:val="2"/>
-          <w:sz w:val="21"/>
-          <w:szCs w:val="21"/>
-        </w:rPr>
-        <w:t>Fabrication &amp; Processing:</w:t>
-      </w:r>
-      <w:r>
-        <w:rPr>
-          <w:rFonts w:ascii="Calibri" w:eastAsia="DengXian" w:hAnsi="Calibri" w:cs="Calibri"/>
-          <w:iCs/>
-          <w:kern w:val="2"/>
-          <w:sz w:val="21"/>
-          <w:szCs w:val="21"/>
-        </w:rPr>
-        <w:t xml:space="preserve"> Electrospinning; 3D printing (DIW, SLA, FDM); Thermal imprinting; Double-emulsion microencapsulation; Hydrogel formulation; UV photocrosslinking; Spin coating; Mold casting; Photolithography; Two-photon lithography; Etching; Nanopatterning; Freeze-drying; Roll-to-roll processing</w:t>
+        <w:spacing w:after="40"/>
+      </w:pPr>
+      <w:r>
+        <w:rPr>
+          <w:rFonts w:ascii="Calibri" w:eastAsia="DengXian" w:hAnsi="Calibri" w:cs="Calibri"/>
+          <w:i/>
+          <w:iCs/>
+          <w:color w:val="555555"/>
+          <w:kern w:val="2"/>
+          <w:sz w:val="18"/>
+          <w:szCs w:val="18"/>
+        </w:rPr>
+        <w:t xml:space="preserve">Biological and Environmental Engineering  |  Concentration: </w:t>
+      </w:r>
+      <w:r>
+        <w:rPr>
+          <w:rFonts w:ascii="Calibri" w:eastAsia="DengXian" w:hAnsi="Calibri" w:cs="Calibri"/>
+          <w:b/>
+          <w:bCs/>
+          <w:i/>
+          <w:iCs/>
+          <w:color w:val="555555"/>
+          <w:kern w:val="2"/>
+          <w:sz w:val="18"/>
+          <w:szCs w:val="18"/>
+        </w:rPr>
+        <w:t>Materials Science</w:t>
+      </w:r>
+      <w:r>
+        <w:rPr>
+          <w:rFonts w:ascii="Calibri" w:eastAsia="DengXian" w:hAnsi="Calibri" w:cs="Calibri"/>
+          <w:i/>
+          <w:iCs/>
+          <w:color w:val="555555"/>
+          <w:kern w:val="2"/>
+          <w:sz w:val="18"/>
+          <w:szCs w:val="18"/>
+        </w:rPr>
+        <w:t>, Biological Engineering, Bioenvironmental Engineering</w:t>
       </w:r>
     </w:p>
     <w:p>
       <w:pPr>
-        <w:spacing w:after="120" w:line="240" w:lineRule="auto"/>
-        <w:rPr>
-          <w:rFonts w:ascii="Calibri" w:eastAsia="DengXian" w:hAnsi="Calibri" w:cs="Calibri"/>
-          <w:iCs/>
-          <w:kern w:val="2"/>
-          <w:sz w:val="21"/>
-          <w:szCs w:val="21"/>
-        </w:rPr>
-      </w:pPr>
-      <w:r>
-        <w:rPr>
-          <w:rFonts w:ascii="Calibri" w:eastAsia="DengXian" w:hAnsi="Calibri" w:cs="Calibri"/>
-          <w:b/>
-          <w:bCs/>
-          <w:iCs/>
-          <w:kern w:val="2"/>
-          <w:sz w:val="21"/>
-          <w:szCs w:val="21"/>
-        </w:rPr>
-        <w:t>Programming &amp; Data/Modeling:</w:t>
-      </w:r>
-      <w:r>
-        <w:rPr>
-          <w:rFonts w:ascii="Calibri" w:eastAsia="DengXian" w:hAnsi="Calibri" w:cs="Calibri"/>
-          <w:iCs/>
-          <w:kern w:val="2"/>
-          <w:sz w:val="21"/>
-          <w:szCs w:val="21"/>
-        </w:rPr>
-        <w:t xml:space="preserve"> Python; Data analysis &amp; visualization (pandas, NumPy, seaborn); Machine learning (TensorFlow, PyTorch - working knowledge); Java; AI tools (computational workflows, LLM-assisted data analysis)</w:t>
+        <w:spacing w:before="20" w:after="60"/>
+        <w:rPr>
+          <w:rFonts w:ascii="Calibri" w:eastAsia="DengXian" w:hAnsi="Calibri" w:cs="Calibri"/>
+          <w:kern w:val="2"/>
+          <w:sz w:val="20"/>
+          <w:szCs w:val="20"/>
+        </w:rPr>
+      </w:pPr>
+      <w:r>
+        <w:rPr>
+          <w:rFonts w:ascii="Calibri" w:eastAsia="DengXian" w:hAnsi="Calibri" w:cs="Calibri"/>
+          <w:b/>
+          <w:bCs/>
+          <w:kern w:val="2"/>
+          <w:sz w:val="20"/>
+          <w:szCs w:val="20"/>
+        </w:rPr>
+        <w:t>Ph.D.</w:t>
+      </w:r>
+      <w:r>
+        <w:rPr>
+          <w:rFonts w:ascii="Calibri" w:eastAsia="DengXian" w:hAnsi="Calibri" w:cs="Calibri"/>
+          <w:kern w:val="2"/>
+          <w:sz w:val="20"/>
+          <w:szCs w:val="20"/>
+        </w:rPr>
+        <w:t xml:space="preserve"> | May 2026 |  </w:t>
+      </w:r>
+      <w:r>
+        <w:rPr>
+          <w:rFonts w:ascii="Calibri" w:eastAsia="DengXian" w:hAnsi="Calibri" w:cs="Calibri"/>
+          <w:b/>
+          <w:bCs/>
+          <w:kern w:val="2"/>
+          <w:sz w:val="20"/>
+          <w:szCs w:val="20"/>
+        </w:rPr>
+        <w:t>M.S.</w:t>
+      </w:r>
+      <w:r>
+        <w:rPr>
+          <w:rFonts w:ascii="Calibri" w:eastAsia="DengXian" w:hAnsi="Calibri" w:cs="Calibri"/>
+          <w:kern w:val="2"/>
+          <w:sz w:val="20"/>
+          <w:szCs w:val="20"/>
+        </w:rPr>
+        <w:t xml:space="preserve"> |Aug 2024 |  </w:t>
+      </w:r>
+      <w:r>
+        <w:rPr>
+          <w:rFonts w:ascii="Calibri" w:eastAsia="DengXian" w:hAnsi="Calibri" w:cs="Calibri"/>
+          <w:b/>
+          <w:bCs/>
+          <w:kern w:val="2"/>
+          <w:sz w:val="20"/>
+          <w:szCs w:val="20"/>
+        </w:rPr>
+        <w:t>M.Eng.</w:t>
+      </w:r>
+      <w:r>
+        <w:rPr>
+          <w:rFonts w:ascii="Calibri" w:eastAsia="DengXian" w:hAnsi="Calibri" w:cs="Calibri"/>
+          <w:kern w:val="2"/>
+          <w:sz w:val="20"/>
+          <w:szCs w:val="20"/>
+        </w:rPr>
+        <w:t xml:space="preserve"> | May 2020</w:t>
       </w:r>
     </w:p>
     <w:p>
       <w:pPr>
-        <w:spacing w:after="120" w:line="240" w:lineRule="auto"/>
-        <w:rPr>
-          <w:rFonts w:ascii="Calibri" w:eastAsia="DengXian" w:hAnsi="Calibri" w:cs="Calibri"/>
-          <w:iCs/>
-          <w:kern w:val="2"/>
-          <w:sz w:val="21"/>
-          <w:szCs w:val="21"/>
-        </w:rPr>
-      </w:pPr>
-      <w:r>
-        <w:rPr>
-          <w:rFonts w:ascii="Calibri" w:eastAsia="DengXian" w:hAnsi="Calibri" w:cs="Calibri"/>
-          <w:b/>
-          <w:bCs/>
-          <w:iCs/>
-          <w:kern w:val="2"/>
-          <w:sz w:val="21"/>
-          <w:szCs w:val="21"/>
-        </w:rPr>
-        <w:t>2D/3D Design &amp; Visualization:</w:t>
-      </w:r>
-      <w:r>
-        <w:rPr>
-          <w:rFonts w:ascii="Calibri" w:eastAsia="DengXian" w:hAnsi="Calibri" w:cs="Calibri"/>
-          <w:iCs/>
-          <w:kern w:val="2"/>
-          <w:sz w:val="21"/>
-          <w:szCs w:val="21"/>
-        </w:rPr>
-        <w:t xml:space="preserve"> CAD; SketchUp; Autodesk 3ds Max; Blender; KeyShot; Adobe Illustrator, Photoshop, InDesign; Bootstrap Studio; Scientific figure production; Video/audio editing.</w:t>
+        <w:tabs>
+          <w:tab w:val="right" w:pos="10224"/>
+        </w:tabs>
+        <w:spacing w:before="40" w:after="0"/>
+      </w:pPr>
+      <w:r>
+        <w:rPr>
+          <w:rFonts w:ascii="Calibri" w:eastAsia="DengXian" w:hAnsi="Calibri" w:cs="Calibri"/>
+          <w:b/>
+          <w:bCs/>
+          <w:kern w:val="2"/>
+          <w:sz w:val="21"/>
+          <w:szCs w:val="21"/>
+        </w:rPr>
+        <w:t>Hong Kong Baptist University</w:t>
+      </w:r>
+      <w:r>
+        <w:rPr>
+          <w:rFonts w:ascii="Calibri" w:eastAsia="DengXian" w:hAnsi="Calibri" w:cs="Calibri"/>
+          <w:kern w:val="2"/>
+        </w:rPr>
+        <w:tab/>
+      </w:r>
+      <w:r>
+        <w:rPr>
+          <w:rFonts w:ascii="Calibri" w:eastAsia="DengXian" w:hAnsi="Calibri" w:cs="Calibri"/>
+          <w:i/>
+          <w:iCs/>
+          <w:color w:val="555555"/>
+          <w:kern w:val="2"/>
+          <w:sz w:val="18"/>
+          <w:szCs w:val="18"/>
+        </w:rPr>
+        <w:t>Kowloon, Hong Kong</w:t>
       </w:r>
     </w:p>
     <w:p>
       <w:pPr>
-        <w:spacing w:after="120" w:line="240" w:lineRule="auto"/>
-        <w:rPr>
-          <w:rFonts w:ascii="Calibri" w:eastAsia="DengXian" w:hAnsi="Calibri" w:cs="Calibri"/>
-          <w:iCs/>
-          <w:kern w:val="2"/>
-          <w:sz w:val="21"/>
-          <w:szCs w:val="21"/>
-        </w:rPr>
-      </w:pPr>
-      <w:r>
-        <w:rPr>
-          <w:rFonts w:ascii="Calibri" w:eastAsia="DengXian" w:hAnsi="Calibri" w:cs="Calibri"/>
-          <w:b/>
-          <w:bCs/>
-          <w:iCs/>
-          <w:kern w:val="2"/>
-          <w:sz w:val="21"/>
-          <w:szCs w:val="21"/>
-        </w:rPr>
-        <w:t>Molecular &amp; Bioengineering:</w:t>
-      </w:r>
-      <w:r>
-        <w:rPr>
-          <w:rFonts w:ascii="Calibri" w:eastAsia="DengXian" w:hAnsi="Calibri" w:cs="Calibri"/>
-          <w:iCs/>
-          <w:kern w:val="2"/>
-          <w:sz w:val="21"/>
-          <w:szCs w:val="21"/>
-        </w:rPr>
-        <w:t xml:space="preserve"> PCR; qPCR; IVT; Electrophoresis (PAGE, agarose); DNA/RNA extraction &amp; purification; LSPR-based binding assays; Cleanroom protocols; Chromatography; Enzymatic assays and workflows.</w:t>
+        <w:spacing w:after="40"/>
+      </w:pPr>
+      <w:r>
+        <w:rPr>
+          <w:rFonts w:ascii="Calibri" w:eastAsia="DengXian" w:hAnsi="Calibri" w:cs="Calibri"/>
+          <w:b/>
+          <w:bCs/>
+          <w:i/>
+          <w:iCs/>
+          <w:color w:val="555555"/>
+          <w:kern w:val="2"/>
+          <w:sz w:val="18"/>
+          <w:szCs w:val="18"/>
+        </w:rPr>
+        <w:t>Chemistry</w:t>
+      </w:r>
+      <w:r>
+        <w:rPr>
+          <w:rFonts w:ascii="Calibri" w:eastAsia="DengXian" w:hAnsi="Calibri" w:cs="Calibri"/>
+          <w:i/>
+          <w:iCs/>
+          <w:color w:val="555555"/>
+          <w:kern w:val="2"/>
+          <w:sz w:val="18"/>
+          <w:szCs w:val="18"/>
+        </w:rPr>
+        <w:t xml:space="preserve"> (Major)  |  Computer Science (Minor)</w:t>
       </w:r>
     </w:p>
     <w:p>
       <w:pPr>
+        <w:spacing w:before="20" w:after="60"/>
+        <w:rPr>
+          <w:sz w:val="20"/>
+          <w:szCs w:val="20"/>
+        </w:rPr>
+      </w:pPr>
+      <w:r>
+        <w:rPr>
+          <w:rFonts w:ascii="Calibri" w:eastAsia="DengXian" w:hAnsi="Calibri" w:cs="Calibri"/>
+          <w:b/>
+          <w:bCs/>
+          <w:kern w:val="2"/>
+          <w:sz w:val="20"/>
+          <w:szCs w:val="20"/>
+        </w:rPr>
+        <w:t>B.Sc. (Hons)</w:t>
+      </w:r>
+      <w:r>
+        <w:rPr>
+          <w:rFonts w:ascii="Calibri" w:eastAsia="DengXian" w:hAnsi="Calibri" w:cs="Calibri"/>
+          <w:kern w:val="2"/>
+          <w:sz w:val="20"/>
+          <w:szCs w:val="20"/>
+        </w:rPr>
+        <w:t xml:space="preserve"> | Nov 2019</w:t>
+      </w:r>
+    </w:p>
+    <w:p>
+      <w:pPr>
         <w:widowControl w:val="0"/>
         <w:pBdr>
-          <w:bottom w:val="single" w:sz="4" w:space="0" w:color="auto"/>
+          <w:bottom w:val="single" w:sz="6" w:space="2" w:color="1A3A5C"/>
         </w:pBdr>
-        <w:spacing w:before="240" w:after="0" w:line="240" w:lineRule="auto"/>
-        <w:jc w:val="both"/>
-        <w:rPr>
-          <w:rFonts w:ascii="Calibri" w:eastAsia="DengXian" w:hAnsi="Calibri" w:cs="Calibri"/>
-          <w:b/>
-          <w:kern w:val="2"/>
-        </w:rPr>
-      </w:pPr>
-      <w:r>
-        <w:rPr>
-          <w:rFonts w:ascii="Calibri" w:eastAsia="DengXian" w:hAnsi="Calibri" w:cs="Calibri"/>
-          <w:b/>
-          <w:kern w:val="2"/>
-        </w:rPr>
-        <w:t>EDUCATION</w:t>
+        <w:spacing w:before="120" w:after="40" w:line="240" w:lineRule="auto"/>
+        <w:rPr>
+          <w:rFonts w:ascii="Calibri" w:eastAsia="Calibri" w:hAnsi="Calibri" w:cs="Calibri"/>
+          <w:b/>
+          <w:bCs/>
+          <w:color w:val="1A3A5C"/>
+          <w:sz w:val="22"/>
+          <w:szCs w:val="22"/>
+        </w:rPr>
+      </w:pPr>
+      <w:r>
+        <w:rPr>
+          <w:rFonts w:ascii="Calibri" w:eastAsia="Calibri" w:hAnsi="Calibri" w:cs="Calibri"/>
+          <w:b/>
+          <w:bCs/>
+          <w:color w:val="1A3A5C"/>
+          <w:sz w:val="22"/>
+          <w:szCs w:val="22"/>
+        </w:rPr>
+        <w:t>EXPERIENCE</w:t>
       </w:r>
     </w:p>
     <w:p>
       <w:pPr>
-        <w:spacing w:after="0"/>
-      </w:pPr>
-      <w:r>
-        <w:rPr>
-          <w:rFonts w:ascii="Calibri" w:eastAsia="DengXian" w:hAnsi="Calibri" w:cs="Calibri"/>
-          <w:b/>
-          <w:bCs/>
-          <w:kern w:val="2"/>
-          <w:sz w:val="21"/>
-          <w:szCs w:val="21"/>
-        </w:rPr>
-        <w:t>Cornell University</w:t>
-      </w:r>
-      <w:r>
-        <w:rPr>
-          <w:rFonts w:ascii="Calibri" w:eastAsia="DengXian" w:hAnsi="Calibri" w:cs="Calibri"/>
-          <w:kern w:val="2"/>
-          <w:sz w:val="21"/>
-          <w:szCs w:val="21"/>
-        </w:rPr>
-        <w:t>, Ithaca, NY</w:t>
+        <w:tabs>
+          <w:tab w:val="right" w:pos="10224"/>
+        </w:tabs>
+        <w:spacing w:before="80" w:after="0" w:line="240" w:lineRule="auto"/>
+        <w:rPr>
+          <w:rFonts w:ascii="Calibri" w:eastAsia="SimSun" w:hAnsi="Calibri" w:cs="Calibri"/>
+          <w:color w:val="1A3A5C"/>
+          <w:sz w:val="20"/>
+          <w:szCs w:val="20"/>
+        </w:rPr>
+      </w:pPr>
+      <w:r>
+        <w:rPr>
+          <w:rFonts w:ascii="Calibri" w:eastAsia="Calibri" w:hAnsi="Calibri" w:cs="Calibri"/>
+          <w:b/>
+          <w:bCs/>
+          <w:color w:val="1A3A5C"/>
+          <w:sz w:val="21"/>
+          <w:szCs w:val="21"/>
+        </w:rPr>
+        <w:t>Graduate Research</w:t>
+      </w:r>
+      <w:r>
+        <w:rPr>
+          <w:rFonts w:ascii="Calibri" w:eastAsia="Calibri" w:hAnsi="Calibri" w:cs="Calibri"/>
+          <w:b/>
+          <w:bCs/>
+          <w:color w:val="1A3A5C"/>
+          <w:sz w:val="21"/>
+          <w:szCs w:val="21"/>
+        </w:rPr>
+        <w:t xml:space="preserve"> </w:t>
+      </w:r>
+      <w:r>
+        <w:rPr>
+          <w:rFonts w:ascii="Calibri" w:eastAsia="Calibri" w:hAnsi="Calibri" w:cs="Calibri"/>
+          <w:b/>
+          <w:bCs/>
+          <w:color w:val="1A3A5C"/>
+          <w:sz w:val="21"/>
+          <w:szCs w:val="21"/>
+        </w:rPr>
+        <w:t xml:space="preserve">&amp; Teaching </w:t>
+      </w:r>
+      <w:r>
+        <w:rPr>
+          <w:rFonts w:ascii="Calibri" w:eastAsia="Calibri" w:hAnsi="Calibri" w:cs="Calibri"/>
+          <w:b/>
+          <w:bCs/>
+          <w:color w:val="1A3A5C"/>
+          <w:sz w:val="21"/>
+          <w:szCs w:val="21"/>
+        </w:rPr>
+        <w:t>Assistant</w:t>
+      </w:r>
+      <w:r>
+        <w:rPr>
+          <w:rFonts w:ascii="Calibri" w:eastAsia="Calibri" w:hAnsi="Calibri" w:cs="Calibri"/>
+          <w:color w:val="1A3A5C"/>
+          <w:sz w:val="19"/>
+          <w:szCs w:val="19"/>
+        </w:rPr>
+        <w:tab/>
+      </w:r>
+      <w:r>
+        <w:rPr>
+          <w:rFonts w:ascii="Calibri" w:eastAsia="Calibri" w:hAnsi="Calibri" w:cs="Calibri"/>
+          <w:i/>
+          <w:iCs/>
+          <w:color w:val="555555"/>
+          <w:sz w:val="20"/>
+          <w:szCs w:val="20"/>
+        </w:rPr>
+        <w:t>Feb 2021 – May 2026</w:t>
       </w:r>
     </w:p>
     <w:p>
       <w:pPr>
-        <w:spacing w:after="0"/>
-      </w:pPr>
-      <w:r>
-        <w:rPr>
-          <w:rFonts w:ascii="Calibri" w:eastAsia="DengXian" w:hAnsi="Calibri" w:cs="Calibri"/>
-          <w:kern w:val="2"/>
-          <w:sz w:val="22"/>
-          <w:szCs w:val="22"/>
-        </w:rPr>
-        <w:t>Biological and Environmental Engineering</w:t>
-      </w:r>
-    </w:p>
-    <w:p>
-      <w:pPr>
-        <w:spacing w:after="0"/>
-      </w:pPr>
-      <w:r>
-        <w:rPr>
-          <w:rFonts w:ascii="Calibri" w:eastAsia="DengXian" w:hAnsi="Calibri" w:cs="Calibri"/>
-          <w:b/>
-          <w:bCs/>
-          <w:kern w:val="2"/>
-          <w:sz w:val="20"/>
-          <w:szCs w:val="20"/>
-        </w:rPr>
-        <w:t xml:space="preserve">Concentration: </w:t>
-      </w:r>
-      <w:r>
-        <w:rPr>
-          <w:rFonts w:ascii="Calibri" w:eastAsia="DengXian" w:hAnsi="Calibri" w:cs="Calibri"/>
+        <w:spacing w:after="40" w:line="240" w:lineRule="auto"/>
+        <w:rPr>
+          <w:rFonts w:ascii="Calibri" w:eastAsia="SimSun" w:hAnsi="Calibri" w:cs="Calibri"/>
+          <w:sz w:val="20"/>
+          <w:szCs w:val="20"/>
+        </w:rPr>
+      </w:pPr>
+      <w:r>
+        <w:rPr>
+          <w:rFonts w:ascii="Calibri" w:eastAsia="Calibri" w:hAnsi="Calibri" w:cs="Calibri"/>
           <w:i/>
           <w:iCs/>
-          <w:kern w:val="2"/>
-          <w:sz w:val="20"/>
-          <w:szCs w:val="20"/>
-        </w:rPr>
-        <w:t>Materials Science, Biological Engineering, Bioenvironmental Engineering</w:t>
-      </w:r>
-    </w:p>
-    <w:p>
-      <w:pPr>
-        <w:spacing w:after="0"/>
-      </w:pPr>
-      <w:r>
-        <w:rPr>
-          <w:rFonts w:ascii="Calibri" w:eastAsia="DengXian" w:hAnsi="Calibri" w:cs="Calibri"/>
-          <w:b/>
-          <w:bCs/>
-          <w:kern w:val="2"/>
-          <w:sz w:val="22"/>
-          <w:szCs w:val="22"/>
-        </w:rPr>
-        <w:t>Ph.D.</w:t>
-      </w:r>
-      <w:r>
-        <w:rPr>
-          <w:rFonts w:ascii="Calibri" w:eastAsia="DengXian" w:hAnsi="Calibri" w:cs="Calibri"/>
-          <w:kern w:val="2"/>
-          <w:sz w:val="20"/>
-          <w:szCs w:val="20"/>
-        </w:rPr>
-        <w:t xml:space="preserve"> -- DNA Materials Lab, Advisor: Dan Luo  |  Expected May 2026</w:t>
-      </w:r>
-    </w:p>
-    <w:p>
-      <w:pPr>
-        <w:spacing w:after="0"/>
-      </w:pPr>
-      <w:r>
-        <w:rPr>
-          <w:rFonts w:ascii="Calibri" w:eastAsia="DengXian" w:hAnsi="Calibri" w:cs="Calibri"/>
-          <w:b/>
-          <w:bCs/>
-          <w:kern w:val="2"/>
-          <w:sz w:val="22"/>
-          <w:szCs w:val="22"/>
-        </w:rPr>
-        <w:t>M.S.</w:t>
-      </w:r>
-      <w:r>
-        <w:rPr>
-          <w:rFonts w:ascii="Calibri" w:eastAsia="DengXian" w:hAnsi="Calibri" w:cs="Calibri"/>
-          <w:kern w:val="2"/>
-          <w:sz w:val="20"/>
-          <w:szCs w:val="20"/>
-        </w:rPr>
-        <w:t xml:space="preserve">  |  Aug 2024</w:t>
-      </w:r>
-    </w:p>
-    <w:p>
-      <w:pPr>
-        <w:spacing w:after="0"/>
-      </w:pPr>
-      <w:r>
-        <w:rPr>
-          <w:rFonts w:ascii="Calibri" w:eastAsia="DengXian" w:hAnsi="Calibri" w:cs="Calibri"/>
-          <w:b/>
-          <w:bCs/>
-          <w:kern w:val="2"/>
-          <w:sz w:val="22"/>
-          <w:szCs w:val="22"/>
-        </w:rPr>
-        <w:t>M.Eng.</w:t>
-      </w:r>
-      <w:r>
-        <w:rPr>
-          <w:rFonts w:ascii="Calibri" w:eastAsia="DengXian" w:hAnsi="Calibri" w:cs="Calibri"/>
-          <w:kern w:val="2"/>
-          <w:sz w:val="20"/>
-          <w:szCs w:val="20"/>
-        </w:rPr>
-        <w:t xml:space="preserve">  |  May 2020</w:t>
-      </w:r>
-    </w:p>
-    <w:p>
-      <w:pPr>
-        <w:spacing w:before="120" w:after="0"/>
-      </w:pPr>
-      <w:r>
-        <w:rPr>
-          <w:rFonts w:ascii="Calibri" w:eastAsia="DengXian" w:hAnsi="Calibri" w:cs="Calibri"/>
-          <w:b/>
-          <w:bCs/>
-          <w:kern w:val="2"/>
-          <w:sz w:val="21"/>
-          <w:szCs w:val="21"/>
-        </w:rPr>
-        <w:t>Hong Kong Baptist University</w:t>
-      </w:r>
-      <w:r>
-        <w:rPr>
-          <w:rFonts w:ascii="Calibri" w:eastAsia="DengXian" w:hAnsi="Calibri" w:cs="Calibri"/>
-          <w:kern w:val="2"/>
-          <w:sz w:val="21"/>
-          <w:szCs w:val="21"/>
-        </w:rPr>
-        <w:t>, Kowloon, Hong Kong</w:t>
-      </w:r>
-    </w:p>
-    <w:p>
-      <w:pPr>
-        <w:spacing w:after="0"/>
-      </w:pPr>
-      <w:r>
-        <w:rPr>
-          <w:rFonts w:ascii="Calibri" w:eastAsia="DengXian" w:hAnsi="Calibri" w:cs="Calibri"/>
-          <w:kern w:val="2"/>
-          <w:sz w:val="22"/>
-          <w:szCs w:val="22"/>
-        </w:rPr>
-        <w:t>Chemistry (Major) and Computer Science (Minor)</w:t>
-      </w:r>
-    </w:p>
-    <w:p>
-      <w:pPr>
-        <w:spacing w:after="0"/>
-      </w:pPr>
-      <w:r>
-        <w:rPr>
-          <w:rFonts w:ascii="Calibri" w:eastAsia="DengXian" w:hAnsi="Calibri" w:cs="Calibri"/>
-          <w:b/>
-          <w:bCs/>
-          <w:kern w:val="2"/>
-          <w:sz w:val="22"/>
-          <w:szCs w:val="22"/>
-        </w:rPr>
-        <w:t>B.Sc. (Hons)</w:t>
-      </w:r>
-      <w:r>
-        <w:rPr>
-          <w:rFonts w:ascii="Calibri" w:eastAsia="DengXian" w:hAnsi="Calibri" w:cs="Calibri"/>
-          <w:kern w:val="2"/>
-          <w:sz w:val="20"/>
-          <w:szCs w:val="20"/>
-        </w:rPr>
-        <w:t xml:space="preserve"> -- Microfabrication &amp; Surface Materials Lab, Supervisor: Kangning Ren  |  Nov 2019</w:t>
-      </w:r>
-    </w:p>
-    <w:p>
-      <w:pPr>
-        <w:widowControl w:val="0"/>
-        <w:pBdr>
-          <w:bottom w:val="single" w:sz="4" w:space="1" w:color="auto"/>
-        </w:pBdr>
-        <w:spacing w:before="240" w:after="0" w:line="240" w:lineRule="auto"/>
-        <w:jc w:val="both"/>
-        <w:rPr>
-          <w:rFonts w:ascii="Calibri" w:eastAsia="DengXian" w:hAnsi="Calibri" w:cs="Calibri"/>
-          <w:b/>
-          <w:kern w:val="2"/>
-        </w:rPr>
-      </w:pPr>
-      <w:r>
-        <w:rPr>
-          <w:rFonts w:ascii="Calibri" w:eastAsia="DengXian" w:hAnsi="Calibri" w:cs="Calibri"/>
-          <w:b/>
-          <w:kern w:val="2"/>
-        </w:rPr>
-        <w:t>EXPERIENCE</w:t>
-      </w:r>
-    </w:p>
-    <w:p>
-      <w:pPr>
-        <w:spacing w:after="0"/>
-      </w:pPr>
-      <w:r>
-        <w:rPr>
-          <w:rFonts w:ascii="Calibri" w:eastAsia="DengXian" w:hAnsi="Calibri" w:cs="Calibri"/>
-          <w:b/>
-          <w:bCs/>
-          <w:kern w:val="2"/>
-          <w:sz w:val="21"/>
-          <w:szCs w:val="21"/>
-        </w:rPr>
-        <w:t>Graduate Research Assistant</w:t>
-      </w:r>
-      <w:r>
-        <w:rPr>
-          <w:rFonts w:ascii="Calibri" w:eastAsia="DengXian" w:hAnsi="Calibri" w:cs="Calibri"/>
-          <w:kern w:val="2"/>
-          <w:sz w:val="21"/>
-          <w:szCs w:val="21"/>
-        </w:rPr>
-        <w:t xml:space="preserve">  |  Ithaca, NY</w:t>
-      </w:r>
-    </w:p>
-    <w:p>
-      <w:pPr>
-        <w:spacing w:after="0"/>
-      </w:pPr>
-      <w:r>
-        <w:rPr>
-          <w:rFonts w:ascii="Calibri" w:eastAsia="DengXian" w:hAnsi="Calibri" w:cs="Calibri"/>
-          <w:kern w:val="2"/>
-          <w:sz w:val="22"/>
-          <w:szCs w:val="22"/>
-        </w:rPr>
-        <w:t>DNA Materials Lab, Cornell University  |  Feb 2021 - Present</w:t>
+          <w:color w:val="555555"/>
+          <w:sz w:val="20"/>
+          <w:szCs w:val="20"/>
+        </w:rPr>
+        <w:t>DNA Materials Lab, Advisor: Prof. Dan Luo  |  Cornell University, Ithaca, NY</w:t>
       </w:r>
     </w:p>
     <w:p>
@@ -567,7 +1114,7 @@
           <w:tab w:val="num" w:pos="720"/>
         </w:tabs>
         <w:snapToGrid w:val="0"/>
-        <w:spacing w:afterLines="40" w:after="96" w:line="300" w:lineRule="auto"/>
+        <w:spacing w:afterLines="40" w:after="96" w:line="276" w:lineRule="auto"/>
         <w:ind w:left="216" w:hanging="216"/>
         <w:rPr>
           <w:rFonts w:ascii="Calibri" w:eastAsia="DengXian" w:hAnsi="Calibri" w:cs="Calibri"/>
@@ -578,85 +1125,132 @@
           <w:szCs w:val="21"/>
         </w:rPr>
       </w:pPr>
-      <w:r>
-        <w:rPr>
-          <w:rFonts w:ascii="Calibri" w:eastAsia="DengXian" w:hAnsi="Calibri" w:cs="Calibri"/>
-          <w:b/>
-          <w:bCs/>
-          <w:iCs/>
-          <w:kern w:val="2"/>
-          <w:sz w:val="21"/>
-          <w:szCs w:val="21"/>
-        </w:rPr>
-        <w:t>Developed biodegradable PLGA microparticles encapsulating synthetic DNA via double-emulsion solvent evaporation</w:t>
-      </w:r>
-      <w:r>
-        <w:rPr>
-          <w:rFonts w:ascii="Calibri" w:eastAsia="DengXian" w:hAnsi="Calibri" w:cs="Calibri"/>
-          <w:bCs/>
-          <w:iCs/>
-          <w:kern w:val="2"/>
-          <w:sz w:val="21"/>
-          <w:szCs w:val="21"/>
-        </w:rPr>
-        <w:t xml:space="preserve"> as hydrological tracers; SEM-characterized size distribution matched natural eDNA particle range. Produced gram-scale batches and led a DoD-funded field deployment across 11 km2 of lake, achieving qPCR detection 7 km downstream from </w:t>
-      </w:r>
-      <w:r>
-        <w:rPr>
-          <w:rFonts w:ascii="Calibri" w:eastAsia="DengXian" w:hAnsi="Calibri" w:cs="Calibri"/>
-          <w:bCs/>
-          <w:iCs/>
-          <w:kern w:val="2"/>
-          <w:sz w:val="21"/>
-          <w:szCs w:val="21"/>
-        </w:rPr>
-        <w:t xml:space="preserve">less than </w:t>
-      </w:r>
-      <w:r>
-        <w:rPr>
-          <w:rFonts w:ascii="Calibri" w:eastAsia="DengXian" w:hAnsi="Calibri" w:cs="Calibri"/>
-          <w:bCs/>
-          <w:iCs/>
-          <w:kern w:val="2"/>
-          <w:sz w:val="21"/>
-          <w:szCs w:val="21"/>
-        </w:rPr>
-        <w:t>1 mg release. (first-author, ES&amp;T, 2025).</w:t>
+      <w:bookmarkStart w:id="2" w:name="OLE_LINK37"/>
+      <w:r>
+        <w:rPr>
+          <w:rFonts w:ascii="Calibri" w:eastAsia="DengXian" w:hAnsi="Calibri" w:cs="Calibri"/>
+          <w:b/>
+          <w:iCs/>
+          <w:kern w:val="2"/>
+          <w:sz w:val="21"/>
+          <w:szCs w:val="21"/>
+        </w:rPr>
+        <w:t>Formulated biodegradable PLGA polymeric microparticles for synthetic DNA encapsulation and environmental tracing</w:t>
+      </w:r>
+      <w:r>
+        <w:rPr>
+          <w:rFonts w:ascii="Calibri" w:eastAsia="DengXian" w:hAnsi="Calibri" w:cs="Calibri"/>
+          <w:bCs/>
+          <w:iCs/>
+          <w:kern w:val="2"/>
+          <w:sz w:val="21"/>
+          <w:szCs w:val="21"/>
+        </w:rPr>
+        <w:t xml:space="preserve">; produced via double-emulsion solvent evaporation with SEM-characterized particle morphology and size distribution. Scaled to gram-scale production and validated in a DoD-funded field deployment across 11 km², confirming </w:t>
+      </w:r>
+      <w:r>
+        <w:rPr>
+          <w:rFonts w:ascii="Calibri" w:eastAsia="DengXian" w:hAnsi="Calibri" w:cs="Calibri"/>
+          <w:bCs/>
+          <w:iCs/>
+          <w:kern w:val="2"/>
+          <w:sz w:val="21"/>
+          <w:szCs w:val="21"/>
+        </w:rPr>
+        <w:t>DNA</w:t>
+      </w:r>
+      <w:r>
+        <w:rPr>
+          <w:rFonts w:ascii="Calibri" w:eastAsia="DengXian" w:hAnsi="Calibri" w:cs="Calibri"/>
+          <w:bCs/>
+          <w:iCs/>
+          <w:kern w:val="2"/>
+          <w:sz w:val="21"/>
+          <w:szCs w:val="21"/>
+        </w:rPr>
+        <w:t xml:space="preserve"> detection 7 km downstream from sub-milligram release. (</w:t>
+      </w:r>
+      <w:r>
+        <w:rPr>
+          <w:rFonts w:ascii="Calibri" w:eastAsia="DengXian" w:hAnsi="Calibri" w:cs="Calibri"/>
+          <w:bCs/>
+          <w:iCs/>
+          <w:kern w:val="2"/>
+          <w:sz w:val="21"/>
+          <w:szCs w:val="21"/>
+        </w:rPr>
+        <w:t>F</w:t>
+      </w:r>
+      <w:r>
+        <w:rPr>
+          <w:rFonts w:ascii="Calibri" w:eastAsia="DengXian" w:hAnsi="Calibri" w:cs="Calibri"/>
+          <w:bCs/>
+          <w:iCs/>
+          <w:kern w:val="2"/>
+          <w:sz w:val="21"/>
+          <w:szCs w:val="21"/>
+        </w:rPr>
+        <w:t>irst-author</w:t>
+      </w:r>
+      <w:r>
+        <w:rPr>
+          <w:rFonts w:ascii="Calibri" w:eastAsia="DengXian" w:hAnsi="Calibri" w:cs="Calibri"/>
+          <w:bCs/>
+          <w:iCs/>
+          <w:kern w:val="2"/>
+          <w:sz w:val="21"/>
+          <w:szCs w:val="21"/>
+        </w:rPr>
+        <w:t xml:space="preserve"> </w:t>
+      </w:r>
+      <w:bookmarkStart w:id="3" w:name="OLE_LINK41"/>
+      <w:r>
+        <w:rPr>
+          <w:rFonts w:ascii="Calibri" w:eastAsia="DengXian" w:hAnsi="Calibri" w:cs="Calibri"/>
+          <w:bCs/>
+          <w:iCs/>
+          <w:kern w:val="2"/>
+          <w:sz w:val="21"/>
+          <w:szCs w:val="21"/>
+        </w:rPr>
+        <w:t>paper</w:t>
+      </w:r>
+      <w:bookmarkEnd w:id="3"/>
+      <w:r>
+        <w:rPr>
+          <w:rFonts w:ascii="Calibri" w:eastAsia="DengXian" w:hAnsi="Calibri" w:cs="Calibri"/>
+          <w:bCs/>
+          <w:iCs/>
+          <w:kern w:val="2"/>
+          <w:sz w:val="21"/>
+          <w:szCs w:val="21"/>
+        </w:rPr>
+        <w:t xml:space="preserve">, </w:t>
+      </w:r>
+      <w:r>
+        <w:rPr>
+          <w:rFonts w:ascii="Calibri" w:eastAsia="DengXian" w:hAnsi="Calibri" w:cs="Calibri"/>
+          <w:bCs/>
+          <w:i/>
+          <w:kern w:val="2"/>
+          <w:sz w:val="21"/>
+          <w:szCs w:val="21"/>
+        </w:rPr>
+        <w:t>ES&amp;T</w:t>
+      </w:r>
+      <w:r>
+        <w:rPr>
+          <w:rFonts w:ascii="Calibri" w:eastAsia="DengXian" w:hAnsi="Calibri" w:cs="Calibri"/>
+          <w:bCs/>
+          <w:iCs/>
+          <w:kern w:val="2"/>
+          <w:sz w:val="21"/>
+          <w:szCs w:val="21"/>
+        </w:rPr>
+        <w:t>, 2025).</w:t>
       </w:r>
     </w:p>
-    <w:p>
-      <w:pPr>
-        <w:numPr>
-          <w:ilvl w:val="0"/>
-          <w:numId w:val="9"/>
-        </w:numPr>
-        <w:spacing w:after="96" w:line="300" w:lineRule="auto"/>
-        <w:ind w:left="216" w:hanging="216"/>
-      </w:pPr>
-      <w:r>
-        <w:rPr>
-          <w:rFonts w:ascii="Calibri" w:eastAsia="DengXian" w:hAnsi="Calibri" w:cs="Calibri"/>
-          <w:b/>
-          <w:bCs/>
-          <w:iCs/>
-          <w:kern w:val="2"/>
-          <w:sz w:val="21"/>
-          <w:szCs w:val="21"/>
-        </w:rPr>
-        <w:t>Engineered a DNA-functionalized PEG hydrogel-mesh composite (NucleoMesh) for continuous biomanufacturing:</w:t>
-      </w:r>
-      <w:r>
-        <w:rPr>
-          <w:rFonts w:ascii="Calibri" w:eastAsia="DengXian" w:hAnsi="Calibri" w:cs="Calibri"/>
-          <w:bCs/>
-          <w:iCs/>
-          <w:kern w:val="2"/>
-          <w:sz w:val="21"/>
-          <w:szCs w:val="21"/>
-        </w:rPr>
-        <w:t xml:space="preserve"> UV-cured organogel on polyester mesh scaffold with covalent DNA immobilization (NHS-amine bioconjugation); systematically varied monomer concentration, crosslinker ratio, and template loading, elucidating non-monotonic process-structure-property relationships. Characterized by SEM, fluorescence microscopy, rheometry, and UV-Vis spectrophotometry; validated 100-day material stability under continuous flow. (2nd author, Nature under review.)</w:t>
-      </w:r>
-    </w:p>
+    <w:bookmarkEnd w:id="2"/>
     <w:p>
       <w:pPr>
         <w:numPr>
@@ -667,7 +1261,7 @@
           <w:tab w:val="num" w:pos="720"/>
         </w:tabs>
         <w:snapToGrid w:val="0"/>
-        <w:spacing w:afterLines="40" w:after="96" w:line="300" w:lineRule="auto"/>
+        <w:spacing w:afterLines="40" w:after="96" w:line="276" w:lineRule="auto"/>
         <w:ind w:left="216" w:hanging="216"/>
         <w:rPr>
           <w:rFonts w:ascii="Calibri" w:eastAsia="DengXian" w:hAnsi="Calibri" w:cs="Calibri"/>
@@ -688,19 +1282,122 @@
           <w:sz w:val="21"/>
           <w:szCs w:val="21"/>
         </w:rPr>
-        <w:lastRenderedPageBreak/>
-        <w:t>Developed biomass DNA hydrogels with three crosslinking chemistries--thermal, photochemical (UV-reversible psoralen), and ionic (Al3+)</w:t>
-      </w:r>
-      <w:r>
-        <w:rPr>
-          <w:rFonts w:ascii="Calibri" w:eastAsia="DengXian" w:hAnsi="Calibri" w:cs="Calibri"/>
-          <w:bCs/>
-          <w:iCs/>
-          <w:kern w:val="2"/>
-          <w:sz w:val="21"/>
-          <w:szCs w:val="21"/>
-        </w:rPr>
-        <w:t>--producing stimuli-responsive networks spanning thermoreversible to irreversible from a single biopolymer feedstock. Mapped processing-structure-property relationships across 6 formulation variables; characterized by oscillatory rheometry and Instron tensile testing. Demonstrated extrusion-based 3D printing and vascular self-healing in ceramic tiles. (co-first-author, ACADIA, 2024).</w:t>
+        <w:t>Engineered a PEG-based polymeric hydrogel composite on polyester mesh scaffold for continuous biomanufacturing</w:t>
+      </w:r>
+      <w:r>
+        <w:rPr>
+          <w:rFonts w:ascii="Calibri" w:eastAsia="DengXian" w:hAnsi="Calibri" w:cs="Calibri"/>
+          <w:b/>
+          <w:bCs/>
+          <w:iCs/>
+          <w:kern w:val="2"/>
+          <w:sz w:val="21"/>
+          <w:szCs w:val="21"/>
+        </w:rPr>
+        <w:t>;</w:t>
+      </w:r>
+      <w:r>
+        <w:rPr>
+          <w:rFonts w:ascii="Calibri" w:eastAsia="DengXian" w:hAnsi="Calibri" w:cs="Calibri"/>
+          <w:b/>
+          <w:bCs/>
+          <w:iCs/>
+          <w:kern w:val="2"/>
+          <w:sz w:val="21"/>
+          <w:szCs w:val="21"/>
+        </w:rPr>
+        <w:t xml:space="preserve"> </w:t>
+      </w:r>
+      <w:r>
+        <w:rPr>
+          <w:rFonts w:ascii="Calibri" w:eastAsia="DengXian" w:hAnsi="Calibri" w:cs="Calibri"/>
+          <w:iCs/>
+          <w:kern w:val="2"/>
+          <w:sz w:val="21"/>
+          <w:szCs w:val="21"/>
+        </w:rPr>
+        <w:t>UV-cured organogel with covalent DNA immobilization via NHS-amine bioconjugation. Systematically varied monomer concentration, crosslinker ratio, and functional loading, mapping non-monotonic process-structure-property relationships. Characterized morphology (SEM), network viscoelasticity (rheometry), spatial distribution (fluorescence microscopy); validated 100-day material stability, sustaining in vitro transcription of 6 RNA species from immobilized DNA templates. (</w:t>
+      </w:r>
+      <w:r>
+        <w:rPr>
+          <w:rFonts w:ascii="Calibri" w:eastAsia="DengXian" w:hAnsi="Calibri" w:cs="Calibri"/>
+          <w:iCs/>
+          <w:kern w:val="2"/>
+          <w:sz w:val="21"/>
+          <w:szCs w:val="21"/>
+        </w:rPr>
+        <w:t>Second</w:t>
+      </w:r>
+      <w:r>
+        <w:rPr>
+          <w:rFonts w:ascii="Calibri" w:eastAsia="DengXian" w:hAnsi="Calibri" w:cs="Calibri"/>
+          <w:iCs/>
+          <w:kern w:val="2"/>
+          <w:sz w:val="21"/>
+          <w:szCs w:val="21"/>
+        </w:rPr>
+        <w:t>-</w:t>
+      </w:r>
+      <w:r>
+        <w:rPr>
+          <w:rFonts w:ascii="Calibri" w:eastAsia="DengXian" w:hAnsi="Calibri" w:cs="Calibri"/>
+          <w:iCs/>
+          <w:kern w:val="2"/>
+          <w:sz w:val="21"/>
+          <w:szCs w:val="21"/>
+        </w:rPr>
+        <w:t>author</w:t>
+      </w:r>
+      <w:r>
+        <w:rPr>
+          <w:rFonts w:ascii="Calibri" w:eastAsia="DengXian" w:hAnsi="Calibri" w:cs="Calibri"/>
+          <w:iCs/>
+          <w:kern w:val="2"/>
+          <w:sz w:val="21"/>
+          <w:szCs w:val="21"/>
+        </w:rPr>
+        <w:t xml:space="preserve"> </w:t>
+      </w:r>
+      <w:r>
+        <w:rPr>
+          <w:rFonts w:ascii="Calibri" w:eastAsia="DengXian" w:hAnsi="Calibri" w:cs="Calibri"/>
+          <w:bCs/>
+          <w:iCs/>
+          <w:kern w:val="2"/>
+          <w:sz w:val="21"/>
+          <w:szCs w:val="21"/>
+        </w:rPr>
+        <w:t>paper</w:t>
+      </w:r>
+      <w:r>
+        <w:rPr>
+          <w:rFonts w:ascii="Calibri" w:eastAsia="DengXian" w:hAnsi="Calibri" w:cs="Calibri"/>
+          <w:iCs/>
+          <w:kern w:val="2"/>
+          <w:sz w:val="21"/>
+          <w:szCs w:val="21"/>
+        </w:rPr>
+        <w:t xml:space="preserve">, </w:t>
+      </w:r>
+      <w:r>
+        <w:rPr>
+          <w:rFonts w:ascii="Calibri" w:eastAsia="DengXian" w:hAnsi="Calibri" w:cs="Calibri"/>
+          <w:i/>
+          <w:kern w:val="2"/>
+          <w:sz w:val="21"/>
+          <w:szCs w:val="21"/>
+        </w:rPr>
+        <w:t>Nature Sustainability</w:t>
+      </w:r>
+      <w:r>
+        <w:rPr>
+          <w:rFonts w:ascii="Calibri" w:eastAsia="DengXian" w:hAnsi="Calibri" w:cs="Calibri"/>
+          <w:iCs/>
+          <w:kern w:val="2"/>
+          <w:sz w:val="21"/>
+          <w:szCs w:val="21"/>
+        </w:rPr>
+        <w:t>, in peer review.)</w:t>
       </w:r>
     </w:p>
     <w:p>
@@ -713,7 +1410,7 @@
           <w:tab w:val="num" w:pos="720"/>
         </w:tabs>
         <w:snapToGrid w:val="0"/>
-        <w:spacing w:afterLines="40" w:after="96" w:line="300" w:lineRule="auto"/>
+        <w:spacing w:afterLines="40" w:after="96" w:line="276" w:lineRule="auto"/>
         <w:ind w:left="216" w:hanging="216"/>
         <w:rPr>
           <w:rFonts w:ascii="Calibri" w:eastAsia="DengXian" w:hAnsi="Calibri" w:cs="Calibri"/>
@@ -724,28 +1421,252 @@
           <w:szCs w:val="21"/>
         </w:rPr>
       </w:pPr>
-      <w:r>
-        <w:rPr>
-          <w:rFonts w:ascii="Calibri" w:eastAsia="DengXian" w:hAnsi="Calibri" w:cs="Calibri"/>
-          <w:b/>
-          <w:bCs/>
-          <w:iCs/>
-          <w:kern w:val="2"/>
-          <w:sz w:val="21"/>
-          <w:szCs w:val="21"/>
-        </w:rPr>
-        <w:t>Invented an automated DNA feedstock extraction platform</w:t>
-      </w:r>
-      <w:r>
-        <w:rPr>
-          <w:rFonts w:ascii="Calibri" w:eastAsia="DengXian" w:hAnsi="Calibri" w:cs="Calibri"/>
-          <w:bCs/>
-          <w:iCs/>
-          <w:kern w:val="2"/>
-          <w:sz w:val="21"/>
-          <w:szCs w:val="21"/>
-        </w:rPr>
-        <w:t xml:space="preserve"> inspired by espresso machines, delivering ~200 mg DNA per pod and reducing production cost by ~91%.</w:t>
+      <w:bookmarkStart w:id="4" w:name="OLE_LINK38"/>
+      <w:r>
+        <w:rPr>
+          <w:rFonts w:ascii="Calibri" w:eastAsia="DengXian" w:hAnsi="Calibri" w:cs="Calibri"/>
+          <w:b/>
+          <w:bCs/>
+          <w:iCs/>
+          <w:kern w:val="2"/>
+          <w:sz w:val="21"/>
+          <w:szCs w:val="21"/>
+        </w:rPr>
+        <w:t>Developed biomass DNA biopolymer hydrogels with thermal, photochemical, and ionic crosslinking</w:t>
+      </w:r>
+      <w:r>
+        <w:rPr>
+          <w:rFonts w:ascii="Calibri" w:eastAsia="DengXian" w:hAnsi="Calibri" w:cs="Calibri"/>
+          <w:bCs/>
+          <w:iCs/>
+          <w:kern w:val="2"/>
+          <w:sz w:val="21"/>
+          <w:szCs w:val="21"/>
+        </w:rPr>
+        <w:t xml:space="preserve"> from a low-cost feedstock; produced thermoreversible </w:t>
+      </w:r>
+      <w:r>
+        <w:rPr>
+          <w:rFonts w:ascii="Calibri" w:eastAsia="DengXian" w:hAnsi="Calibri" w:cs="Calibri"/>
+          <w:bCs/>
+          <w:iCs/>
+          <w:kern w:val="2"/>
+          <w:sz w:val="21"/>
+          <w:szCs w:val="21"/>
+        </w:rPr>
+        <w:t>physical cross-linked</w:t>
+      </w:r>
+      <w:r>
+        <w:rPr>
+          <w:rFonts w:ascii="Calibri" w:eastAsia="DengXian" w:hAnsi="Calibri" w:cs="Calibri"/>
+          <w:bCs/>
+          <w:iCs/>
+          <w:kern w:val="2"/>
+          <w:sz w:val="21"/>
+          <w:szCs w:val="21"/>
+        </w:rPr>
+        <w:t xml:space="preserve"> </w:t>
+      </w:r>
+      <w:r>
+        <w:rPr>
+          <w:rFonts w:ascii="Calibri" w:eastAsia="DengXian" w:hAnsi="Calibri" w:cs="Calibri"/>
+          <w:bCs/>
+          <w:iCs/>
+          <w:kern w:val="2"/>
+          <w:sz w:val="21"/>
+          <w:szCs w:val="21"/>
+        </w:rPr>
+        <w:t>hydro</w:t>
+      </w:r>
+      <w:r>
+        <w:rPr>
+          <w:rFonts w:ascii="Calibri" w:eastAsia="DengXian" w:hAnsi="Calibri" w:cs="Calibri"/>
+          <w:bCs/>
+          <w:iCs/>
+          <w:kern w:val="2"/>
+          <w:sz w:val="21"/>
+          <w:szCs w:val="21"/>
+        </w:rPr>
+        <w:t>gels, photo-cleavable covalent</w:t>
+      </w:r>
+      <w:r>
+        <w:rPr>
+          <w:rFonts w:ascii="Calibri" w:eastAsia="DengXian" w:hAnsi="Calibri" w:cs="Calibri"/>
+          <w:bCs/>
+          <w:iCs/>
+          <w:kern w:val="2"/>
+          <w:sz w:val="21"/>
+          <w:szCs w:val="21"/>
+        </w:rPr>
+        <w:t xml:space="preserve"> </w:t>
+      </w:r>
+      <w:bookmarkStart w:id="5" w:name="OLE_LINK47"/>
+      <w:r>
+        <w:rPr>
+          <w:rFonts w:ascii="Calibri" w:eastAsia="DengXian" w:hAnsi="Calibri" w:cs="Calibri"/>
+          <w:bCs/>
+          <w:iCs/>
+          <w:kern w:val="2"/>
+          <w:sz w:val="21"/>
+          <w:szCs w:val="21"/>
+        </w:rPr>
+        <w:t>cross-linked</w:t>
+      </w:r>
+      <w:r>
+        <w:rPr>
+          <w:rFonts w:ascii="Calibri" w:eastAsia="DengXian" w:hAnsi="Calibri" w:cs="Calibri"/>
+          <w:bCs/>
+          <w:iCs/>
+          <w:kern w:val="2"/>
+          <w:sz w:val="21"/>
+          <w:szCs w:val="21"/>
+        </w:rPr>
+        <w:t xml:space="preserve"> </w:t>
+      </w:r>
+      <w:bookmarkEnd w:id="5"/>
+      <w:r>
+        <w:rPr>
+          <w:rFonts w:ascii="Calibri" w:eastAsia="DengXian" w:hAnsi="Calibri" w:cs="Calibri"/>
+          <w:bCs/>
+          <w:iCs/>
+          <w:kern w:val="2"/>
+          <w:sz w:val="21"/>
+          <w:szCs w:val="21"/>
+        </w:rPr>
+        <w:t>hydroge</w:t>
+      </w:r>
+      <w:r>
+        <w:rPr>
+          <w:rFonts w:ascii="Calibri" w:eastAsia="DengXian" w:hAnsi="Calibri" w:cs="Calibri"/>
+          <w:bCs/>
+          <w:iCs/>
+          <w:kern w:val="2"/>
+          <w:sz w:val="21"/>
+          <w:szCs w:val="21"/>
+        </w:rPr>
+        <w:t>l</w:t>
+      </w:r>
+      <w:r>
+        <w:rPr>
+          <w:rFonts w:ascii="Calibri" w:eastAsia="DengXian" w:hAnsi="Calibri" w:cs="Calibri"/>
+          <w:bCs/>
+          <w:iCs/>
+          <w:kern w:val="2"/>
+          <w:sz w:val="21"/>
+          <w:szCs w:val="21"/>
+        </w:rPr>
+        <w:t>, and instantaneously gelling ionic</w:t>
+      </w:r>
+      <w:r>
+        <w:rPr>
+          <w:rFonts w:ascii="Calibri" w:eastAsia="DengXian" w:hAnsi="Calibri" w:cs="Calibri"/>
+          <w:bCs/>
+          <w:iCs/>
+          <w:kern w:val="2"/>
+          <w:sz w:val="21"/>
+          <w:szCs w:val="21"/>
+        </w:rPr>
+        <w:t xml:space="preserve"> </w:t>
+      </w:r>
+      <w:r>
+        <w:rPr>
+          <w:rFonts w:ascii="Calibri" w:eastAsia="DengXian" w:hAnsi="Calibri" w:cs="Calibri"/>
+          <w:bCs/>
+          <w:iCs/>
+          <w:kern w:val="2"/>
+          <w:sz w:val="21"/>
+          <w:szCs w:val="21"/>
+        </w:rPr>
+        <w:t>cross-linked</w:t>
+      </w:r>
+      <w:r>
+        <w:rPr>
+          <w:rFonts w:ascii="Calibri" w:eastAsia="DengXian" w:hAnsi="Calibri" w:cs="Calibri"/>
+          <w:bCs/>
+          <w:iCs/>
+          <w:kern w:val="2"/>
+          <w:sz w:val="21"/>
+          <w:szCs w:val="21"/>
+        </w:rPr>
+        <w:t xml:space="preserve"> hydrogels. Characterized gelation behavior, viscoelasticity, and fracture properties across 182 formulations by oscillatory rheometry, Instron tensile testing, and gravimetric swelling. </w:t>
+      </w:r>
+      <w:r>
+        <w:rPr>
+          <w:rFonts w:ascii="Calibri" w:eastAsia="DengXian" w:hAnsi="Calibri" w:cs="Calibri"/>
+          <w:bCs/>
+          <w:iCs/>
+          <w:kern w:val="2"/>
+          <w:sz w:val="21"/>
+          <w:szCs w:val="21"/>
+        </w:rPr>
+        <w:lastRenderedPageBreak/>
+        <w:t xml:space="preserve">Demonstrated extrusion-based 3D printing and vascular self-healing in ceramic tile composites. </w:t>
+      </w:r>
+      <w:r>
+        <w:rPr>
+          <w:rFonts w:ascii="Calibri" w:eastAsia="DengXian" w:hAnsi="Calibri" w:cs="Calibri"/>
+          <w:bCs/>
+          <w:iCs/>
+          <w:kern w:val="2"/>
+          <w:sz w:val="21"/>
+          <w:szCs w:val="21"/>
+        </w:rPr>
+        <w:t>(F</w:t>
+      </w:r>
+      <w:r>
+        <w:rPr>
+          <w:rFonts w:ascii="Calibri" w:eastAsia="DengXian" w:hAnsi="Calibri" w:cs="Calibri"/>
+          <w:bCs/>
+          <w:iCs/>
+          <w:kern w:val="2"/>
+          <w:sz w:val="21"/>
+          <w:szCs w:val="21"/>
+        </w:rPr>
+        <w:t>irst-author</w:t>
+      </w:r>
+      <w:r>
+        <w:rPr>
+          <w:rFonts w:ascii="Calibri" w:eastAsia="DengXian" w:hAnsi="Calibri" w:cs="Calibri"/>
+          <w:bCs/>
+          <w:iCs/>
+          <w:kern w:val="2"/>
+          <w:sz w:val="21"/>
+          <w:szCs w:val="21"/>
+        </w:rPr>
+        <w:t xml:space="preserve"> paper</w:t>
+      </w:r>
+      <w:r>
+        <w:rPr>
+          <w:rFonts w:ascii="Calibri" w:eastAsia="DengXian" w:hAnsi="Calibri" w:cs="Calibri"/>
+          <w:bCs/>
+          <w:iCs/>
+          <w:kern w:val="2"/>
+          <w:sz w:val="21"/>
+          <w:szCs w:val="21"/>
+        </w:rPr>
+        <w:t xml:space="preserve">, </w:t>
+      </w:r>
+      <w:r>
+        <w:rPr>
+          <w:rFonts w:ascii="Calibri" w:eastAsia="DengXian" w:hAnsi="Calibri" w:cs="Calibri"/>
+          <w:bCs/>
+          <w:i/>
+          <w:kern w:val="2"/>
+          <w:sz w:val="21"/>
+          <w:szCs w:val="21"/>
+        </w:rPr>
+        <w:t>ACADIA</w:t>
+      </w:r>
+      <w:r>
+        <w:rPr>
+          <w:rFonts w:ascii="Calibri" w:eastAsia="DengXian" w:hAnsi="Calibri" w:cs="Calibri"/>
+          <w:bCs/>
+          <w:iCs/>
+          <w:kern w:val="2"/>
+          <w:sz w:val="21"/>
+          <w:szCs w:val="21"/>
+        </w:rPr>
+        <w:t>, 2024).</w:t>
       </w:r>
     </w:p>
     <w:p>
@@ -758,78 +1679,254 @@
           <w:tab w:val="num" w:pos="720"/>
         </w:tabs>
         <w:snapToGrid w:val="0"/>
-        <w:spacing w:after="240" w:line="300" w:lineRule="auto"/>
+        <w:spacing w:after="120" w:line="276" w:lineRule="auto"/>
         <w:ind w:left="216" w:hanging="216"/>
         <w:rPr>
           <w:rFonts w:ascii="Calibri" w:eastAsia="DengXian" w:hAnsi="Calibri" w:cs="Calibri"/>
-          <w:bCs/>
-          <w:iCs/>
-          <w:kern w:val="2"/>
-          <w:sz w:val="21"/>
-          <w:szCs w:val="21"/>
-        </w:rPr>
-      </w:pPr>
-      <w:r>
-        <w:rPr>
-          <w:rFonts w:ascii="Calibri" w:eastAsia="DengXian" w:hAnsi="Calibri" w:cs="Calibri"/>
-          <w:b/>
-          <w:bCs/>
-          <w:iCs/>
-          <w:kern w:val="2"/>
-          <w:sz w:val="21"/>
-          <w:szCs w:val="21"/>
-        </w:rPr>
-        <w:t>Mentored 3 undergraduate researchers and co-instructed Design and Analysis of Biomaterials</w:t>
-      </w:r>
-      <w:r>
-        <w:rPr>
-          <w:rFonts w:ascii="Calibri" w:eastAsia="DengXian" w:hAnsi="Calibri" w:cs="Calibri"/>
-          <w:bCs/>
-          <w:iCs/>
-          <w:kern w:val="2"/>
-          <w:sz w:val="21"/>
-          <w:szCs w:val="21"/>
-        </w:rPr>
-        <w:t xml:space="preserve"> (~50% of content, ~45 students): designed a 6-lecture AI tooling module and organized a 40-student Biomaterials Hackathon with structured deliverables and oral defense format. Guest lecturer on computational workflows for 2 additional courses; teaching assistant across 7 engineering courses total.</w:t>
+          <w:iCs/>
+          <w:kern w:val="2"/>
+          <w:sz w:val="21"/>
+          <w:szCs w:val="21"/>
+        </w:rPr>
+      </w:pPr>
+      <w:bookmarkStart w:id="6" w:name="OLE_LINK42"/>
+      <w:bookmarkEnd w:id="4"/>
+      <w:r>
+        <w:rPr>
+          <w:rFonts w:ascii="Calibri" w:eastAsia="DengXian" w:hAnsi="Calibri" w:cs="Calibri"/>
+          <w:b/>
+          <w:bCs/>
+          <w:iCs/>
+          <w:kern w:val="2"/>
+          <w:sz w:val="21"/>
+          <w:szCs w:val="21"/>
+        </w:rPr>
+        <w:t>Established perfluorocarbon as a high-capacity DNA/RNA capture medium</w:t>
+      </w:r>
+      <w:r>
+        <w:rPr>
+          <w:rFonts w:ascii="Calibri" w:eastAsia="DengXian" w:hAnsi="Calibri" w:cs="Calibri"/>
+          <w:iCs/>
+          <w:kern w:val="2"/>
+          <w:sz w:val="21"/>
+          <w:szCs w:val="21"/>
+        </w:rPr>
+        <w:t xml:space="preserve"> in a pod-based continuous-flow extraction platform; achieved 41.73 µg/µL adsorption capacity (800 times that of silica-based </w:t>
+      </w:r>
+      <w:r>
+        <w:rPr>
+          <w:rFonts w:ascii="Calibri" w:eastAsia="DengXian" w:hAnsi="Calibri" w:cs="Calibri"/>
+          <w:iCs/>
+          <w:kern w:val="2"/>
+          <w:sz w:val="21"/>
+          <w:szCs w:val="21"/>
+        </w:rPr>
+        <w:t xml:space="preserve">conventional </w:t>
+      </w:r>
+      <w:r>
+        <w:rPr>
+          <w:rFonts w:ascii="Calibri" w:eastAsia="DengXian" w:hAnsi="Calibri" w:cs="Calibri"/>
+          <w:iCs/>
+          <w:kern w:val="2"/>
+          <w:sz w:val="21"/>
+          <w:szCs w:val="21"/>
+        </w:rPr>
+        <w:t>methods), translating to ~209 mg DNA loading per pod with over 90% capture efficiency. Reduced projected consumables cost by ~91% compared with conventional ethanol-based method.</w:t>
       </w:r>
     </w:p>
     <w:p>
       <w:pPr>
-        <w:spacing w:after="0"/>
-      </w:pPr>
-      <w:r>
-        <w:rPr>
-          <w:rFonts w:ascii="Calibri" w:eastAsia="DengXian" w:hAnsi="Calibri" w:cs="Calibri"/>
-          <w:b/>
-          <w:bCs/>
-          <w:kern w:val="2"/>
-          <w:sz w:val="21"/>
-          <w:szCs w:val="21"/>
-        </w:rPr>
-        <w:t>Undergraduate Research Assistant &amp; Senior Research Assistant</w:t>
-      </w:r>
-      <w:r>
-        <w:rPr>
-          <w:rFonts w:ascii="Calibri" w:eastAsia="DengXian" w:hAnsi="Calibri" w:cs="Calibri"/>
-          <w:kern w:val="2"/>
-          <w:sz w:val="21"/>
-          <w:szCs w:val="21"/>
-        </w:rPr>
-        <w:t xml:space="preserve">  |  Kowloon, Hong Kong</w:t>
+        <w:numPr>
+          <w:ilvl w:val="0"/>
+          <w:numId w:val="9"/>
+        </w:numPr>
+        <w:tabs>
+          <w:tab w:val="num" w:pos="720"/>
+        </w:tabs>
+        <w:snapToGrid w:val="0"/>
+        <w:spacing w:after="240" w:line="276" w:lineRule="auto"/>
+        <w:ind w:left="216" w:hanging="216"/>
+        <w:rPr>
+          <w:rFonts w:ascii="Calibri" w:eastAsia="DengXian" w:hAnsi="Calibri" w:cs="Calibri"/>
+          <w:bCs/>
+          <w:iCs/>
+          <w:kern w:val="2"/>
+          <w:sz w:val="21"/>
+          <w:szCs w:val="21"/>
+        </w:rPr>
+      </w:pPr>
+      <w:bookmarkStart w:id="7" w:name="OLE_LINK43"/>
+      <w:bookmarkEnd w:id="6"/>
+      <w:r>
+        <w:rPr>
+          <w:rFonts w:ascii="Calibri" w:eastAsia="DengXian" w:hAnsi="Calibri" w:cs="Calibri"/>
+          <w:b/>
+          <w:iCs/>
+          <w:kern w:val="2"/>
+          <w:sz w:val="21"/>
+          <w:szCs w:val="21"/>
+        </w:rPr>
+        <w:t xml:space="preserve">Co-instructed </w:t>
+      </w:r>
+      <w:r>
+        <w:rPr>
+          <w:rFonts w:ascii="Calibri" w:eastAsia="DengXian" w:hAnsi="Calibri" w:cs="Calibri"/>
+          <w:b/>
+          <w:iCs/>
+          <w:kern w:val="2"/>
+          <w:sz w:val="21"/>
+          <w:szCs w:val="21"/>
+        </w:rPr>
+        <w:t>b</w:t>
+      </w:r>
+      <w:r>
+        <w:rPr>
+          <w:rFonts w:ascii="Calibri" w:eastAsia="DengXian" w:hAnsi="Calibri" w:cs="Calibri"/>
+          <w:b/>
+          <w:iCs/>
+          <w:kern w:val="2"/>
+          <w:sz w:val="21"/>
+          <w:szCs w:val="21"/>
+        </w:rPr>
+        <w:t>iomaterials</w:t>
+      </w:r>
+      <w:r>
+        <w:rPr>
+          <w:rFonts w:ascii="Calibri" w:eastAsia="DengXian" w:hAnsi="Calibri" w:cs="Calibri"/>
+          <w:b/>
+          <w:iCs/>
+          <w:kern w:val="2"/>
+          <w:sz w:val="21"/>
+          <w:szCs w:val="21"/>
+        </w:rPr>
+        <w:t xml:space="preserve"> </w:t>
+      </w:r>
+      <w:r>
+        <w:rPr>
+          <w:rFonts w:ascii="Calibri" w:eastAsia="DengXian" w:hAnsi="Calibri" w:cs="Calibri"/>
+          <w:b/>
+          <w:iCs/>
+          <w:kern w:val="2"/>
+          <w:sz w:val="21"/>
+          <w:szCs w:val="21"/>
+        </w:rPr>
+        <w:t>c</w:t>
+      </w:r>
+      <w:r>
+        <w:rPr>
+          <w:rFonts w:ascii="Calibri" w:eastAsia="DengXian" w:hAnsi="Calibri" w:cs="Calibri"/>
+          <w:b/>
+          <w:iCs/>
+          <w:kern w:val="2"/>
+          <w:sz w:val="21"/>
+          <w:szCs w:val="21"/>
+        </w:rPr>
+        <w:t>la</w:t>
+      </w:r>
+      <w:r>
+        <w:rPr>
+          <w:rFonts w:ascii="Calibri" w:eastAsia="DengXian" w:hAnsi="Calibri" w:cs="Calibri"/>
+          <w:b/>
+          <w:iCs/>
+          <w:kern w:val="2"/>
+          <w:sz w:val="21"/>
+          <w:szCs w:val="21"/>
+        </w:rPr>
+        <w:t>sses</w:t>
+      </w:r>
+      <w:r>
+        <w:rPr>
+          <w:rFonts w:ascii="Calibri" w:eastAsia="DengXian" w:hAnsi="Calibri" w:cs="Calibri"/>
+          <w:b/>
+          <w:iCs/>
+          <w:kern w:val="2"/>
+          <w:sz w:val="21"/>
+          <w:szCs w:val="21"/>
+        </w:rPr>
+        <w:t xml:space="preserve"> and mentored 3 undergraduate researchers</w:t>
+      </w:r>
+      <w:r>
+        <w:rPr>
+          <w:rFonts w:ascii="Calibri" w:eastAsia="DengXian" w:hAnsi="Calibri" w:cs="Calibri"/>
+          <w:bCs/>
+          <w:iCs/>
+          <w:kern w:val="2"/>
+          <w:sz w:val="21"/>
+          <w:szCs w:val="21"/>
+        </w:rPr>
+        <w:t xml:space="preserve">; designed a 6-lecture computational tooling module integrating AI-assisted analysis into biomaterials workflows and organized a Biomaterials Hackathon. Teaching assistant across 7 engineering courses total. </w:t>
+      </w:r>
+      <w:r>
+        <w:rPr>
+          <w:rFonts w:ascii="Calibri" w:eastAsia="DengXian" w:hAnsi="Calibri" w:cs="Calibri"/>
+          <w:bCs/>
+          <w:i/>
+          <w:kern w:val="2"/>
+          <w:sz w:val="21"/>
+          <w:szCs w:val="21"/>
+        </w:rPr>
+        <w:t>Cornell CALS Outstanding Teaching Assistant Award.</w:t>
+      </w:r>
+    </w:p>
+    <w:bookmarkEnd w:id="7"/>
+    <w:p>
+      <w:pPr>
+        <w:tabs>
+          <w:tab w:val="right" w:pos="10224"/>
+        </w:tabs>
+        <w:spacing w:before="80" w:after="0"/>
+        <w:rPr>
+          <w:rFonts w:ascii="Calibri" w:hAnsi="Calibri" w:cs="Calibri"/>
+        </w:rPr>
+      </w:pPr>
+      <w:r>
+        <w:rPr>
+          <w:rFonts w:ascii="Calibri" w:eastAsia="Calibri" w:hAnsi="Calibri" w:cs="Calibri"/>
+          <w:b/>
+          <w:bCs/>
+          <w:color w:val="1A3A5C"/>
+          <w:sz w:val="21"/>
+          <w:szCs w:val="21"/>
+        </w:rPr>
+        <w:t>Senior Research Assistant &amp; Undergraduate Research Assistant</w:t>
+      </w:r>
+      <w:r>
+        <w:rPr>
+          <w:rFonts w:ascii="Calibri" w:eastAsia="Calibri" w:hAnsi="Calibri" w:cs="Calibri"/>
+        </w:rPr>
+        <w:tab/>
+      </w:r>
+      <w:r>
+        <w:rPr>
+          <w:rFonts w:ascii="Calibri" w:eastAsia="Calibri" w:hAnsi="Calibri" w:cs="Calibri"/>
+          <w:i/>
+          <w:iCs/>
+          <w:color w:val="555555"/>
+          <w:sz w:val="20"/>
+          <w:szCs w:val="20"/>
+        </w:rPr>
+        <w:t>Jun 2017 - Jan 2021</w:t>
       </w:r>
     </w:p>
     <w:p>
       <w:pPr>
-        <w:spacing w:after="0"/>
-      </w:pPr>
-      <w:r>
-        <w:rPr>
-          <w:rFonts w:ascii="Calibri" w:eastAsia="DengXian" w:hAnsi="Calibri" w:cs="Calibri"/>
-          <w:kern w:val="2"/>
-          <w:sz w:val="22"/>
-          <w:szCs w:val="22"/>
-        </w:rPr>
-        <w:t>Hong Kong Baptist University  |  Jun 2017 - Aug 2019 &amp; Oct 2020 - Jan 2021</w:t>
+        <w:spacing w:after="40"/>
+        <w:rPr>
+          <w:rFonts w:ascii="Calibri" w:hAnsi="Calibri" w:cs="Calibri"/>
+          <w:sz w:val="28"/>
+          <w:szCs w:val="28"/>
+        </w:rPr>
+      </w:pPr>
+      <w:r>
+        <w:rPr>
+          <w:rFonts w:ascii="Calibri" w:eastAsia="Calibri" w:hAnsi="Calibri" w:cs="Calibri"/>
+          <w:i/>
+          <w:iCs/>
+          <w:color w:val="555555"/>
+          <w:sz w:val="20"/>
+          <w:szCs w:val="20"/>
+        </w:rPr>
+        <w:t>Microfabrication &amp; Surface Materials Lab, Supervisor: Prof. Kangning Ren  |  Hong Kong Baptist University</w:t>
       </w:r>
     </w:p>
     <w:p>
@@ -842,7 +1939,7 @@
           <w:tab w:val="num" w:pos="720"/>
         </w:tabs>
         <w:snapToGrid w:val="0"/>
-        <w:spacing w:afterLines="40" w:after="96" w:line="300" w:lineRule="auto"/>
+        <w:spacing w:afterLines="40" w:after="96" w:line="276" w:lineRule="auto"/>
         <w:ind w:left="216" w:hanging="216"/>
         <w:rPr>
           <w:rFonts w:ascii="Calibri" w:eastAsia="DengXian" w:hAnsi="Calibri" w:cs="Calibri"/>
@@ -857,81 +1954,206 @@
         <w:rPr>
           <w:rFonts w:ascii="Calibri" w:eastAsia="DengXian" w:hAnsi="Calibri" w:cs="Calibri"/>
           <w:b/>
-          <w:bCs/>
-          <w:iCs/>
-          <w:kern w:val="2"/>
-          <w:sz w:val="21"/>
-          <w:szCs w:val="21"/>
-        </w:rPr>
-        <w:t>Engineered durable monolithic perfluoropolymer superhydrophobic surfaces</w:t>
-      </w:r>
-      <w:r>
-        <w:rPr>
-          <w:rFonts w:ascii="Calibri" w:eastAsia="DengXian" w:hAnsi="Calibri" w:cs="Calibri"/>
-          <w:bCs/>
-          <w:iCs/>
-          <w:kern w:val="2"/>
-          <w:sz w:val="21"/>
-          <w:szCs w:val="21"/>
-        </w:rPr>
-        <w:t xml:space="preserve"> by replicating hierarchical nano-micro topologies via thermal imprinting with master molds from photolithography, two-photon lithography, and etching; validated superwettability and ultradurability across self-cleaning, chemical, thermal, and mechanical stress testing. (3rd-author paper, The Innovation IF 33.2; US Patent 11,839,998).</w:t>
+          <w:iCs/>
+          <w:kern w:val="2"/>
+          <w:sz w:val="21"/>
+          <w:szCs w:val="21"/>
+        </w:rPr>
+        <w:t>Engineered monolithic perfluoropolymer superhydrophobic surfaces</w:t>
+      </w:r>
+      <w:r>
+        <w:rPr>
+          <w:rFonts w:ascii="Calibri" w:eastAsia="DengXian" w:hAnsi="Calibri" w:cs="Calibri"/>
+          <w:bCs/>
+          <w:iCs/>
+          <w:kern w:val="2"/>
+          <w:sz w:val="21"/>
+          <w:szCs w:val="21"/>
+        </w:rPr>
+        <w:t xml:space="preserve"> via high-temperature soft imprinting and thermal fusion with master molds from photolithography, two-photon lithography, and etching; validated topology-specific superwettability and ultradurability across abrasion, compression, corrosive vapors, UV aging, thermal treatment, and 100,000+ folding cycles. (</w:t>
+      </w:r>
+      <w:r>
+        <w:rPr>
+          <w:rFonts w:ascii="Calibri" w:eastAsia="DengXian" w:hAnsi="Calibri" w:cs="Calibri"/>
+          <w:bCs/>
+          <w:iCs/>
+          <w:kern w:val="2"/>
+          <w:sz w:val="21"/>
+          <w:szCs w:val="21"/>
+        </w:rPr>
+        <w:t>Third</w:t>
+      </w:r>
+      <w:r>
+        <w:rPr>
+          <w:rFonts w:ascii="Calibri" w:eastAsia="DengXian" w:hAnsi="Calibri" w:cs="Calibri"/>
+          <w:bCs/>
+          <w:iCs/>
+          <w:kern w:val="2"/>
+          <w:sz w:val="21"/>
+          <w:szCs w:val="21"/>
+        </w:rPr>
+        <w:t>-author</w:t>
+      </w:r>
+      <w:r>
+        <w:rPr>
+          <w:rFonts w:ascii="Calibri" w:eastAsia="DengXian" w:hAnsi="Calibri" w:cs="Calibri"/>
+          <w:bCs/>
+          <w:iCs/>
+          <w:kern w:val="2"/>
+          <w:sz w:val="21"/>
+          <w:szCs w:val="21"/>
+        </w:rPr>
+        <w:t xml:space="preserve"> paper</w:t>
+      </w:r>
+      <w:r>
+        <w:rPr>
+          <w:rFonts w:ascii="Calibri" w:eastAsia="DengXian" w:hAnsi="Calibri" w:cs="Calibri"/>
+          <w:bCs/>
+          <w:iCs/>
+          <w:kern w:val="2"/>
+          <w:sz w:val="21"/>
+          <w:szCs w:val="21"/>
+        </w:rPr>
+        <w:t xml:space="preserve">, </w:t>
+      </w:r>
+      <w:r>
+        <w:rPr>
+          <w:rFonts w:ascii="Calibri" w:eastAsia="DengXian" w:hAnsi="Calibri" w:cs="Calibri"/>
+          <w:bCs/>
+          <w:i/>
+          <w:kern w:val="2"/>
+          <w:sz w:val="21"/>
+          <w:szCs w:val="21"/>
+        </w:rPr>
+        <w:t>The Innovation</w:t>
+      </w:r>
+      <w:r>
+        <w:rPr>
+          <w:rFonts w:ascii="Calibri" w:eastAsia="DengXian" w:hAnsi="Calibri" w:cs="Calibri"/>
+          <w:bCs/>
+          <w:iCs/>
+          <w:kern w:val="2"/>
+          <w:sz w:val="21"/>
+          <w:szCs w:val="21"/>
+        </w:rPr>
+        <w:t xml:space="preserve"> IF</w:t>
+      </w:r>
+      <w:r>
+        <w:rPr>
+          <w:rFonts w:ascii="Calibri" w:eastAsia="DengXian" w:hAnsi="Calibri" w:cs="Calibri"/>
+          <w:bCs/>
+          <w:iCs/>
+          <w:kern w:val="2"/>
+          <w:sz w:val="21"/>
+          <w:szCs w:val="21"/>
+        </w:rPr>
+        <w:t xml:space="preserve"> = </w:t>
+      </w:r>
+      <w:r>
+        <w:rPr>
+          <w:rFonts w:ascii="Calibri" w:eastAsia="DengXian" w:hAnsi="Calibri" w:cs="Calibri"/>
+          <w:bCs/>
+          <w:iCs/>
+          <w:kern w:val="2"/>
+          <w:sz w:val="21"/>
+          <w:szCs w:val="21"/>
+        </w:rPr>
+        <w:t>33.2; US Patent 11,839,998).</w:t>
       </w:r>
     </w:p>
     <w:p>
       <w:pPr>
         <w:numPr>
           <w:ilvl w:val="0"/>
-          <w:numId w:val="10"/>
+          <w:numId w:val="9"/>
         </w:numPr>
         <w:tabs>
           <w:tab w:val="num" w:pos="720"/>
         </w:tabs>
         <w:snapToGrid w:val="0"/>
-        <w:spacing w:after="240" w:line="300" w:lineRule="auto"/>
+        <w:spacing w:after="240" w:line="276" w:lineRule="auto"/>
         <w:ind w:left="216" w:hanging="216"/>
         <w:rPr>
           <w:rFonts w:ascii="Calibri" w:eastAsia="DengXian" w:hAnsi="Calibri" w:cs="Calibri"/>
-          <w:bCs/>
-          <w:iCs/>
-          <w:kern w:val="2"/>
-          <w:sz w:val="21"/>
-          <w:szCs w:val="21"/>
-        </w:rPr>
-      </w:pPr>
-      <w:r>
-        <w:rPr>
-          <w:rFonts w:ascii="Calibri" w:eastAsia="DengXian" w:hAnsi="Calibri" w:cs="Calibri"/>
-          <w:b/>
-          <w:bCs/>
-          <w:iCs/>
-          <w:kern w:val="2"/>
-          <w:sz w:val="21"/>
-          <w:szCs w:val="21"/>
-        </w:rPr>
-        <w:t>Led an experimental study on static-charge anti-icing,</w:t>
-      </w:r>
-      <w:r>
-        <w:rPr>
-          <w:rFonts w:ascii="Calibri" w:eastAsia="DengXian" w:hAnsi="Calibri" w:cs="Calibri"/>
-          <w:bCs/>
-          <w:iCs/>
-          <w:kern w:val="2"/>
-          <w:sz w:val="21"/>
-          <w:szCs w:val="21"/>
-        </w:rPr>
-        <w:t xml:space="preserve"> demonstrating ~25% reduction in droplet contact time. Received the Best Undergraduate Thesis Award.</w:t>
+          <w:b/>
+          <w:iCs/>
+          <w:kern w:val="2"/>
+          <w:sz w:val="21"/>
+          <w:szCs w:val="21"/>
+        </w:rPr>
+      </w:pPr>
+      <w:r>
+        <w:rPr>
+          <w:rFonts w:ascii="Calibri" w:eastAsia="DengXian" w:hAnsi="Calibri" w:cs="Calibri"/>
+          <w:b/>
+          <w:iCs/>
+          <w:kern w:val="2"/>
+          <w:sz w:val="21"/>
+          <w:szCs w:val="21"/>
+        </w:rPr>
+        <w:t xml:space="preserve">Designed and fabricated an automated </w:t>
+      </w:r>
+      <w:r>
+        <w:rPr>
+          <w:rFonts w:ascii="Calibri" w:eastAsia="DengXian" w:hAnsi="Calibri" w:cs="Calibri"/>
+          <w:b/>
+          <w:iCs/>
+          <w:kern w:val="2"/>
+          <w:sz w:val="21"/>
+          <w:szCs w:val="21"/>
+        </w:rPr>
+        <w:t>weather</w:t>
+      </w:r>
+      <w:r>
+        <w:rPr>
+          <w:rFonts w:ascii="Calibri" w:eastAsia="DengXian" w:hAnsi="Calibri" w:cs="Calibri"/>
+          <w:b/>
+          <w:iCs/>
+          <w:kern w:val="2"/>
+          <w:sz w:val="21"/>
+          <w:szCs w:val="21"/>
+        </w:rPr>
+        <w:t>-environment simulation chamber</w:t>
+      </w:r>
+      <w:r>
+        <w:rPr>
+          <w:rFonts w:ascii="Calibri" w:eastAsia="DengXian" w:hAnsi="Calibri" w:cs="Calibri"/>
+          <w:bCs/>
+          <w:iCs/>
+          <w:kern w:val="2"/>
+          <w:sz w:val="21"/>
+          <w:szCs w:val="21"/>
+        </w:rPr>
+        <w:t xml:space="preserve"> integrating temperature and humidity control, supercooled droplet generation, adjustable droplet parameters, sample-stage cooling, and high-speed monitoring; incorporated an electrostatic surface-charging module to quantify voltage-dependent droplet behavior on superhydrophobic surfaces. Demonstrated ~25% reduction in droplet contact time under charged icing conditions. </w:t>
+      </w:r>
+      <w:r>
+        <w:rPr>
+          <w:rFonts w:ascii="Calibri" w:eastAsia="DengXian" w:hAnsi="Calibri" w:cs="Calibri"/>
+          <w:bCs/>
+          <w:i/>
+          <w:kern w:val="2"/>
+          <w:sz w:val="21"/>
+          <w:szCs w:val="21"/>
+        </w:rPr>
+        <w:t>Best Undergraduate Thesis Award.</w:t>
       </w:r>
     </w:p>
     <w:p>
       <w:pPr>
-        <w:spacing w:after="0"/>
-      </w:pPr>
-      <w:r>
-        <w:rPr>
-          <w:rFonts w:ascii="Calibri" w:eastAsia="DengXian" w:hAnsi="Calibri" w:cs="Calibri"/>
-          <w:b/>
-          <w:bCs/>
-          <w:kern w:val="2"/>
+        <w:tabs>
+          <w:tab w:val="right" w:pos="10224"/>
+        </w:tabs>
+        <w:spacing w:before="80" w:after="0"/>
+        <w:rPr>
+          <w:rFonts w:ascii="Calibri" w:hAnsi="Calibri" w:cs="Calibri"/>
+        </w:rPr>
+      </w:pPr>
+      <w:r>
+        <w:rPr>
+          <w:rFonts w:ascii="Calibri" w:eastAsia="Calibri" w:hAnsi="Calibri" w:cs="Calibri"/>
+          <w:b/>
+          <w:bCs/>
+          <w:color w:val="1A3A5C"/>
           <w:sz w:val="21"/>
           <w:szCs w:val="21"/>
         </w:rPr>
@@ -939,26 +2161,41 @@
       </w:r>
       <w:r>
         <w:rPr>
-          <w:rFonts w:ascii="Calibri" w:eastAsia="DengXian" w:hAnsi="Calibri" w:cs="Calibri"/>
-          <w:kern w:val="2"/>
-          <w:sz w:val="21"/>
-          <w:szCs w:val="21"/>
-        </w:rPr>
-        <w:t xml:space="preserve">  |  Atlanta, GA</w:t>
+          <w:rFonts w:ascii="Calibri" w:eastAsia="Calibri" w:hAnsi="Calibri" w:cs="Calibri"/>
+        </w:rPr>
+        <w:tab/>
+      </w:r>
+      <w:r>
+        <w:rPr>
+          <w:rFonts w:ascii="Calibri" w:eastAsia="Calibri" w:hAnsi="Calibri" w:cs="Calibri"/>
+          <w:i/>
+          <w:iCs/>
+          <w:color w:val="555555"/>
+          <w:sz w:val="20"/>
+          <w:szCs w:val="20"/>
+        </w:rPr>
+        <w:t>Jun 2018 - Aug 2018</w:t>
       </w:r>
     </w:p>
     <w:p>
       <w:pPr>
-        <w:spacing w:after="0"/>
-      </w:pPr>
-      <w:r>
-        <w:rPr>
-          <w:rFonts w:ascii="Calibri" w:eastAsia="DengXian" w:hAnsi="Calibri" w:cs="Calibri"/>
-          <w:kern w:val="2"/>
-          <w:sz w:val="22"/>
-          <w:szCs w:val="22"/>
-        </w:rPr>
-        <w:t>Georgia State University, Molecular Basis of Disease Program  |  Jun 2018 - Aug 2018</w:t>
+        <w:spacing w:after="40"/>
+        <w:rPr>
+          <w:rFonts w:ascii="Calibri" w:hAnsi="Calibri" w:cs="Calibri"/>
+          <w:sz w:val="28"/>
+          <w:szCs w:val="28"/>
+        </w:rPr>
+      </w:pPr>
+      <w:r>
+        <w:rPr>
+          <w:rFonts w:ascii="Calibri" w:eastAsia="Calibri" w:hAnsi="Calibri" w:cs="Calibri"/>
+          <w:i/>
+          <w:iCs/>
+          <w:color w:val="555555"/>
+          <w:sz w:val="20"/>
+          <w:szCs w:val="20"/>
+        </w:rPr>
+        <w:t>Molecular Basis of Disease Program  |  Georgia State University, Atlanta, GA</w:t>
       </w:r>
     </w:p>
     <w:p>
@@ -968,7 +2205,7 @@
           <w:ilvl w:val="0"/>
           <w:numId w:val="10"/>
         </w:numPr>
-        <w:spacing w:line="300" w:lineRule="auto"/>
+        <w:spacing w:line="276" w:lineRule="auto"/>
         <w:ind w:left="216" w:hanging="216"/>
         <w:rPr>
           <w:rFonts w:ascii="Calibri" w:eastAsia="DengXian" w:hAnsi="Calibri" w:cs="Calibri"/>
@@ -998,28 +2235,53 @@
           <w:sz w:val="21"/>
           <w:szCs w:val="21"/>
         </w:rPr>
-        <w:t xml:space="preserve"> using LSPR (localized surface plasmon resonance) assays. Measured how transcription factor PU.1 interacts with DNA, providing insights into sequence-specific binding affinities in real time. Received the Best Poster Presentation Award for this work.</w:t>
+        <w:t xml:space="preserve"> using LSPR (localized surface plasmon resonance) assays. Measured how transcription factor PU.1 interacts with DNA</w:t>
+      </w:r>
+      <w:r>
+        <w:rPr>
+          <w:rFonts w:ascii="Calibri" w:eastAsia="DengXian" w:hAnsi="Calibri" w:cs="Calibri"/>
+          <w:iCs/>
+          <w:kern w:val="2"/>
+          <w:sz w:val="21"/>
+          <w:szCs w:val="21"/>
+        </w:rPr>
+        <w:t xml:space="preserve">. </w:t>
+      </w:r>
+      <w:r>
+        <w:rPr>
+          <w:rFonts w:ascii="Calibri" w:eastAsia="DengXian" w:hAnsi="Calibri" w:cs="Calibri"/>
+          <w:i/>
+          <w:kern w:val="2"/>
+          <w:sz w:val="21"/>
+          <w:szCs w:val="21"/>
+        </w:rPr>
+        <w:t>Best Poster Presentation Award.</w:t>
       </w:r>
     </w:p>
     <w:p>
       <w:pPr>
         <w:widowControl w:val="0"/>
         <w:pBdr>
-          <w:bottom w:val="single" w:sz="4" w:space="1" w:color="auto"/>
+          <w:bottom w:val="single" w:sz="6" w:space="2" w:color="1A3A5C"/>
         </w:pBdr>
-        <w:spacing w:before="240" w:after="0" w:line="240" w:lineRule="auto"/>
-        <w:jc w:val="both"/>
-        <w:rPr>
-          <w:rFonts w:ascii="Calibri" w:eastAsia="DengXian" w:hAnsi="Calibri" w:cs="Calibri"/>
-          <w:b/>
-          <w:kern w:val="2"/>
-        </w:rPr>
-      </w:pPr>
-      <w:r>
-        <w:rPr>
-          <w:rFonts w:ascii="Calibri" w:eastAsia="DengXian" w:hAnsi="Calibri" w:cs="Calibri"/>
-          <w:b/>
-          <w:kern w:val="2"/>
+        <w:spacing w:before="120" w:after="40" w:line="240" w:lineRule="auto"/>
+        <w:rPr>
+          <w:rFonts w:ascii="Calibri" w:eastAsia="Calibri" w:hAnsi="Calibri" w:cs="Calibri"/>
+          <w:b/>
+          <w:bCs/>
+          <w:color w:val="1A3A5C"/>
+          <w:sz w:val="22"/>
+          <w:szCs w:val="22"/>
+        </w:rPr>
+      </w:pPr>
+      <w:r>
+        <w:rPr>
+          <w:rFonts w:ascii="Calibri" w:eastAsia="Calibri" w:hAnsi="Calibri" w:cs="Calibri"/>
+          <w:b/>
+          <w:bCs/>
+          <w:color w:val="1A3A5C"/>
+          <w:sz w:val="22"/>
+          <w:szCs w:val="22"/>
         </w:rPr>
         <w:t>PUBLICATIONS</w:t>
       </w:r>
@@ -1032,24 +2294,24 @@
           <w:numId w:val="6"/>
         </w:numPr>
         <w:snapToGrid w:val="0"/>
-        <w:spacing w:after="120" w:line="300" w:lineRule="auto"/>
+        <w:spacing w:after="80" w:line="276" w:lineRule="auto"/>
         <w:ind w:left="216" w:hanging="216"/>
         <w:contextualSpacing w:val="0"/>
         <w:rPr>
           <w:rFonts w:ascii="Calibri" w:eastAsia="DengXian" w:hAnsi="Calibri" w:cs="Calibri"/>
           <w:iCs/>
           <w:kern w:val="2"/>
-          <w:sz w:val="21"/>
-          <w:szCs w:val="21"/>
-        </w:rPr>
-      </w:pPr>
-      <w:r>
-        <w:rPr>
-          <w:rFonts w:ascii="Calibri" w:eastAsia="DengXian" w:hAnsi="Calibri" w:cs="Calibri"/>
-          <w:iCs/>
-          <w:kern w:val="2"/>
-          <w:sz w:val="21"/>
-          <w:szCs w:val="21"/>
+          <w:sz w:val="20"/>
+          <w:szCs w:val="20"/>
+        </w:rPr>
+      </w:pPr>
+      <w:r>
+        <w:rPr>
+          <w:rFonts w:ascii="Calibri" w:eastAsia="DengXian" w:hAnsi="Calibri" w:cs="Calibri"/>
+          <w:iCs/>
+          <w:kern w:val="2"/>
+          <w:sz w:val="20"/>
+          <w:szCs w:val="20"/>
         </w:rPr>
         <w:t xml:space="preserve">Wang, D., </w:t>
       </w:r>
@@ -1060,8 +2322,8 @@
           <w:bCs/>
           <w:i/>
           <w:kern w:val="2"/>
-          <w:sz w:val="21"/>
-          <w:szCs w:val="21"/>
+          <w:sz w:val="20"/>
+          <w:szCs w:val="20"/>
           <w:u w:val="single"/>
         </w:rPr>
         <w:t>Li, Z.</w:t>
@@ -1071,10 +2333,53 @@
           <w:rFonts w:ascii="Calibri" w:eastAsia="DengXian" w:hAnsi="Calibri" w:cs="Calibri"/>
           <w:iCs/>
           <w:kern w:val="2"/>
-          <w:sz w:val="21"/>
-          <w:szCs w:val="21"/>
-        </w:rPr>
-        <w:t>, Li, J., Han, Y., Sun, T., Li, F., Liu, P. “A Chip Reactor for Perpetual Nucleic Acid Production and On-chip Information Processing.” Nature, under review (2026).</w:t>
+          <w:sz w:val="20"/>
+          <w:szCs w:val="20"/>
+        </w:rPr>
+        <w:t xml:space="preserve">, Li, J., Han, Y., Sun, T., Li, F., Liu, P. </w:t>
+      </w:r>
+      <w:r>
+        <w:rPr>
+          <w:rFonts w:ascii="Calibri" w:eastAsia="DengXian" w:hAnsi="Calibri" w:cs="Calibri"/>
+          <w:i/>
+          <w:iCs/>
+          <w:kern w:val="2"/>
+          <w:sz w:val="20"/>
+          <w:szCs w:val="20"/>
+        </w:rPr>
+        <w:t>"A Chip Reactor for Perpetual Nucleic Acid Production and On-chip Information Processing."</w:t>
+      </w:r>
+      <w:r>
+        <w:rPr>
+          <w:rFonts w:ascii="Calibri" w:eastAsia="DengXian" w:hAnsi="Calibri" w:cs="Calibri"/>
+          <w:iCs/>
+          <w:kern w:val="2"/>
+          <w:sz w:val="20"/>
+          <w:szCs w:val="20"/>
+        </w:rPr>
+        <w:t xml:space="preserve"> </w:t>
+      </w:r>
+      <w:r>
+        <w:rPr>
+          <w:rFonts w:ascii="Calibri" w:eastAsia="DengXian" w:hAnsi="Calibri" w:cs="Calibri"/>
+          <w:b/>
+          <w:bCs/>
+          <w:iCs/>
+          <w:kern w:val="2"/>
+          <w:sz w:val="20"/>
+          <w:szCs w:val="20"/>
+        </w:rPr>
+        <w:t>Nature Sustainability</w:t>
+      </w:r>
+      <w:r>
+        <w:rPr>
+          <w:rFonts w:ascii="Calibri" w:eastAsia="DengXian" w:hAnsi="Calibri" w:cs="Calibri"/>
+          <w:iCs/>
+          <w:kern w:val="2"/>
+          <w:sz w:val="20"/>
+          <w:szCs w:val="20"/>
+        </w:rPr>
+        <w:t>, in peer review (2026).</w:t>
       </w:r>
     </w:p>
     <w:p>
@@ -1085,15 +2390,15 @@
           <w:numId w:val="6"/>
         </w:numPr>
         <w:snapToGrid w:val="0"/>
-        <w:spacing w:after="120" w:line="300" w:lineRule="auto"/>
+        <w:spacing w:after="80" w:line="276" w:lineRule="auto"/>
         <w:ind w:left="216" w:hanging="216"/>
         <w:contextualSpacing w:val="0"/>
         <w:rPr>
           <w:rFonts w:ascii="Calibri" w:eastAsia="DengXian" w:hAnsi="Calibri" w:cs="Calibri"/>
           <w:iCs/>
           <w:kern w:val="2"/>
-          <w:sz w:val="21"/>
-          <w:szCs w:val="21"/>
+          <w:sz w:val="20"/>
+          <w:szCs w:val="20"/>
         </w:rPr>
       </w:pPr>
       <w:r>
@@ -1104,8 +2409,8 @@
           <w:i/>
           <w:iCs/>
           <w:kern w:val="2"/>
-          <w:sz w:val="21"/>
-          <w:szCs w:val="21"/>
+          <w:sz w:val="20"/>
+          <w:szCs w:val="20"/>
           <w:u w:val="single"/>
         </w:rPr>
         <w:t>Li, Z.</w:t>
@@ -1115,31 +2420,64 @@
           <w:rFonts w:ascii="Calibri" w:eastAsia="DengXian" w:hAnsi="Calibri" w:cs="Calibri"/>
           <w:iCs/>
           <w:kern w:val="2"/>
-          <w:sz w:val="21"/>
-          <w:szCs w:val="21"/>
-          <w:u w:val="single"/>
-        </w:rPr>
-        <w:t>,</w:t>
-      </w:r>
-      <w:r>
-        <w:rPr>
-          <w:rFonts w:ascii="Calibri" w:eastAsia="DengXian" w:hAnsi="Calibri" w:cs="Calibri"/>
-          <w:iCs/>
-          <w:kern w:val="2"/>
-          <w:sz w:val="21"/>
-          <w:szCs w:val="21"/>
-        </w:rPr>
-        <w:t xml:space="preserve"> Ramón, C. L., Koeberle, A., et al. “Tracing Environmental DNA Transport in Large Lakes with Synthetic DNA Microparticles and Hydrodynamic Modeling” Environmental Science &amp; Technology (IF = 12.4), (2025). </w:t>
-      </w:r>
-      <w:hyperlink r:id="rId6" w:history="1">
+          <w:sz w:val="20"/>
+          <w:szCs w:val="20"/>
+        </w:rPr>
+        <w:t xml:space="preserve">, Ramón, C. L., Koeberle, A., et al. </w:t>
+      </w:r>
+      <w:r>
+        <w:rPr>
+          <w:rFonts w:ascii="Calibri" w:eastAsia="DengXian" w:hAnsi="Calibri" w:cs="Calibri"/>
+          <w:i/>
+          <w:iCs/>
+          <w:kern w:val="2"/>
+          <w:sz w:val="20"/>
+          <w:szCs w:val="20"/>
+        </w:rPr>
+        <w:t>"Tracing Environmental DNA Transport in Large Lakes with Synthetic DNA Microparticles and Hydrodynamic Modeling"</w:t>
+      </w:r>
+      <w:r>
+        <w:rPr>
+          <w:rFonts w:ascii="Calibri" w:eastAsia="DengXian" w:hAnsi="Calibri" w:cs="Calibri"/>
+          <w:iCs/>
+          <w:kern w:val="2"/>
+          <w:sz w:val="20"/>
+          <w:szCs w:val="20"/>
+        </w:rPr>
+        <w:t xml:space="preserve"> </w:t>
+      </w:r>
+      <w:r>
+        <w:rPr>
+          <w:rFonts w:ascii="Calibri" w:eastAsia="DengXian" w:hAnsi="Calibri" w:cs="Calibri"/>
+          <w:b/>
+          <w:bCs/>
+          <w:iCs/>
+          <w:kern w:val="2"/>
+          <w:sz w:val="20"/>
+          <w:szCs w:val="20"/>
+        </w:rPr>
+        <w:t>Environmental Science &amp; Technology</w:t>
+      </w:r>
+      <w:r>
+        <w:rPr>
+          <w:rFonts w:ascii="Calibri" w:eastAsia="DengXian" w:hAnsi="Calibri" w:cs="Calibri"/>
+          <w:iCs/>
+          <w:kern w:val="2"/>
+          <w:sz w:val="20"/>
+          <w:szCs w:val="20"/>
+        </w:rPr>
+        <w:t xml:space="preserve"> (IF = 12.4), (2025). </w:t>
+      </w:r>
+      <w:hyperlink r:id="rId11" w:history="1">
         <w:r>
           <w:rPr>
             <w:rStyle w:val="Hyperlink"/>
             <w:rFonts w:ascii="Calibri" w:eastAsia="DengXian" w:hAnsi="Calibri" w:cs="Calibri"/>
             <w:iCs/>
             <w:kern w:val="2"/>
-            <w:sz w:val="21"/>
-            <w:szCs w:val="21"/>
+            <w:sz w:val="20"/>
+            <w:szCs w:val="20"/>
+            <w:u w:val="none"/>
           </w:rPr>
           <w:t>DOI</w:t>
         </w:r>
@@ -1153,26 +2491,26 @@
           <w:numId w:val="6"/>
         </w:numPr>
         <w:snapToGrid w:val="0"/>
-        <w:spacing w:after="120" w:line="300" w:lineRule="auto"/>
+        <w:spacing w:after="80" w:line="276" w:lineRule="auto"/>
         <w:ind w:left="216" w:hanging="216"/>
         <w:contextualSpacing w:val="0"/>
         <w:rPr>
           <w:rFonts w:ascii="Calibri" w:eastAsia="DengXian" w:hAnsi="Calibri" w:cs="Calibri"/>
           <w:iCs/>
           <w:kern w:val="2"/>
-          <w:sz w:val="21"/>
-          <w:szCs w:val="21"/>
-        </w:rPr>
-      </w:pPr>
-      <w:r>
-        <w:rPr>
-          <w:rFonts w:ascii="Calibri" w:eastAsia="DengXian" w:hAnsi="Calibri" w:cs="Calibri"/>
-          <w:iCs/>
-          <w:kern w:val="2"/>
-          <w:sz w:val="21"/>
-          <w:szCs w:val="21"/>
-        </w:rPr>
-        <w:t xml:space="preserve">He, C.*, </w:t>
+          <w:sz w:val="20"/>
+          <w:szCs w:val="20"/>
+        </w:rPr>
+      </w:pPr>
+      <w:r>
+        <w:rPr>
+          <w:rFonts w:ascii="Calibri" w:eastAsia="DengXian" w:hAnsi="Calibri" w:cs="Calibri"/>
+          <w:iCs/>
+          <w:kern w:val="2"/>
+          <w:sz w:val="20"/>
+          <w:szCs w:val="20"/>
+        </w:rPr>
+        <w:t xml:space="preserve">He, C., </w:t>
       </w:r>
       <w:r>
         <w:rPr>
@@ -1182,84 +2520,107 @@
           <w:i/>
           <w:iCs/>
           <w:kern w:val="2"/>
-          <w:sz w:val="21"/>
-          <w:szCs w:val="21"/>
+          <w:sz w:val="20"/>
+          <w:szCs w:val="20"/>
           <w:u w:val="single"/>
         </w:rPr>
-        <w:t>Li, Z.*</w:t>
-      </w:r>
-      <w:r>
-        <w:rPr>
-          <w:rFonts w:ascii="Calibri" w:eastAsia="DengXian" w:hAnsi="Calibri" w:cs="Calibri"/>
-          <w:iCs/>
-          <w:kern w:val="2"/>
-          <w:sz w:val="21"/>
-          <w:szCs w:val="21"/>
-          <w:u w:val="single"/>
-        </w:rPr>
-        <w:t>,</w:t>
-      </w:r>
-      <w:r>
-        <w:rPr>
-          <w:rFonts w:ascii="Calibri" w:eastAsia="DengXian" w:hAnsi="Calibri" w:cs="Calibri"/>
-          <w:iCs/>
-          <w:kern w:val="2"/>
-          <w:sz w:val="21"/>
-          <w:szCs w:val="21"/>
-        </w:rPr>
-        <w:t xml:space="preserve"> Wang, L. X., et al. “</w:t>
+        <w:t>Li, Z. (co-first authors)</w:t>
+      </w:r>
+      <w:r>
+        <w:rPr>
+          <w:rFonts w:ascii="Calibri" w:eastAsia="DengXian" w:hAnsi="Calibri" w:cs="Calibri"/>
+          <w:iCs/>
+          <w:kern w:val="2"/>
+          <w:sz w:val="20"/>
+          <w:szCs w:val="20"/>
+        </w:rPr>
+        <w:t xml:space="preserve">, Wang, L. X., et al. </w:t>
       </w:r>
       <w:r>
         <w:rPr>
           <w:rFonts w:ascii="Calibri" w:eastAsia="DengXian" w:hAnsi="Calibri" w:cs="Calibri"/>
           <w:i/>
-          <w:kern w:val="2"/>
-          <w:sz w:val="21"/>
-          <w:szCs w:val="21"/>
+          <w:iCs/>
+          <w:kern w:val="2"/>
+          <w:sz w:val="20"/>
+          <w:szCs w:val="20"/>
+        </w:rPr>
+        <w:t>"</w:t>
+      </w:r>
+      <w:r>
+        <w:rPr>
+          <w:rFonts w:ascii="Calibri" w:eastAsia="DengXian" w:hAnsi="Calibri" w:cs="Calibri"/>
+          <w:i/>
+          <w:kern w:val="2"/>
+          <w:sz w:val="20"/>
+          <w:szCs w:val="20"/>
         </w:rPr>
         <w:t>PolyTile 4.0: Self-healing Ceramic Tiles</w:t>
       </w:r>
       <w:r>
         <w:rPr>
           <w:rFonts w:ascii="Calibri" w:eastAsia="DengXian" w:hAnsi="Calibri" w:cs="Calibri"/>
-          <w:iCs/>
-          <w:kern w:val="2"/>
-          <w:sz w:val="21"/>
-          <w:szCs w:val="21"/>
-        </w:rPr>
-        <w:t>“ ACADIA</w:t>
-      </w:r>
-      <w:r>
-        <w:rPr>
-          <w:rFonts w:ascii="Calibri" w:eastAsia="DengXian" w:hAnsi="Calibri" w:cs="Calibri"/>
-          <w:b/>
-          <w:bCs/>
-          <w:iCs/>
-          <w:kern w:val="2"/>
-          <w:sz w:val="21"/>
-          <w:szCs w:val="21"/>
+          <w:i/>
+          <w:iCs/>
+          <w:kern w:val="2"/>
+          <w:sz w:val="20"/>
+          <w:szCs w:val="20"/>
+        </w:rPr>
+        <w:t>"</w:t>
+      </w:r>
+      <w:r>
+        <w:rPr>
+          <w:rFonts w:ascii="Calibri" w:eastAsia="DengXian" w:hAnsi="Calibri" w:cs="Calibri"/>
+          <w:iCs/>
+          <w:kern w:val="2"/>
+          <w:sz w:val="20"/>
+          <w:szCs w:val="20"/>
         </w:rPr>
         <w:t xml:space="preserve"> </w:t>
       </w:r>
       <w:r>
         <w:rPr>
           <w:rFonts w:ascii="Calibri" w:eastAsia="DengXian" w:hAnsi="Calibri" w:cs="Calibri"/>
-          <w:iCs/>
-          <w:kern w:val="2"/>
-          <w:sz w:val="21"/>
-          <w:szCs w:val="21"/>
+          <w:b/>
+          <w:bCs/>
+          <w:iCs/>
+          <w:kern w:val="2"/>
+          <w:sz w:val="20"/>
+          <w:szCs w:val="20"/>
+        </w:rPr>
+        <w:t>ACADIA</w:t>
+      </w:r>
+      <w:r>
+        <w:rPr>
+          <w:rFonts w:ascii="Calibri" w:eastAsia="DengXian" w:hAnsi="Calibri" w:cs="Calibri"/>
+          <w:bCs/>
+          <w:iCs/>
+          <w:kern w:val="2"/>
+          <w:sz w:val="20"/>
+          <w:szCs w:val="20"/>
+        </w:rPr>
+        <w:t xml:space="preserve"> </w:t>
+      </w:r>
+      <w:r>
+        <w:rPr>
+          <w:rFonts w:ascii="Calibri" w:eastAsia="DengXian" w:hAnsi="Calibri" w:cs="Calibri"/>
+          <w:iCs/>
+          <w:kern w:val="2"/>
+          <w:sz w:val="20"/>
+          <w:szCs w:val="20"/>
         </w:rPr>
         <w:t xml:space="preserve">(2024). </w:t>
       </w:r>
-      <w:hyperlink r:id="rId7" w:history="1">
+      <w:hyperlink r:id="rId12" w:history="1">
         <w:r>
           <w:rPr>
             <w:rStyle w:val="Hyperlink"/>
             <w:rFonts w:ascii="Calibri" w:eastAsia="DengXian" w:hAnsi="Calibri" w:cs="Calibri"/>
             <w:iCs/>
             <w:kern w:val="2"/>
-            <w:sz w:val="21"/>
-            <w:szCs w:val="21"/>
+            <w:sz w:val="20"/>
+            <w:szCs w:val="20"/>
+            <w:u w:val="none"/>
           </w:rPr>
           <w:t>DOI</w:t>
         </w:r>
@@ -1273,25 +2634,25 @@
           <w:numId w:val="6"/>
         </w:numPr>
         <w:snapToGrid w:val="0"/>
-        <w:spacing w:after="120" w:line="300" w:lineRule="auto"/>
+        <w:spacing w:after="80" w:line="276" w:lineRule="auto"/>
         <w:ind w:left="216" w:hanging="216"/>
         <w:contextualSpacing w:val="0"/>
         <w:rPr>
           <w:rFonts w:ascii="Calibri" w:eastAsia="DengXian" w:hAnsi="Calibri" w:cs="Calibri"/>
           <w:iCs/>
           <w:kern w:val="2"/>
-          <w:sz w:val="21"/>
-          <w:szCs w:val="21"/>
-        </w:rPr>
-      </w:pPr>
-      <w:r>
-        <w:rPr>
-          <w:rFonts w:ascii="Calibri" w:eastAsia="DengXian" w:hAnsi="Calibri" w:cs="Calibri"/>
-          <w:bCs/>
-          <w:iCs/>
-          <w:kern w:val="2"/>
-          <w:sz w:val="21"/>
-          <w:szCs w:val="21"/>
+          <w:sz w:val="20"/>
+          <w:szCs w:val="20"/>
+        </w:rPr>
+      </w:pPr>
+      <w:r>
+        <w:rPr>
+          <w:rFonts w:ascii="Calibri" w:eastAsia="DengXian" w:hAnsi="Calibri" w:cs="Calibri"/>
+          <w:bCs/>
+          <w:iCs/>
+          <w:kern w:val="2"/>
+          <w:sz w:val="20"/>
+          <w:szCs w:val="20"/>
         </w:rPr>
         <w:t xml:space="preserve">Li, W., Chan, C. W., </w:t>
       </w:r>
@@ -1302,8 +2663,8 @@
           <w:bCs/>
           <w:i/>
           <w:kern w:val="2"/>
-          <w:sz w:val="21"/>
-          <w:szCs w:val="21"/>
+          <w:sz w:val="20"/>
+          <w:szCs w:val="20"/>
           <w:u w:val="single"/>
         </w:rPr>
         <w:t>Li, Z</w:t>
@@ -1311,11 +2672,13 @@
       <w:r>
         <w:rPr>
           <w:rFonts w:ascii="Calibri" w:eastAsia="DengXian" w:hAnsi="Calibri" w:cs="Calibri"/>
-          <w:bCs/>
-          <w:iCs/>
-          <w:kern w:val="2"/>
-          <w:sz w:val="21"/>
-          <w:szCs w:val="21"/>
+          <w:b/>
+          <w:bCs/>
+          <w:i/>
+          <w:iCs/>
+          <w:kern w:val="2"/>
+          <w:sz w:val="20"/>
+          <w:szCs w:val="20"/>
           <w:u w:val="single"/>
         </w:rPr>
         <w:t>.</w:t>
@@ -1326,30 +2689,52 @@
           <w:bCs/>
           <w:iCs/>
           <w:kern w:val="2"/>
-          <w:sz w:val="21"/>
-          <w:szCs w:val="21"/>
-        </w:rPr>
-        <w:t>, et al. “</w:t>
+          <w:sz w:val="20"/>
+          <w:szCs w:val="20"/>
+        </w:rPr>
+        <w:t xml:space="preserve">, et al. </w:t>
       </w:r>
       <w:r>
         <w:rPr>
           <w:rFonts w:ascii="Calibri" w:eastAsia="DengXian" w:hAnsi="Calibri" w:cs="Calibri"/>
           <w:bCs/>
           <w:i/>
-          <w:kern w:val="2"/>
-          <w:sz w:val="21"/>
-          <w:szCs w:val="21"/>
-        </w:rPr>
-        <w:t xml:space="preserve">All-perfluoropolymer, nonlinear stability-assisted monolithic surface combines topology-specific superwettability with ultradurability.“ </w:t>
-      </w:r>
-      <w:r>
-        <w:rPr>
-          <w:rFonts w:ascii="Calibri" w:eastAsia="DengXian" w:hAnsi="Calibri" w:cs="Calibri"/>
-          <w:bCs/>
-          <w:iCs/>
-          <w:kern w:val="2"/>
-          <w:sz w:val="21"/>
-          <w:szCs w:val="21"/>
+          <w:iCs/>
+          <w:kern w:val="2"/>
+          <w:sz w:val="20"/>
+          <w:szCs w:val="20"/>
+        </w:rPr>
+        <w:t>"</w:t>
+      </w:r>
+      <w:r>
+        <w:rPr>
+          <w:rFonts w:ascii="Calibri" w:eastAsia="DengXian" w:hAnsi="Calibri" w:cs="Calibri"/>
+          <w:bCs/>
+          <w:i/>
+          <w:kern w:val="2"/>
+          <w:sz w:val="20"/>
+          <w:szCs w:val="20"/>
+        </w:rPr>
+        <w:t>All-perfluoropolymer, nonlinear stability-assisted monolithic surface combines topology-specific superwettability with ultradurability."</w:t>
+      </w:r>
+      <w:r>
+        <w:rPr>
+          <w:rFonts w:ascii="Calibri" w:eastAsia="DengXian" w:hAnsi="Calibri" w:cs="Calibri"/>
+          <w:bCs/>
+          <w:kern w:val="2"/>
+          <w:sz w:val="20"/>
+          <w:szCs w:val="20"/>
+        </w:rPr>
+        <w:t xml:space="preserve"> </w:t>
+      </w:r>
+      <w:r>
+        <w:rPr>
+          <w:rFonts w:ascii="Calibri" w:eastAsia="DengXian" w:hAnsi="Calibri" w:cs="Calibri"/>
+          <w:b/>
+          <w:iCs/>
+          <w:kern w:val="2"/>
+          <w:sz w:val="20"/>
+          <w:szCs w:val="20"/>
         </w:rPr>
         <w:t xml:space="preserve">The Innovation </w:t>
       </w:r>
@@ -1357,8 +2742,8 @@
         <w:rPr>
           <w:rFonts w:ascii="Calibri" w:eastAsia="Times New Roman" w:hAnsi="Calibri" w:cs="Calibri"/>
           <w:bCs/>
-          <w:sz w:val="21"/>
-          <w:szCs w:val="21"/>
+          <w:sz w:val="20"/>
+          <w:szCs w:val="20"/>
         </w:rPr>
         <w:t>(IF = 33.2)</w:t>
       </w:r>
@@ -1368,8 +2753,8 @@
           <w:bCs/>
           <w:iCs/>
           <w:kern w:val="2"/>
-          <w:sz w:val="21"/>
-          <w:szCs w:val="21"/>
+          <w:sz w:val="20"/>
+          <w:szCs w:val="20"/>
         </w:rPr>
         <w:t>, 4(2), 100299, (2023).</w:t>
       </w:r>
@@ -1378,20 +2763,21 @@
           <w:rFonts w:ascii="Calibri" w:eastAsia="DengXian" w:hAnsi="Calibri" w:cs="Calibri"/>
           <w:iCs/>
           <w:kern w:val="2"/>
-          <w:sz w:val="21"/>
-          <w:szCs w:val="21"/>
+          <w:sz w:val="20"/>
+          <w:szCs w:val="20"/>
         </w:rPr>
         <w:t xml:space="preserve"> </w:t>
       </w:r>
-      <w:hyperlink r:id="rId8" w:history="1">
+      <w:hyperlink r:id="rId13" w:history="1">
         <w:r>
           <w:rPr>
             <w:rStyle w:val="Hyperlink"/>
             <w:rFonts w:ascii="Calibri" w:eastAsia="DengXian" w:hAnsi="Calibri" w:cs="Calibri"/>
             <w:iCs/>
             <w:kern w:val="2"/>
-            <w:sz w:val="21"/>
-            <w:szCs w:val="21"/>
+            <w:sz w:val="20"/>
+            <w:szCs w:val="20"/>
+            <w:u w:val="none"/>
           </w:rPr>
           <w:t>DOI</w:t>
         </w:r>
@@ -1399,78 +2785,130 @@
     </w:p>
     <w:p>
       <w:pPr>
-        <w:widowControl w:val="0"/>
-        <w:pBdr>
-          <w:bottom w:val="single" w:sz="4" w:space="1" w:color="auto"/>
-        </w:pBdr>
-        <w:spacing w:before="240" w:after="0" w:line="240" w:lineRule="auto"/>
-        <w:jc w:val="both"/>
-        <w:rPr>
-          <w:rFonts w:ascii="Calibri" w:eastAsia="DengXian" w:hAnsi="Calibri" w:cs="Calibri"/>
-          <w:b/>
-          <w:kern w:val="2"/>
-        </w:rPr>
-      </w:pPr>
-      <w:r>
-        <w:rPr>
-          <w:rFonts w:ascii="Calibri" w:eastAsia="DengXian" w:hAnsi="Calibri" w:cs="Calibri"/>
-          <w:b/>
-          <w:kern w:val="2"/>
-        </w:rPr>
-        <w:t>PATENTS</w:t>
-      </w:r>
-    </w:p>
-    <w:p>
-      <w:pPr>
         <w:pStyle w:val="ListParagraph"/>
         <w:numPr>
           <w:ilvl w:val="0"/>
           <w:numId w:val="6"/>
         </w:numPr>
         <w:snapToGrid w:val="0"/>
-        <w:spacing w:before="120" w:after="0" w:line="300" w:lineRule="auto"/>
+        <w:spacing w:after="80" w:line="276" w:lineRule="auto"/>
         <w:ind w:left="216" w:hanging="216"/>
         <w:contextualSpacing w:val="0"/>
         <w:rPr>
           <w:rFonts w:ascii="Calibri" w:eastAsia="DengXian" w:hAnsi="Calibri" w:cs="Calibri"/>
           <w:iCs/>
           <w:kern w:val="2"/>
-          <w:sz w:val="21"/>
-          <w:szCs w:val="21"/>
-        </w:rPr>
-      </w:pPr>
-      <w:r>
-        <w:rPr>
-          <w:rFonts w:ascii="Calibri" w:eastAsia="DengXian" w:hAnsi="Calibri" w:cs="Calibri"/>
-          <w:iCs/>
-          <w:kern w:val="2"/>
-          <w:sz w:val="21"/>
-          <w:szCs w:val="21"/>
-        </w:rPr>
-        <w:t xml:space="preserve">Ren, K., Wu, H., Wang, Z., Yao, S., Ong, B., Li, W., </w:t>
-      </w:r>
-      <w:r>
-        <w:rPr>
-          <w:rFonts w:ascii="Calibri" w:eastAsia="DengXian" w:hAnsi="Calibri" w:cs="Calibri"/>
+          <w:sz w:val="20"/>
+          <w:szCs w:val="20"/>
+        </w:rPr>
+      </w:pPr>
+      <w:r>
+        <w:rPr>
+          <w:rFonts w:ascii="Calibri" w:eastAsia="Calibri" w:hAnsi="Calibri" w:cs="Calibri"/>
           <w:b/>
           <w:bCs/>
           <w:i/>
-          <w:kern w:val="2"/>
-          <w:sz w:val="21"/>
-          <w:szCs w:val="21"/>
+          <w:iCs/>
+          <w:color w:val="111111"/>
+          <w:sz w:val="20"/>
+          <w:szCs w:val="20"/>
           <w:u w:val="single"/>
         </w:rPr>
-        <w:t>Li, Z</w:t>
-      </w:r>
-      <w:r>
-        <w:rPr>
-          <w:rFonts w:ascii="Calibri" w:eastAsia="DengXian" w:hAnsi="Calibri" w:cs="Calibri"/>
-          <w:iCs/>
-          <w:kern w:val="2"/>
-          <w:sz w:val="21"/>
-          <w:szCs w:val="21"/>
-        </w:rPr>
-        <w:t>., Sun, H., &amp; Chan, C.W. “Crack engineering as a new route for the construction of arbitrary hierarchical architectures.” US Patent 11,839,998, (2023).</w:t>
+        <w:t>Li, Z.</w:t>
+      </w:r>
+      <w:r>
+        <w:rPr>
+          <w:rFonts w:ascii="Calibri" w:eastAsia="Calibri" w:hAnsi="Calibri" w:cs="Calibri"/>
+          <w:iCs/>
+          <w:color w:val="111111"/>
+          <w:sz w:val="20"/>
+          <w:szCs w:val="20"/>
+        </w:rPr>
+        <w:t xml:space="preserve">, </w:t>
+      </w:r>
+      <w:r>
+        <w:rPr>
+          <w:rFonts w:ascii="Calibri" w:eastAsia="Calibri" w:hAnsi="Calibri" w:cs="Calibri"/>
+          <w:color w:val="111111"/>
+          <w:sz w:val="20"/>
+          <w:szCs w:val="20"/>
+        </w:rPr>
+        <w:t xml:space="preserve">Liu, Z., Yang, X., Luo, D. </w:t>
+      </w:r>
+      <w:r>
+        <w:rPr>
+          <w:rFonts w:ascii="Calibri" w:eastAsia="Calibri" w:hAnsi="Calibri" w:cs="Calibri"/>
+          <w:i/>
+          <w:color w:val="111111"/>
+          <w:sz w:val="20"/>
+          <w:szCs w:val="20"/>
+        </w:rPr>
+        <w:t>"What the Records Don't Carry: A Position on Researcher-AI Co-Adaptation in Exploratory Laboratory Research."</w:t>
+      </w:r>
+      <w:r>
+        <w:rPr>
+          <w:rFonts w:ascii="Calibri" w:eastAsia="Calibri" w:hAnsi="Calibri" w:cs="Calibri"/>
+          <w:color w:val="111111"/>
+          <w:sz w:val="20"/>
+          <w:szCs w:val="20"/>
+        </w:rPr>
+        <w:t xml:space="preserve"> Under review at </w:t>
+      </w:r>
+      <w:r>
+        <w:rPr>
+          <w:rFonts w:ascii="Calibri" w:eastAsia="Calibri" w:hAnsi="Calibri" w:cs="Calibri"/>
+          <w:b/>
+          <w:bCs/>
+          <w:color w:val="111111"/>
+          <w:sz w:val="20"/>
+          <w:szCs w:val="20"/>
+        </w:rPr>
+        <w:t>ICML Workshop on AI for Science</w:t>
+      </w:r>
+      <w:r>
+        <w:rPr>
+          <w:rFonts w:ascii="Calibri" w:eastAsia="Calibri" w:hAnsi="Calibri" w:cs="Calibri"/>
+          <w:color w:val="111111"/>
+          <w:sz w:val="20"/>
+          <w:szCs w:val="20"/>
+        </w:rPr>
+        <w:t xml:space="preserve">, </w:t>
+      </w:r>
+      <w:r>
+        <w:rPr>
+          <w:rFonts w:ascii="Calibri" w:eastAsia="Calibri" w:hAnsi="Calibri" w:cs="Calibri"/>
+          <w:color w:val="111111"/>
+          <w:sz w:val="20"/>
+          <w:szCs w:val="20"/>
+        </w:rPr>
+        <w:t>(</w:t>
+      </w:r>
+      <w:r>
+        <w:rPr>
+          <w:rFonts w:ascii="Calibri" w:eastAsia="Calibri" w:hAnsi="Calibri" w:cs="Calibri"/>
+          <w:color w:val="111111"/>
+          <w:sz w:val="20"/>
+          <w:szCs w:val="20"/>
+        </w:rPr>
+        <w:t>2026</w:t>
+      </w:r>
+      <w:r>
+        <w:rPr>
+          <w:rFonts w:ascii="Calibri" w:eastAsia="Calibri" w:hAnsi="Calibri" w:cs="Calibri"/>
+          <w:color w:val="111111"/>
+          <w:sz w:val="20"/>
+          <w:szCs w:val="20"/>
+        </w:rPr>
+        <w:t>)</w:t>
+      </w:r>
+      <w:r>
+        <w:rPr>
+          <w:rFonts w:ascii="Calibri" w:eastAsia="Calibri" w:hAnsi="Calibri" w:cs="Calibri"/>
+          <w:color w:val="111111"/>
+          <w:sz w:val="20"/>
+          <w:szCs w:val="20"/>
+        </w:rPr>
+        <w:t>.</w:t>
       </w:r>
     </w:p>
     <w:p>
@@ -1481,24 +2919,223 @@
           <w:numId w:val="6"/>
         </w:numPr>
         <w:snapToGrid w:val="0"/>
-        <w:spacing w:before="120" w:after="0" w:line="300" w:lineRule="auto"/>
+        <w:spacing w:after="0" w:line="276" w:lineRule="auto"/>
         <w:ind w:left="216" w:hanging="216"/>
         <w:contextualSpacing w:val="0"/>
         <w:rPr>
           <w:rFonts w:ascii="Calibri" w:eastAsia="DengXian" w:hAnsi="Calibri" w:cs="Calibri"/>
           <w:iCs/>
           <w:kern w:val="2"/>
-          <w:sz w:val="21"/>
-          <w:szCs w:val="21"/>
-        </w:rPr>
-      </w:pPr>
-      <w:r>
-        <w:rPr>
-          <w:rFonts w:ascii="Calibri" w:eastAsia="DengXian" w:hAnsi="Calibri" w:cs="Calibri"/>
-          <w:iCs/>
-          <w:kern w:val="2"/>
-          <w:sz w:val="21"/>
-          <w:szCs w:val="21"/>
+          <w:sz w:val="20"/>
+          <w:szCs w:val="20"/>
+        </w:rPr>
+      </w:pPr>
+      <w:r>
+        <w:rPr>
+          <w:rFonts w:ascii="Calibri" w:eastAsia="Calibri" w:hAnsi="Calibri" w:cs="Calibri"/>
+          <w:b/>
+          <w:bCs/>
+          <w:i/>
+          <w:iCs/>
+          <w:color w:val="111111"/>
+          <w:sz w:val="20"/>
+          <w:szCs w:val="20"/>
+          <w:u w:val="single"/>
+        </w:rPr>
+        <w:t>Li, Z.</w:t>
+      </w:r>
+      <w:r>
+        <w:rPr>
+          <w:rFonts w:ascii="Calibri" w:eastAsia="Calibri" w:hAnsi="Calibri" w:cs="Calibri"/>
+          <w:color w:val="111111"/>
+          <w:sz w:val="20"/>
+          <w:szCs w:val="20"/>
+        </w:rPr>
+        <w:t xml:space="preserve"> </w:t>
+      </w:r>
+      <w:r>
+        <w:rPr>
+          <w:rFonts w:ascii="Calibri" w:eastAsia="Calibri" w:hAnsi="Calibri" w:cs="Calibri"/>
+          <w:i/>
+          <w:color w:val="111111"/>
+          <w:sz w:val="20"/>
+          <w:szCs w:val="20"/>
+        </w:rPr>
+        <w:t>"Apprenticeship Without Proximity: An Agent Skills Architecture for Unwritten Experimental Judgment."</w:t>
+      </w:r>
+      <w:r>
+        <w:rPr>
+          <w:rFonts w:ascii="Calibri" w:eastAsia="Calibri" w:hAnsi="Calibri" w:cs="Calibri"/>
+          <w:color w:val="111111"/>
+          <w:sz w:val="20"/>
+          <w:szCs w:val="20"/>
+        </w:rPr>
+        <w:t xml:space="preserve"> Under review at </w:t>
+      </w:r>
+      <w:r>
+        <w:rPr>
+          <w:rFonts w:ascii="Calibri" w:eastAsia="Calibri" w:hAnsi="Calibri" w:cs="Calibri"/>
+          <w:b/>
+          <w:bCs/>
+          <w:color w:val="111111"/>
+          <w:sz w:val="20"/>
+          <w:szCs w:val="20"/>
+        </w:rPr>
+        <w:t>ACM CAIS Workshop on Agent Skills</w:t>
+      </w:r>
+      <w:r>
+        <w:rPr>
+          <w:rFonts w:ascii="Calibri" w:eastAsia="Calibri" w:hAnsi="Calibri" w:cs="Calibri"/>
+          <w:color w:val="111111"/>
+          <w:sz w:val="20"/>
+          <w:szCs w:val="20"/>
+        </w:rPr>
+        <w:t xml:space="preserve">, </w:t>
+      </w:r>
+      <w:r>
+        <w:rPr>
+          <w:rFonts w:ascii="Calibri" w:eastAsia="Calibri" w:hAnsi="Calibri" w:cs="Calibri"/>
+          <w:color w:val="111111"/>
+          <w:sz w:val="20"/>
+          <w:szCs w:val="20"/>
+        </w:rPr>
+        <w:t>(</w:t>
+      </w:r>
+      <w:r>
+        <w:rPr>
+          <w:rFonts w:ascii="Calibri" w:eastAsia="Calibri" w:hAnsi="Calibri" w:cs="Calibri"/>
+          <w:color w:val="111111"/>
+          <w:sz w:val="20"/>
+          <w:szCs w:val="20"/>
+        </w:rPr>
+        <w:t>2026</w:t>
+      </w:r>
+      <w:r>
+        <w:rPr>
+          <w:rFonts w:ascii="Calibri" w:eastAsia="Calibri" w:hAnsi="Calibri" w:cs="Calibri"/>
+          <w:color w:val="111111"/>
+          <w:sz w:val="20"/>
+          <w:szCs w:val="20"/>
+        </w:rPr>
+        <w:t>)</w:t>
+      </w:r>
+      <w:r>
+        <w:rPr>
+          <w:rFonts w:ascii="Calibri" w:eastAsia="Calibri" w:hAnsi="Calibri" w:cs="Calibri"/>
+          <w:color w:val="111111"/>
+          <w:sz w:val="20"/>
+          <w:szCs w:val="20"/>
+        </w:rPr>
+        <w:t>.</w:t>
+      </w:r>
+    </w:p>
+    <w:p>
+      <w:pPr>
+        <w:widowControl w:val="0"/>
+        <w:pBdr>
+          <w:bottom w:val="single" w:sz="6" w:space="2" w:color="1A3A5C"/>
+        </w:pBdr>
+        <w:spacing w:before="120" w:after="40" w:line="240" w:lineRule="auto"/>
+        <w:rPr>
+          <w:rFonts w:ascii="Calibri" w:eastAsia="Calibri" w:hAnsi="Calibri" w:cs="Calibri"/>
+          <w:b/>
+          <w:bCs/>
+          <w:color w:val="1A3A5C"/>
+          <w:sz w:val="22"/>
+          <w:szCs w:val="22"/>
+        </w:rPr>
+      </w:pPr>
+      <w:r>
+        <w:rPr>
+          <w:rFonts w:ascii="Calibri" w:eastAsia="Calibri" w:hAnsi="Calibri" w:cs="Calibri"/>
+          <w:b/>
+          <w:bCs/>
+          <w:color w:val="1A3A5C"/>
+          <w:sz w:val="22"/>
+          <w:szCs w:val="22"/>
+        </w:rPr>
+        <w:t>PATENTS</w:t>
+      </w:r>
+    </w:p>
+    <w:p>
+      <w:pPr>
+        <w:pStyle w:val="ListParagraph"/>
+        <w:numPr>
+          <w:ilvl w:val="0"/>
+          <w:numId w:val="6"/>
+        </w:numPr>
+        <w:snapToGrid w:val="0"/>
+        <w:spacing w:after="40" w:line="276" w:lineRule="auto"/>
+        <w:ind w:left="216" w:hanging="216"/>
+        <w:contextualSpacing w:val="0"/>
+        <w:rPr>
+          <w:rFonts w:ascii="Calibri" w:eastAsia="DengXian" w:hAnsi="Calibri" w:cs="Calibri"/>
+          <w:iCs/>
+          <w:kern w:val="2"/>
+          <w:sz w:val="20"/>
+          <w:szCs w:val="20"/>
+        </w:rPr>
+      </w:pPr>
+      <w:r>
+        <w:rPr>
+          <w:rFonts w:ascii="Calibri" w:eastAsia="DengXian" w:hAnsi="Calibri" w:cs="Calibri"/>
+          <w:iCs/>
+          <w:kern w:val="2"/>
+          <w:sz w:val="20"/>
+          <w:szCs w:val="20"/>
+        </w:rPr>
+        <w:t xml:space="preserve">Ren, K., Wu, H., Wang, Z., Yao, S., Ong, B., Li, W., </w:t>
+      </w:r>
+      <w:r>
+        <w:rPr>
+          <w:rFonts w:ascii="Calibri" w:eastAsia="DengXian" w:hAnsi="Calibri" w:cs="Calibri"/>
+          <w:b/>
+          <w:bCs/>
+          <w:i/>
+          <w:kern w:val="2"/>
+          <w:sz w:val="20"/>
+          <w:szCs w:val="20"/>
+          <w:u w:val="single"/>
+        </w:rPr>
+        <w:t>Li, Z</w:t>
+      </w:r>
+      <w:r>
+        <w:rPr>
+          <w:rFonts w:ascii="Calibri" w:eastAsia="DengXian" w:hAnsi="Calibri" w:cs="Calibri"/>
+          <w:iCs/>
+          <w:kern w:val="2"/>
+          <w:sz w:val="20"/>
+          <w:szCs w:val="20"/>
+        </w:rPr>
+        <w:t>., Sun, H., &amp; Chan, C.W. "Crack engineering as a new route for the construction of arbitrary hierarchical architectures." US Patent 11,839,998, (2023).</w:t>
+      </w:r>
+    </w:p>
+    <w:p>
+      <w:pPr>
+        <w:pStyle w:val="ListParagraph"/>
+        <w:numPr>
+          <w:ilvl w:val="0"/>
+          <w:numId w:val="6"/>
+        </w:numPr>
+        <w:snapToGrid w:val="0"/>
+        <w:spacing w:after="40" w:line="276" w:lineRule="auto"/>
+        <w:ind w:left="216" w:hanging="216"/>
+        <w:contextualSpacing w:val="0"/>
+        <w:rPr>
+          <w:rFonts w:ascii="Calibri" w:eastAsia="DengXian" w:hAnsi="Calibri" w:cs="Calibri"/>
+          <w:iCs/>
+          <w:kern w:val="2"/>
+          <w:sz w:val="20"/>
+          <w:szCs w:val="20"/>
+        </w:rPr>
+      </w:pPr>
+      <w:r>
+        <w:rPr>
+          <w:rFonts w:ascii="Calibri" w:eastAsia="DengXian" w:hAnsi="Calibri" w:cs="Calibri"/>
+          <w:iCs/>
+          <w:kern w:val="2"/>
+          <w:sz w:val="20"/>
+          <w:szCs w:val="20"/>
         </w:rPr>
         <w:t xml:space="preserve">Li, Q., </w:t>
       </w:r>
@@ -1510,8 +3147,8 @@
           <w:i/>
           <w:iCs/>
           <w:kern w:val="2"/>
-          <w:sz w:val="21"/>
-          <w:szCs w:val="21"/>
+          <w:sz w:val="20"/>
+          <w:szCs w:val="20"/>
           <w:u w:val="single"/>
         </w:rPr>
         <w:t>Li, Z.</w:t>
@@ -1521,8 +3158,8 @@
           <w:rFonts w:ascii="Calibri" w:eastAsia="DengXian" w:hAnsi="Calibri" w:cs="Calibri"/>
           <w:iCs/>
           <w:kern w:val="2"/>
-          <w:sz w:val="21"/>
-          <w:szCs w:val="21"/>
+          <w:sz w:val="20"/>
+          <w:szCs w:val="20"/>
           <w:u w:val="single"/>
         </w:rPr>
         <w:t>,</w:t>
@@ -1532,20 +3169,20 @@
           <w:rFonts w:ascii="Calibri" w:eastAsia="DengXian" w:hAnsi="Calibri" w:cs="Calibri"/>
           <w:iCs/>
           <w:kern w:val="2"/>
-          <w:sz w:val="21"/>
-          <w:szCs w:val="21"/>
-        </w:rPr>
-        <w:t xml:space="preserve"> &amp; Lin, Z. “Reactor and method of spiral propulsion biomass continuous thermal cracking.” Chinese Patent</w:t>
-      </w:r>
-      <w:r>
-        <w:rPr>
-          <w:rFonts w:ascii="Calibri" w:eastAsia="DengXian" w:hAnsi="Calibri" w:cs="Calibri"/>
-          <w:b/>
-          <w:bCs/>
-          <w:iCs/>
-          <w:kern w:val="2"/>
-          <w:sz w:val="21"/>
-          <w:szCs w:val="21"/>
+          <w:sz w:val="20"/>
+          <w:szCs w:val="20"/>
+        </w:rPr>
+        <w:t xml:space="preserve"> &amp; Lin, Z. "Reactor and method of spiral propulsion biomass continuous thermal cracking." Chinese Patent</w:t>
+      </w:r>
+      <w:r>
+        <w:rPr>
+          <w:rFonts w:ascii="Calibri" w:eastAsia="DengXian" w:hAnsi="Calibri" w:cs="Calibri"/>
+          <w:b/>
+          <w:bCs/>
+          <w:iCs/>
+          <w:kern w:val="2"/>
+          <w:sz w:val="20"/>
+          <w:szCs w:val="20"/>
         </w:rPr>
         <w:t xml:space="preserve"> </w:t>
       </w:r>
@@ -1554,20 +3191,136 @@
           <w:rFonts w:ascii="Calibri" w:eastAsia="DengXian" w:hAnsi="Calibri" w:cs="Calibri"/>
           <w:iCs/>
           <w:kern w:val="2"/>
-          <w:sz w:val="21"/>
-          <w:szCs w:val="21"/>
+          <w:sz w:val="20"/>
+          <w:szCs w:val="20"/>
         </w:rPr>
         <w:t>201711214139.6 (2017).</w:t>
       </w:r>
     </w:p>
     <w:sectPr>
+      <w:headerReference w:type="even" r:id="rId14"/>
+      <w:headerReference w:type="default" r:id="rId15"/>
+      <w:footerReference w:type="even" r:id="rId16"/>
+      <w:footerReference w:type="default" r:id="rId17"/>
+      <w:headerReference w:type="first" r:id="rId18"/>
+      <w:footerReference w:type="first" r:id="rId19"/>
       <w:pgSz w:w="12240" w:h="15840"/>
-      <w:pgMar w:top="720" w:right="720" w:bottom="806" w:left="720" w:header="720" w:footer="720" w:gutter="0"/>
+      <w:pgMar w:top="720" w:right="1008" w:bottom="720" w:left="1008" w:header="720" w:footer="720" w:gutter="0"/>
       <w:cols w:space="720"/>
       <w:docGrid w:linePitch="360"/>
     </w:sectPr>
   </w:body>
 </w:document>
+</file>
+
+<file path=word/endnotes.xml><?xml version="1.0" encoding="utf-8"?>
+<w:endnotes xmlns:wpc="http://schemas.microsoft.com/office/word/2010/wordprocessingCanvas" xmlns:cx="http://schemas.microsoft.com/office/drawing/2014/chartex" xmlns:cx1="http://schemas.microsoft.com/office/drawing/2015/9/8/chartex" xmlns:cx2="http://schemas.microsoft.com/office/drawing/2015/10/21/chartex" xmlns:cx3="http://schemas.microsoft.com/office/drawing/2016/5/9/chartex" xmlns:cx4="http://schemas.microsoft.com/office/drawing/2016/5/10/chartex" xmlns:cx5="http://schemas.microsoft.com/office/drawing/2016/5/11/chartex" xmlns:cx6="http://schemas.microsoft.com/office/drawing/2016/5/12/chartex" xmlns:cx7="http://schemas.microsoft.com/office/drawing/2016/5/13/chartex" xmlns:cx8="http://schemas.microsoft.com/office/drawing/2016/5/14/chartex" xmlns:mc="http://schemas.openxmlformats.org/markup-compatibility/2006" xmlns:aink="http://schemas.microsoft.com/office/drawing/2016/ink" xmlns:am3d="http://schemas.microsoft.com/office/drawing/2017/model3d" xmlns:o="urn:schemas-microsoft-com:office:office" xmlns:oel="http://schemas.microsoft.com/office/2019/extlst" xmlns:r="http://schemas.openxmlformats.org/officeDocument/2006/relationships" xmlns:m="http://schemas.openxmlformats.org/officeDocument/2006/math" xmlns:v="urn:schemas-microsoft-com:vml" xmlns:wp14="http://schemas.microsoft.com/office/word/2010/wordprocessingDrawing" xmlns:wp="http://schemas.openxmlformats.org/drawingml/2006/wordprocessingDrawing" xmlns:w10="urn:schemas-microsoft-com:office:word" xmlns:w="http://schemas.openxmlformats.org/wordprocessingml/2006/main" xmlns:w14="http://schemas.microsoft.com/office/word/2010/wordml" xmlns:w15="http://schemas.microsoft.com/office/word/2012/wordml" xmlns:w16cex="http://schemas.microsoft.com/office/word/2018/wordml/cex" xmlns:w16cid="http://schemas.microsoft.com/office/word/2016/wordml/cid" xmlns:w16="http://schemas.microsoft.com/office/word/2018/wordml" xmlns:w16du="http://schemas.microsoft.com/office/word/2023/wordml/word16du" xmlns:w16sdtdh="http://schemas.microsoft.com/office/word/2020/wordml/sdtdatahash" xmlns:w16sdtfl="http://schemas.microsoft.com/office/word/2024/wordml/sdtformatlock" xmlns:w16se="http://schemas.microsoft.com/office/word/2015/wordml/symex" xmlns:wpg="http://schemas.microsoft.com/office/word/2010/wordprocessingGroup" xmlns:wpi="http://schemas.microsoft.com/office/word/2010/wordprocessingInk" xmlns:wne="http://schemas.microsoft.com/office/word/2006/wordml" xmlns:wps="http://schemas.microsoft.com/office/word/2010/wordprocessingShape" mc:Ignorable="w14 w15 w16se w16cid w16 w16cex w16sdtdh w16sdtfl w16du wp14">
+  <w:endnote w:type="separator" w:id="-1">
+    <w:p>
+      <w:pPr>
+        <w:spacing w:after="0" w:line="240" w:lineRule="auto"/>
+      </w:pPr>
+      <w:r>
+        <w:separator/>
+      </w:r>
+    </w:p>
+  </w:endnote>
+  <w:endnote w:type="continuationSeparator" w:id="0">
+    <w:p>
+      <w:pPr>
+        <w:spacing w:after="0" w:line="240" w:lineRule="auto"/>
+      </w:pPr>
+      <w:r>
+        <w:continuationSeparator/>
+      </w:r>
+    </w:p>
+  </w:endnote>
+</w:endnotes>
+</file>
+
+<file path=word/footer1.xml><?xml version="1.0" encoding="utf-8"?>
+<w:ftr xmlns:wpc="http://schemas.microsoft.com/office/word/2010/wordprocessingCanvas" xmlns:cx="http://schemas.microsoft.com/office/drawing/2014/chartex" xmlns:cx1="http://schemas.microsoft.com/office/drawing/2015/9/8/chartex" xmlns:cx2="http://schemas.microsoft.com/office/drawing/2015/10/21/chartex" xmlns:cx3="http://schemas.microsoft.com/office/drawing/2016/5/9/chartex" xmlns:cx4="http://schemas.microsoft.com/office/drawing/2016/5/10/chartex" xmlns:cx5="http://schemas.microsoft.com/office/drawing/2016/5/11/chartex" xmlns:cx6="http://schemas.microsoft.com/office/drawing/2016/5/12/chartex" xmlns:cx7="http://schemas.microsoft.com/office/drawing/2016/5/13/chartex" xmlns:cx8="http://schemas.microsoft.com/office/drawing/2016/5/14/chartex" xmlns:mc="http://schemas.openxmlformats.org/markup-compatibility/2006" xmlns:aink="http://schemas.microsoft.com/office/drawing/2016/ink" xmlns:am3d="http://schemas.microsoft.com/office/drawing/2017/model3d" xmlns:o="urn:schemas-microsoft-com:office:office" xmlns:oel="http://schemas.microsoft.com/office/2019/extlst" xmlns:r="http://schemas.openxmlformats.org/officeDocument/2006/relationships" xmlns:m="http://schemas.openxmlformats.org/officeDocument/2006/math" xmlns:v="urn:schemas-microsoft-com:vml" xmlns:wp14="http://schemas.microsoft.com/office/word/2010/wordprocessingDrawing" xmlns:wp="http://schemas.openxmlformats.org/drawingml/2006/wordprocessingDrawing" xmlns:w10="urn:schemas-microsoft-com:office:word" xmlns:w="http://schemas.openxmlformats.org/wordprocessingml/2006/main" xmlns:w14="http://schemas.microsoft.com/office/word/2010/wordml" xmlns:w15="http://schemas.microsoft.com/office/word/2012/wordml" xmlns:w16cex="http://schemas.microsoft.com/office/word/2018/wordml/cex" xmlns:w16cid="http://schemas.microsoft.com/office/word/2016/wordml/cid" xmlns:w16="http://schemas.microsoft.com/office/word/2018/wordml" xmlns:w16du="http://schemas.microsoft.com/office/word/2023/wordml/word16du" xmlns:w16sdtdh="http://schemas.microsoft.com/office/word/2020/wordml/sdtdatahash" xmlns:w16sdtfl="http://schemas.microsoft.com/office/word/2024/wordml/sdtformatlock" xmlns:w16se="http://schemas.microsoft.com/office/word/2015/wordml/symex" xmlns:wpg="http://schemas.microsoft.com/office/word/2010/wordprocessingGroup" xmlns:wpi="http://schemas.microsoft.com/office/word/2010/wordprocessingInk" xmlns:wne="http://schemas.microsoft.com/office/word/2006/wordml" xmlns:wps="http://schemas.microsoft.com/office/word/2010/wordprocessingShape" mc:Ignorable="w14 w15 w16se w16cid w16 w16cex w16sdtdh w16sdtfl w16du wp14">
+  <w:p>
+    <w:pPr>
+      <w:pStyle w:val="Footer"/>
+    </w:pPr>
+  </w:p>
+</w:ftr>
+</file>
+
+<file path=word/footer2.xml><?xml version="1.0" encoding="utf-8"?>
+<w:ftr xmlns:wpc="http://schemas.microsoft.com/office/word/2010/wordprocessingCanvas" xmlns:cx="http://schemas.microsoft.com/office/drawing/2014/chartex" xmlns:cx1="http://schemas.microsoft.com/office/drawing/2015/9/8/chartex" xmlns:cx2="http://schemas.microsoft.com/office/drawing/2015/10/21/chartex" xmlns:cx3="http://schemas.microsoft.com/office/drawing/2016/5/9/chartex" xmlns:cx4="http://schemas.microsoft.com/office/drawing/2016/5/10/chartex" xmlns:cx5="http://schemas.microsoft.com/office/drawing/2016/5/11/chartex" xmlns:cx6="http://schemas.microsoft.com/office/drawing/2016/5/12/chartex" xmlns:cx7="http://schemas.microsoft.com/office/drawing/2016/5/13/chartex" xmlns:cx8="http://schemas.microsoft.com/office/drawing/2016/5/14/chartex" xmlns:mc="http://schemas.openxmlformats.org/markup-compatibility/2006" xmlns:aink="http://schemas.microsoft.com/office/drawing/2016/ink" xmlns:am3d="http://schemas.microsoft.com/office/drawing/2017/model3d" xmlns:o="urn:schemas-microsoft-com:office:office" xmlns:oel="http://schemas.microsoft.com/office/2019/extlst" xmlns:r="http://schemas.openxmlformats.org/officeDocument/2006/relationships" xmlns:m="http://schemas.openxmlformats.org/officeDocument/2006/math" xmlns:v="urn:schemas-microsoft-com:vml" xmlns:wp14="http://schemas.microsoft.com/office/word/2010/wordprocessingDrawing" xmlns:wp="http://schemas.openxmlformats.org/drawingml/2006/wordprocessingDrawing" xmlns:w10="urn:schemas-microsoft-com:office:word" xmlns:w="http://schemas.openxmlformats.org/wordprocessingml/2006/main" xmlns:w14="http://schemas.microsoft.com/office/word/2010/wordml" xmlns:w15="http://schemas.microsoft.com/office/word/2012/wordml" xmlns:w16cex="http://schemas.microsoft.com/office/word/2018/wordml/cex" xmlns:w16cid="http://schemas.microsoft.com/office/word/2016/wordml/cid" xmlns:w16="http://schemas.microsoft.com/office/word/2018/wordml" xmlns:w16du="http://schemas.microsoft.com/office/word/2023/wordml/word16du" xmlns:w16sdtdh="http://schemas.microsoft.com/office/word/2020/wordml/sdtdatahash" xmlns:w16sdtfl="http://schemas.microsoft.com/office/word/2024/wordml/sdtformatlock" xmlns:w16se="http://schemas.microsoft.com/office/word/2015/wordml/symex" xmlns:wpg="http://schemas.microsoft.com/office/word/2010/wordprocessingGroup" xmlns:wpi="http://schemas.microsoft.com/office/word/2010/wordprocessingInk" xmlns:wne="http://schemas.microsoft.com/office/word/2006/wordml" xmlns:wps="http://schemas.microsoft.com/office/word/2010/wordprocessingShape" mc:Ignorable="w14 w15 w16se w16cid w16 w16cex w16sdtdh w16sdtfl w16du wp14">
+  <w:p>
+    <w:pPr>
+      <w:pStyle w:val="Footer"/>
+    </w:pPr>
+  </w:p>
+</w:ftr>
+</file>
+
+<file path=word/footer3.xml><?xml version="1.0" encoding="utf-8"?>
+<w:ftr xmlns:wpc="http://schemas.microsoft.com/office/word/2010/wordprocessingCanvas" xmlns:cx="http://schemas.microsoft.com/office/drawing/2014/chartex" xmlns:cx1="http://schemas.microsoft.com/office/drawing/2015/9/8/chartex" xmlns:cx2="http://schemas.microsoft.com/office/drawing/2015/10/21/chartex" xmlns:cx3="http://schemas.microsoft.com/office/drawing/2016/5/9/chartex" xmlns:cx4="http://schemas.microsoft.com/office/drawing/2016/5/10/chartex" xmlns:cx5="http://schemas.microsoft.com/office/drawing/2016/5/11/chartex" xmlns:cx6="http://schemas.microsoft.com/office/drawing/2016/5/12/chartex" xmlns:cx7="http://schemas.microsoft.com/office/drawing/2016/5/13/chartex" xmlns:cx8="http://schemas.microsoft.com/office/drawing/2016/5/14/chartex" xmlns:mc="http://schemas.openxmlformats.org/markup-compatibility/2006" xmlns:aink="http://schemas.microsoft.com/office/drawing/2016/ink" xmlns:am3d="http://schemas.microsoft.com/office/drawing/2017/model3d" xmlns:o="urn:schemas-microsoft-com:office:office" xmlns:oel="http://schemas.microsoft.com/office/2019/extlst" xmlns:r="http://schemas.openxmlformats.org/officeDocument/2006/relationships" xmlns:m="http://schemas.openxmlformats.org/officeDocument/2006/math" xmlns:v="urn:schemas-microsoft-com:vml" xmlns:wp14="http://schemas.microsoft.com/office/word/2010/wordprocessingDrawing" xmlns:wp="http://schemas.openxmlformats.org/drawingml/2006/wordprocessingDrawing" xmlns:w10="urn:schemas-microsoft-com:office:word" xmlns:w="http://schemas.openxmlformats.org/wordprocessingml/2006/main" xmlns:w14="http://schemas.microsoft.com/office/word/2010/wordml" xmlns:w15="http://schemas.microsoft.com/office/word/2012/wordml" xmlns:w16cex="http://schemas.microsoft.com/office/word/2018/wordml/cex" xmlns:w16cid="http://schemas.microsoft.com/office/word/2016/wordml/cid" xmlns:w16="http://schemas.microsoft.com/office/word/2018/wordml" xmlns:w16du="http://schemas.microsoft.com/office/word/2023/wordml/word16du" xmlns:w16sdtdh="http://schemas.microsoft.com/office/word/2020/wordml/sdtdatahash" xmlns:w16sdtfl="http://schemas.microsoft.com/office/word/2024/wordml/sdtformatlock" xmlns:w16se="http://schemas.microsoft.com/office/word/2015/wordml/symex" xmlns:wpg="http://schemas.microsoft.com/office/word/2010/wordprocessingGroup" xmlns:wpi="http://schemas.microsoft.com/office/word/2010/wordprocessingInk" xmlns:wne="http://schemas.microsoft.com/office/word/2006/wordml" xmlns:wps="http://schemas.microsoft.com/office/word/2010/wordprocessingShape" mc:Ignorable="w14 w15 w16se w16cid w16 w16cex w16sdtdh w16sdtfl w16du wp14">
+  <w:p>
+    <w:pPr>
+      <w:pStyle w:val="Footer"/>
+    </w:pPr>
+  </w:p>
+</w:ftr>
+</file>
+
+<file path=word/footnotes.xml><?xml version="1.0" encoding="utf-8"?>
+<w:footnotes xmlns:wpc="http://schemas.microsoft.com/office/word/2010/wordprocessingCanvas" xmlns:cx="http://schemas.microsoft.com/office/drawing/2014/chartex" xmlns:cx1="http://schemas.microsoft.com/office/drawing/2015/9/8/chartex" xmlns:cx2="http://schemas.microsoft.com/office/drawing/2015/10/21/chartex" xmlns:cx3="http://schemas.microsoft.com/office/drawing/2016/5/9/chartex" xmlns:cx4="http://schemas.microsoft.com/office/drawing/2016/5/10/chartex" xmlns:cx5="http://schemas.microsoft.com/office/drawing/2016/5/11/chartex" xmlns:cx6="http://schemas.microsoft.com/office/drawing/2016/5/12/chartex" xmlns:cx7="http://schemas.microsoft.com/office/drawing/2016/5/13/chartex" xmlns:cx8="http://schemas.microsoft.com/office/drawing/2016/5/14/chartex" xmlns:mc="http://schemas.openxmlformats.org/markup-compatibility/2006" xmlns:aink="http://schemas.microsoft.com/office/drawing/2016/ink" xmlns:am3d="http://schemas.microsoft.com/office/drawing/2017/model3d" xmlns:o="urn:schemas-microsoft-com:office:office" xmlns:oel="http://schemas.microsoft.com/office/2019/extlst" xmlns:r="http://schemas.openxmlformats.org/officeDocument/2006/relationships" xmlns:m="http://schemas.openxmlformats.org/officeDocument/2006/math" xmlns:v="urn:schemas-microsoft-com:vml" xmlns:wp14="http://schemas.microsoft.com/office/word/2010/wordprocessingDrawing" xmlns:wp="http://schemas.openxmlformats.org/drawingml/2006/wordprocessingDrawing" xmlns:w10="urn:schemas-microsoft-com:office:word" xmlns:w="http://schemas.openxmlformats.org/wordprocessingml/2006/main" xmlns:w14="http://schemas.microsoft.com/office/word/2010/wordml" xmlns:w15="http://schemas.microsoft.com/office/word/2012/wordml" xmlns:w16cex="http://schemas.microsoft.com/office/word/2018/wordml/cex" xmlns:w16cid="http://schemas.microsoft.com/office/word/2016/wordml/cid" xmlns:w16="http://schemas.microsoft.com/office/word/2018/wordml" xmlns:w16du="http://schemas.microsoft.com/office/word/2023/wordml/word16du" xmlns:w16sdtdh="http://schemas.microsoft.com/office/word/2020/wordml/sdtdatahash" xmlns:w16sdtfl="http://schemas.microsoft.com/office/word/2024/wordml/sdtformatlock" xmlns:w16se="http://schemas.microsoft.com/office/word/2015/wordml/symex" xmlns:wpg="http://schemas.microsoft.com/office/word/2010/wordprocessingGroup" xmlns:wpi="http://schemas.microsoft.com/office/word/2010/wordprocessingInk" xmlns:wne="http://schemas.microsoft.com/office/word/2006/wordml" xmlns:wps="http://schemas.microsoft.com/office/word/2010/wordprocessingShape" mc:Ignorable="w14 w15 w16se w16cid w16 w16cex w16sdtdh w16sdtfl w16du wp14">
+  <w:footnote w:type="separator" w:id="-1">
+    <w:p>
+      <w:pPr>
+        <w:spacing w:after="0" w:line="240" w:lineRule="auto"/>
+      </w:pPr>
+      <w:r>
+        <w:separator/>
+      </w:r>
+    </w:p>
+  </w:footnote>
+  <w:footnote w:type="continuationSeparator" w:id="0">
+    <w:p>
+      <w:pPr>
+        <w:spacing w:after="0" w:line="240" w:lineRule="auto"/>
+      </w:pPr>
+      <w:r>
+        <w:continuationSeparator/>
+      </w:r>
+    </w:p>
+  </w:footnote>
+</w:footnotes>
+</file>
+
+<file path=word/header1.xml><?xml version="1.0" encoding="utf-8"?>
+<w:hdr xmlns:wpc="http://schemas.microsoft.com/office/word/2010/wordprocessingCanvas" xmlns:cx="http://schemas.microsoft.com/office/drawing/2014/chartex" xmlns:cx1="http://schemas.microsoft.com/office/drawing/2015/9/8/chartex" xmlns:cx2="http://schemas.microsoft.com/office/drawing/2015/10/21/chartex" xmlns:cx3="http://schemas.microsoft.com/office/drawing/2016/5/9/chartex" xmlns:cx4="http://schemas.microsoft.com/office/drawing/2016/5/10/chartex" xmlns:cx5="http://schemas.microsoft.com/office/drawing/2016/5/11/chartex" xmlns:cx6="http://schemas.microsoft.com/office/drawing/2016/5/12/chartex" xmlns:cx7="http://schemas.microsoft.com/office/drawing/2016/5/13/chartex" xmlns:cx8="http://schemas.microsoft.com/office/drawing/2016/5/14/chartex" xmlns:mc="http://schemas.openxmlformats.org/markup-compatibility/2006" xmlns:aink="http://schemas.microsoft.com/office/drawing/2016/ink" xmlns:am3d="http://schemas.microsoft.com/office/drawing/2017/model3d" xmlns:o="urn:schemas-microsoft-com:office:office" xmlns:oel="http://schemas.microsoft.com/office/2019/extlst" xmlns:r="http://schemas.openxmlformats.org/officeDocument/2006/relationships" xmlns:m="http://schemas.openxmlformats.org/officeDocument/2006/math" xmlns:v="urn:schemas-microsoft-com:vml" xmlns:wp14="http://schemas.microsoft.com/office/word/2010/wordprocessingDrawing" xmlns:wp="http://schemas.openxmlformats.org/drawingml/2006/wordprocessingDrawing" xmlns:w10="urn:schemas-microsoft-com:office:word" xmlns:w="http://schemas.openxmlformats.org/wordprocessingml/2006/main" xmlns:w14="http://schemas.microsoft.com/office/word/2010/wordml" xmlns:w15="http://schemas.microsoft.com/office/word/2012/wordml" xmlns:w16cex="http://schemas.microsoft.com/office/word/2018/wordml/cex" xmlns:w16cid="http://schemas.microsoft.com/office/word/2016/wordml/cid" xmlns:w16="http://schemas.microsoft.com/office/word/2018/wordml" xmlns:w16du="http://schemas.microsoft.com/office/word/2023/wordml/word16du" xmlns:w16sdtdh="http://schemas.microsoft.com/office/word/2020/wordml/sdtdatahash" xmlns:w16sdtfl="http://schemas.microsoft.com/office/word/2024/wordml/sdtformatlock" xmlns:w16se="http://schemas.microsoft.com/office/word/2015/wordml/symex" xmlns:wpg="http://schemas.microsoft.com/office/word/2010/wordprocessingGroup" xmlns:wpi="http://schemas.microsoft.com/office/word/2010/wordprocessingInk" xmlns:wne="http://schemas.microsoft.com/office/word/2006/wordml" xmlns:wps="http://schemas.microsoft.com/office/word/2010/wordprocessingShape" mc:Ignorable="w14 w15 w16se w16cid w16 w16cex w16sdtdh w16sdtfl w16du wp14">
+  <w:p>
+    <w:pPr>
+      <w:pStyle w:val="Header"/>
+    </w:pPr>
+  </w:p>
+</w:hdr>
+</file>
+
+<file path=word/header2.xml><?xml version="1.0" encoding="utf-8"?>
+<w:hdr xmlns:wpc="http://schemas.microsoft.com/office/word/2010/wordprocessingCanvas" xmlns:cx="http://schemas.microsoft.com/office/drawing/2014/chartex" xmlns:cx1="http://schemas.microsoft.com/office/drawing/2015/9/8/chartex" xmlns:cx2="http://schemas.microsoft.com/office/drawing/2015/10/21/chartex" xmlns:cx3="http://schemas.microsoft.com/office/drawing/2016/5/9/chartex" xmlns:cx4="http://schemas.microsoft.com/office/drawing/2016/5/10/chartex" xmlns:cx5="http://schemas.microsoft.com/office/drawing/2016/5/11/chartex" xmlns:cx6="http://schemas.microsoft.com/office/drawing/2016/5/12/chartex" xmlns:cx7="http://schemas.microsoft.com/office/drawing/2016/5/13/chartex" xmlns:cx8="http://schemas.microsoft.com/office/drawing/2016/5/14/chartex" xmlns:mc="http://schemas.openxmlformats.org/markup-compatibility/2006" xmlns:aink="http://schemas.microsoft.com/office/drawing/2016/ink" xmlns:am3d="http://schemas.microsoft.com/office/drawing/2017/model3d" xmlns:o="urn:schemas-microsoft-com:office:office" xmlns:oel="http://schemas.microsoft.com/office/2019/extlst" xmlns:r="http://schemas.openxmlformats.org/officeDocument/2006/relationships" xmlns:m="http://schemas.openxmlformats.org/officeDocument/2006/math" xmlns:v="urn:schemas-microsoft-com:vml" xmlns:wp14="http://schemas.microsoft.com/office/word/2010/wordprocessingDrawing" xmlns:wp="http://schemas.openxmlformats.org/drawingml/2006/wordprocessingDrawing" xmlns:w10="urn:schemas-microsoft-com:office:word" xmlns:w="http://schemas.openxmlformats.org/wordprocessingml/2006/main" xmlns:w14="http://schemas.microsoft.com/office/word/2010/wordml" xmlns:w15="http://schemas.microsoft.com/office/word/2012/wordml" xmlns:w16cex="http://schemas.microsoft.com/office/word/2018/wordml/cex" xmlns:w16cid="http://schemas.microsoft.com/office/word/2016/wordml/cid" xmlns:w16="http://schemas.microsoft.com/office/word/2018/wordml" xmlns:w16du="http://schemas.microsoft.com/office/word/2023/wordml/word16du" xmlns:w16sdtdh="http://schemas.microsoft.com/office/word/2020/wordml/sdtdatahash" xmlns:w16sdtfl="http://schemas.microsoft.com/office/word/2024/wordml/sdtformatlock" xmlns:w16se="http://schemas.microsoft.com/office/word/2015/wordml/symex" xmlns:wpg="http://schemas.microsoft.com/office/word/2010/wordprocessingGroup" xmlns:wpi="http://schemas.microsoft.com/office/word/2010/wordprocessingInk" xmlns:wne="http://schemas.microsoft.com/office/word/2006/wordml" xmlns:wps="http://schemas.microsoft.com/office/word/2010/wordprocessingShape" mc:Ignorable="w14 w15 w16se w16cid w16 w16cex w16sdtdh w16sdtfl w16du wp14">
+  <w:p>
+    <w:pPr>
+      <w:pStyle w:val="Header"/>
+    </w:pPr>
+  </w:p>
+</w:hdr>
+</file>
+
+<file path=word/header3.xml><?xml version="1.0" encoding="utf-8"?>
+<w:hdr xmlns:wpc="http://schemas.microsoft.com/office/word/2010/wordprocessingCanvas" xmlns:cx="http://schemas.microsoft.com/office/drawing/2014/chartex" xmlns:cx1="http://schemas.microsoft.com/office/drawing/2015/9/8/chartex" xmlns:cx2="http://schemas.microsoft.com/office/drawing/2015/10/21/chartex" xmlns:cx3="http://schemas.microsoft.com/office/drawing/2016/5/9/chartex" xmlns:cx4="http://schemas.microsoft.com/office/drawing/2016/5/10/chartex" xmlns:cx5="http://schemas.microsoft.com/office/drawing/2016/5/11/chartex" xmlns:cx6="http://schemas.microsoft.com/office/drawing/2016/5/12/chartex" xmlns:cx7="http://schemas.microsoft.com/office/drawing/2016/5/13/chartex" xmlns:cx8="http://schemas.microsoft.com/office/drawing/2016/5/14/chartex" xmlns:mc="http://schemas.openxmlformats.org/markup-compatibility/2006" xmlns:aink="http://schemas.microsoft.com/office/drawing/2016/ink" xmlns:am3d="http://schemas.microsoft.com/office/drawing/2017/model3d" xmlns:o="urn:schemas-microsoft-com:office:office" xmlns:oel="http://schemas.microsoft.com/office/2019/extlst" xmlns:r="http://schemas.openxmlformats.org/officeDocument/2006/relationships" xmlns:m="http://schemas.openxmlformats.org/officeDocument/2006/math" xmlns:v="urn:schemas-microsoft-com:vml" xmlns:wp14="http://schemas.microsoft.com/office/word/2010/wordprocessingDrawing" xmlns:wp="http://schemas.openxmlformats.org/drawingml/2006/wordprocessingDrawing" xmlns:w10="urn:schemas-microsoft-com:office:word" xmlns:w="http://schemas.openxmlformats.org/wordprocessingml/2006/main" xmlns:w14="http://schemas.microsoft.com/office/word/2010/wordml" xmlns:w15="http://schemas.microsoft.com/office/word/2012/wordml" xmlns:w16cex="http://schemas.microsoft.com/office/word/2018/wordml/cex" xmlns:w16cid="http://schemas.microsoft.com/office/word/2016/wordml/cid" xmlns:w16="http://schemas.microsoft.com/office/word/2018/wordml" xmlns:w16du="http://schemas.microsoft.com/office/word/2023/wordml/word16du" xmlns:w16sdtdh="http://schemas.microsoft.com/office/word/2020/wordml/sdtdatahash" xmlns:w16sdtfl="http://schemas.microsoft.com/office/word/2024/wordml/sdtformatlock" xmlns:w16se="http://schemas.microsoft.com/office/word/2015/wordml/symex" xmlns:wpg="http://schemas.microsoft.com/office/word/2010/wordprocessingGroup" xmlns:wpi="http://schemas.microsoft.com/office/word/2010/wordprocessingInk" xmlns:wne="http://schemas.microsoft.com/office/word/2006/wordml" xmlns:wps="http://schemas.microsoft.com/office/word/2010/wordprocessingShape" mc:Ignorable="w14 w15 w16se w16cid w16 w16cex w16sdtdh w16sdtfl w16du wp14">
+  <w:p>
+    <w:pPr>
+      <w:pStyle w:val="Header"/>
+    </w:pPr>
+  </w:p>
+</w:hdr>
 </file>
 
 <file path=word/numbering.xml><?xml version="1.0" encoding="utf-8"?>
@@ -4053,6 +5806,60 @@
       <w:u w:val="single"/>
     </w:rPr>
   </w:style>
+  <w:style w:type="paragraph" w:styleId="Header">
+    <w:name w:val="header"/>
+    <w:basedOn w:val="Normal"/>
+    <w:link w:val="HeaderChar"/>
+    <w:uiPriority w:val="99"/>
+    <w:unhideWhenUsed/>
+    <w:rsid w:val="00A2053F"/>
+    <w:pPr>
+      <w:tabs>
+        <w:tab w:val="center" w:pos="4680"/>
+        <w:tab w:val="right" w:pos="9360"/>
+      </w:tabs>
+      <w:spacing w:after="0" w:line="240" w:lineRule="auto"/>
+    </w:pPr>
+  </w:style>
+  <w:style w:type="character" w:customStyle="1" w:styleId="HeaderChar">
+    <w:name w:val="Header Char"/>
+    <w:basedOn w:val="DefaultParagraphFont"/>
+    <w:link w:val="Header"/>
+    <w:uiPriority w:val="99"/>
+    <w:rsid w:val="00A2053F"/>
+  </w:style>
+  <w:style w:type="paragraph" w:styleId="Footer">
+    <w:name w:val="footer"/>
+    <w:basedOn w:val="Normal"/>
+    <w:link w:val="FooterChar"/>
+    <w:uiPriority w:val="99"/>
+    <w:unhideWhenUsed/>
+    <w:rsid w:val="00A2053F"/>
+    <w:pPr>
+      <w:tabs>
+        <w:tab w:val="center" w:pos="4680"/>
+        <w:tab w:val="right" w:pos="9360"/>
+      </w:tabs>
+      <w:spacing w:after="0" w:line="240" w:lineRule="auto"/>
+    </w:pPr>
+  </w:style>
+  <w:style w:type="character" w:customStyle="1" w:styleId="FooterChar">
+    <w:name w:val="Footer Char"/>
+    <w:basedOn w:val="DefaultParagraphFont"/>
+    <w:link w:val="Footer"/>
+    <w:uiPriority w:val="99"/>
+    <w:rsid w:val="00A2053F"/>
+  </w:style>
+  <w:style w:type="paragraph" w:styleId="Revision">
+    <w:name w:val="Revision"/>
+    <w:hidden/>
+    <w:uiPriority w:val="99"/>
+    <w:semiHidden/>
+    <w:rsid w:val="00A2053F"/>
+    <w:pPr>
+      <w:spacing w:after="0" w:line="240" w:lineRule="auto"/>
+    </w:pPr>
+  </w:style>
 </w:styles>
 </file>
 
@@ -4351,6 +6158,28 @@
 </a:theme>
 </file>
 
+<file path=word/webextensions/taskpanes.xml><?xml version="1.0" encoding="utf-8"?>
+<wetp:taskpanes xmlns:wetp="http://schemas.microsoft.com/office/webextensions/taskpanes/2010/11">
+  <wetp:taskpane dockstate="right" visibility="0" width="350" row="0">
+    <wetp:webextensionref xmlns:r="http://schemas.openxmlformats.org/officeDocument/2006/relationships" r:id="rId1"/>
+  </wetp:taskpane>
+</wetp:taskpanes>
+</file>
+
+<file path=word/webextensions/webextension1.xml><?xml version="1.0" encoding="utf-8"?>
+<we:webextension xmlns:we="http://schemas.microsoft.com/office/webextensions/webextension/2010/11" id="{67918244-EA66-D445-BEF4-870A618B9B8A}">
+  <we:reference id="WA200010453" version="1.0.0.1" store="Omex" storeType="OMEX"/>
+  <we:alternateReferences>
+    <we:reference id="WA200010453" version="1.0.0.1" store="WA200010453" storeType="OMEX"/>
+  </we:alternateReferences>
+  <we:properties>
+    <we:property name="claude.fileId" value="&quot;a88c9363-1126-400c-a7cc-1c12b6a5f14b&quot;"/>
+  </we:properties>
+  <we:bindings/>
+  <we:snapshot xmlns:r="http://schemas.openxmlformats.org/officeDocument/2006/relationships"/>
+</we:webextension>
+</file>
+
 <file path=customXml/item1.xml><?xml version="1.0" encoding="utf-8"?>
 <b:Sources xmlns:b="http://schemas.openxmlformats.org/officeDocument/2006/bibliography" xmlns="http://schemas.openxmlformats.org/officeDocument/2006/bibliography" SelectedStyle="/APASixthEditionOfficeOnline.xsl" StyleName="APA" Version="6"/>
 </file>

</xml_diff>